<commit_message>
usando clase dentro de otra clase
</commit_message>
<xml_diff>
--- a/BASE DATOS EMPRESA/EMPRESA/FUNCIONAMIENTO DE TODO.docx
+++ b/BASE DATOS EMPRESA/EMPRESA/FUNCIONAMIENTO DE TODO.docx
@@ -1755,21 +1755,7 @@
           <w:b/>
           <w:bCs/>
         </w:rPr>
-        <w:t>href=”</w:t>
-      </w:r>
-      <w:r>
-        <w:rPr>
-          <w:b/>
-          <w:bCs/>
-        </w:rPr>
-        <w:t>pages/nueva_entidad</w:t>
-      </w:r>
-      <w:r>
-        <w:rPr>
-          <w:b/>
-          <w:bCs/>
-        </w:rPr>
-        <w:t>”</w:t>
+        <w:t>href=”pages/nueva_entidad”</w:t>
       </w:r>
       <w:r>
         <w:t xml:space="preserve"> saltara a </w:t>
@@ -8749,17 +8735,189 @@
     </w:p>
     <w:p>
       <w:r>
+        <w:t>CODIGO INTERESANTE DE LA IA</w:t>
+      </w:r>
+    </w:p>
+    <w:p>
+      <w:pPr>
+        <w:rPr>
+          <w:b/>
+          <w:bCs/>
+          <w:i/>
+          <w:iCs/>
+        </w:rPr>
+      </w:pPr>
+      <w:r>
+        <w:rPr>
+          <w:b/>
+          <w:bCs/>
+          <w:i/>
+          <w:iCs/>
+        </w:rPr>
+        <w:t>Convierte los datos de un objeto en una tabla asociativa:</w:t>
+      </w:r>
+    </w:p>
+    <w:p>
+      <w:pPr>
+        <w:pStyle w:val="Sinespaciado"/>
+        <w:ind w:left="708"/>
+        <w:rPr>
+          <w:color w:val="FF0000"/>
+        </w:rPr>
+      </w:pPr>
+      <w:r>
+        <w:rPr>
+          <w:color w:val="FF0000"/>
+        </w:rPr>
+        <w:t>public function toArray(): array {</w:t>
+      </w:r>
+    </w:p>
+    <w:p>
+      <w:pPr>
+        <w:pStyle w:val="Sinespaciado"/>
+        <w:ind w:left="708"/>
+        <w:rPr>
+          <w:color w:val="FF0000"/>
+        </w:rPr>
+      </w:pPr>
+      <w:r>
+        <w:rPr>
+          <w:color w:val="FF0000"/>
+        </w:rPr>
+        <w:t xml:space="preserve">  </w:t>
+      </w:r>
+      <w:r>
+        <w:rPr>
+          <w:color w:val="FF0000"/>
+        </w:rPr>
+        <w:tab/>
+      </w:r>
+      <w:r>
+        <w:rPr>
+          <w:color w:val="FF0000"/>
+        </w:rPr>
+        <w:tab/>
+      </w:r>
+      <w:r>
+        <w:rPr>
+          <w:color w:val="FF0000"/>
+        </w:rPr>
+        <w:t xml:space="preserve">  return ['Contrato' =&gt; $this-&gt;Contrato, 'Fecha_inicio' =&gt; $this-&gt;Fecha_inicio, 'Fecha_fin' =&gt; $this-&gt;Fecha_fin]</w:t>
+      </w:r>
+      <w:r>
+        <w:rPr>
+          <w:color w:val="FF0000"/>
+        </w:rPr>
+        <w:t>;</w:t>
+      </w:r>
+      <w:r>
+        <w:rPr>
+          <w:color w:val="FF0000"/>
+        </w:rPr>
+        <w:t>}</w:t>
+      </w:r>
+      <w:r>
+        <w:rPr>
+          <w:color w:val="FF0000"/>
+        </w:rPr>
         <w:t xml:space="preserve"> </w:t>
       </w:r>
     </w:p>
     <w:p/>
     <w:p>
-      <w:pPr>
-        <w:rPr>
-          <w:b/>
-          <w:bCs/>
-        </w:rPr>
-      </w:pPr>
+      <w:r>
+        <w:t>Mostrar datos en la pagina HTML de forma dinamica:</w:t>
+      </w:r>
+    </w:p>
+    <w:p>
+      <w:pPr>
+        <w:pStyle w:val="Sinespaciado"/>
+        <w:ind w:left="708"/>
+        <w:rPr>
+          <w:color w:val="FF0000"/>
+        </w:rPr>
+      </w:pPr>
+      <w:r>
+        <w:rPr>
+          <w:color w:val="FF0000"/>
+        </w:rPr>
+        <w:t>$campos_a_mostrar = ['Contrato', 'Fecha_inicio', 'Fecha_fin'];</w:t>
+      </w:r>
+    </w:p>
+    <w:p>
+      <w:pPr>
+        <w:pStyle w:val="Sinespaciado"/>
+        <w:ind w:left="708"/>
+        <w:rPr>
+          <w:color w:val="FF0000"/>
+        </w:rPr>
+      </w:pPr>
+      <w:r>
+        <w:rPr>
+          <w:color w:val="FF0000"/>
+        </w:rPr>
+        <w:t>foreach ($campos_a_mostrar as $campo) {</w:t>
+      </w:r>
+    </w:p>
+    <w:p>
+      <w:pPr>
+        <w:pStyle w:val="Sinespaciado"/>
+        <w:ind w:left="708"/>
+        <w:rPr>
+          <w:color w:val="FF0000"/>
+        </w:rPr>
+      </w:pPr>
+      <w:r>
+        <w:rPr>
+          <w:color w:val="FF0000"/>
+        </w:rPr>
+        <w:t xml:space="preserve">    echo $alquiler-&gt;{'get'.$campo}();</w:t>
+      </w:r>
+    </w:p>
+    <w:p>
+      <w:pPr>
+        <w:pStyle w:val="Sinespaciado"/>
+        <w:ind w:left="708"/>
+        <w:rPr>
+          <w:color w:val="FF0000"/>
+        </w:rPr>
+      </w:pPr>
+      <w:r>
+        <w:rPr>
+          <w:color w:val="FF0000"/>
+        </w:rPr>
+        <w:t>}</w:t>
+      </w:r>
+    </w:p>
+    <w:p>
+      <w:pPr>
+        <w:rPr>
+          <w:b/>
+          <w:bCs/>
+        </w:rPr>
+      </w:pPr>
+      <w:r>
+        <w:rPr>
+          <w:b/>
+          <w:bCs/>
+        </w:rPr>
+        <w:t xml:space="preserve">Si con javascript controlo el contenido de </w:t>
+      </w:r>
+      <w:r>
+        <w:rPr>
+          <w:color w:val="FF0000"/>
+        </w:rPr>
+        <w:t>$campos_a_mostrar</w:t>
+      </w:r>
+      <w:r>
+        <w:rPr>
+          <w:color w:val="FF0000"/>
+        </w:rPr>
+        <w:t xml:space="preserve"> </w:t>
+      </w:r>
+      <w:r>
+        <w:t>puedo filtrar que campos se muestran al usuario</w:t>
+      </w:r>
     </w:p>
     <w:p>
       <w:pPr>
@@ -10703,6 +10861,7 @@
   <w:style w:type="character" w:default="1" w:styleId="Fuentedeprrafopredeter">
     <w:name w:val="Default Paragraph Font"/>
     <w:uiPriority w:val="1"/>
+    <w:semiHidden/>
     <w:unhideWhenUsed/>
   </w:style>
   <w:style w:type="table" w:default="1" w:styleId="Tablanormal">

</xml_diff>

<commit_message>
select con campos determinados
</commit_message>
<xml_diff>
--- a/BASE DATOS EMPRESA/EMPRESA/FUNCIONAMIENTO DE TODO.docx
+++ b/BASE DATOS EMPRESA/EMPRESA/FUNCIONAMIENTO DE TODO.docx
@@ -8797,126 +8797,682 @@
           <w:color w:val="FF0000"/>
         </w:rPr>
         <w:tab/>
-      </w:r>
-      <w:r>
-        <w:rPr>
-          <w:color w:val="FF0000"/>
-        </w:rPr>
-        <w:t xml:space="preserve">  return ['Contrato' =&gt; $this-&gt;Contrato, 'Fecha_inicio' =&gt; $this-&gt;Fecha_inicio, 'Fecha_fin' =&gt; $this-&gt;Fecha_fin]</w:t>
-      </w:r>
-      <w:r>
-        <w:rPr>
-          <w:color w:val="FF0000"/>
-        </w:rPr>
-        <w:t>;</w:t>
-      </w:r>
+        <w:t xml:space="preserve">  return ['Contrato' =&gt; $this-&gt;Contrato, 'Fecha_inicio' =&gt; $this-&gt;Fecha_inicio, 'Fecha_fin' =&gt; $this-&gt;Fecha_fin];}</w:t>
+      </w:r>
+      <w:r>
+        <w:rPr>
+          <w:color w:val="FF0000"/>
+        </w:rPr>
+        <w:t xml:space="preserve"> </w:t>
+      </w:r>
+    </w:p>
+    <w:p/>
+    <w:p>
+      <w:r>
+        <w:t>Mostrar datos en la pagina HTML de forma dinamica:</w:t>
+      </w:r>
+    </w:p>
+    <w:p>
+      <w:pPr>
+        <w:pStyle w:val="Sinespaciado"/>
+        <w:ind w:left="708"/>
+        <w:rPr>
+          <w:color w:val="FF0000"/>
+        </w:rPr>
+      </w:pPr>
+      <w:r>
+        <w:rPr>
+          <w:color w:val="FF0000"/>
+        </w:rPr>
+        <w:t>$campos_a_mostrar = ['Contrato', 'Fecha_inicio', 'Fecha_fin'];</w:t>
+      </w:r>
+    </w:p>
+    <w:p>
+      <w:pPr>
+        <w:pStyle w:val="Sinespaciado"/>
+        <w:ind w:left="708"/>
+        <w:rPr>
+          <w:color w:val="FF0000"/>
+        </w:rPr>
+      </w:pPr>
+      <w:r>
+        <w:rPr>
+          <w:color w:val="FF0000"/>
+        </w:rPr>
+        <w:t>foreach ($campos_a_mostrar as $campo) {</w:t>
+      </w:r>
+    </w:p>
+    <w:p>
+      <w:pPr>
+        <w:pStyle w:val="Sinespaciado"/>
+        <w:ind w:left="708"/>
+        <w:rPr>
+          <w:color w:val="FF0000"/>
+        </w:rPr>
+      </w:pPr>
+      <w:r>
+        <w:rPr>
+          <w:color w:val="FF0000"/>
+        </w:rPr>
+        <w:t xml:space="preserve">    echo $alquiler-&gt;{'get'.$campo}();</w:t>
+      </w:r>
+    </w:p>
+    <w:p>
+      <w:pPr>
+        <w:pStyle w:val="Sinespaciado"/>
+        <w:ind w:left="708"/>
+        <w:rPr>
+          <w:color w:val="FF0000"/>
+        </w:rPr>
+      </w:pPr>
       <w:r>
         <w:rPr>
           <w:color w:val="FF0000"/>
         </w:rPr>
         <w:t>}</w:t>
       </w:r>
+    </w:p>
+    <w:p>
+      <w:pPr>
+        <w:rPr>
+          <w:b/>
+          <w:bCs/>
+        </w:rPr>
+      </w:pPr>
+      <w:r>
+        <w:rPr>
+          <w:b/>
+          <w:bCs/>
+        </w:rPr>
+        <w:t xml:space="preserve">Si con javascript controlo el contenido de </w:t>
+      </w:r>
+      <w:r>
+        <w:rPr>
+          <w:color w:val="FF0000"/>
+        </w:rPr>
+        <w:t>$campos_a_mostrar</w:t>
+      </w:r>
       <w:r>
         <w:rPr>
           <w:color w:val="FF0000"/>
         </w:rPr>
         <w:t xml:space="preserve"> </w:t>
       </w:r>
-    </w:p>
-    <w:p/>
-    <w:p>
-      <w:r>
-        <w:t>Mostrar datos en la pagina HTML de forma dinamica:</w:t>
-      </w:r>
-    </w:p>
-    <w:p>
-      <w:pPr>
-        <w:pStyle w:val="Sinespaciado"/>
-        <w:ind w:left="708"/>
-        <w:rPr>
-          <w:color w:val="FF0000"/>
-        </w:rPr>
-      </w:pPr>
-      <w:r>
-        <w:rPr>
-          <w:color w:val="FF0000"/>
-        </w:rPr>
-        <w:t>$campos_a_mostrar = ['Contrato', 'Fecha_inicio', 'Fecha_fin'];</w:t>
-      </w:r>
-    </w:p>
-    <w:p>
-      <w:pPr>
-        <w:pStyle w:val="Sinespaciado"/>
-        <w:ind w:left="708"/>
-        <w:rPr>
-          <w:color w:val="FF0000"/>
-        </w:rPr>
-      </w:pPr>
-      <w:r>
-        <w:rPr>
-          <w:color w:val="FF0000"/>
-        </w:rPr>
-        <w:t>foreach ($campos_a_mostrar as $campo) {</w:t>
-      </w:r>
-    </w:p>
-    <w:p>
-      <w:pPr>
-        <w:pStyle w:val="Sinespaciado"/>
-        <w:ind w:left="708"/>
-        <w:rPr>
-          <w:color w:val="FF0000"/>
-        </w:rPr>
-      </w:pPr>
-      <w:r>
-        <w:rPr>
-          <w:color w:val="FF0000"/>
-        </w:rPr>
-        <w:t xml:space="preserve">    echo $alquiler-&gt;{'get'.$campo}();</w:t>
-      </w:r>
-    </w:p>
-    <w:p>
-      <w:pPr>
-        <w:pStyle w:val="Sinespaciado"/>
-        <w:ind w:left="708"/>
-        <w:rPr>
-          <w:color w:val="FF0000"/>
-        </w:rPr>
-      </w:pPr>
-      <w:r>
-        <w:rPr>
-          <w:color w:val="FF0000"/>
-        </w:rPr>
-        <w:t>}</w:t>
-      </w:r>
-    </w:p>
-    <w:p>
-      <w:pPr>
-        <w:rPr>
-          <w:b/>
-          <w:bCs/>
-        </w:rPr>
-      </w:pPr>
-      <w:r>
-        <w:rPr>
-          <w:b/>
-          <w:bCs/>
-        </w:rPr>
-        <w:t xml:space="preserve">Si con javascript controlo el contenido de </w:t>
-      </w:r>
-      <w:r>
-        <w:rPr>
-          <w:color w:val="FF0000"/>
-        </w:rPr>
-        <w:t>$campos_a_mostrar</w:t>
-      </w:r>
-      <w:r>
-        <w:rPr>
-          <w:color w:val="FF0000"/>
-        </w:rPr>
-        <w:t xml:space="preserve"> </w:t>
-      </w:r>
       <w:r>
         <w:t>puedo filtrar que campos se muestran al usuario</w:t>
+      </w:r>
+    </w:p>
+    <w:p>
+      <w:pPr>
+        <w:rPr>
+          <w:b/>
+          <w:bCs/>
+        </w:rPr>
+      </w:pPr>
+      <w:r>
+        <w:rPr>
+          <w:b/>
+          <w:bCs/>
+        </w:rPr>
+        <w:lastRenderedPageBreak/>
+        <w:t>ASI ES COMO SE CONFIGURA UNA CALASE QUE HEREDA DE OTRA. LA CLASE QUE HEREDA (HIJA) TIENE CONSTRUCTOR Y LA CLASE MADRE TMB.</w:t>
+      </w:r>
+    </w:p>
+    <w:p>
+      <w:pPr>
+        <w:rPr>
+          <w:b/>
+          <w:bCs/>
+        </w:rPr>
+      </w:pPr>
+      <w:r>
+        <w:rPr>
+          <w:b/>
+          <w:bCs/>
+        </w:rPr>
+        <w:t>Para que funcione en el constructor de la clase hija las variables que ya estan  en el constructor de la madre no hay que ponerle private, porque eso lo que hace es crear esas variables, al no ponerlo no las crea y las creara el construcotr de la madre que si lleva private.</w:t>
+      </w:r>
+      <w:r>
+        <w:rPr>
+          <w:b/>
+          <w:bCs/>
+        </w:rPr>
+        <w:t xml:space="preserve"> En la hija solo se pone private en las variables que ella crea nuevas.</w:t>
+      </w:r>
+    </w:p>
+    <w:p>
+      <w:pPr>
+        <w:rPr>
+          <w:b/>
+          <w:bCs/>
+          <w:color w:val="FF0000"/>
+        </w:rPr>
+      </w:pPr>
+      <w:r>
+        <w:rPr>
+          <w:b/>
+          <w:bCs/>
+          <w:color w:val="FF0000"/>
+        </w:rPr>
+        <w:t>MADRE</w:t>
+      </w:r>
+    </w:p>
+    <w:p>
+      <w:pPr>
+        <w:rPr>
+          <w:b/>
+          <w:bCs/>
+        </w:rPr>
+      </w:pPr>
+      <w:r>
+        <w:rPr>
+          <w:b/>
+          <w:bCs/>
+        </w:rPr>
+        <w:t xml:space="preserve">class Alquiler {    </w:t>
+      </w:r>
+    </w:p>
+    <w:p>
+      <w:pPr>
+        <w:rPr>
+          <w:b/>
+          <w:bCs/>
+        </w:rPr>
+      </w:pPr>
+      <w:r>
+        <w:rPr>
+          <w:b/>
+          <w:bCs/>
+        </w:rPr>
+        <w:t>    function __construct (private int $id_alquiler, private string $Contrato, private int $id_vehiculo, private int $Cliente, private string $Fecha_inicio, private ?string $Fecha_fin, private ?int $Kilometros,</w:t>
+      </w:r>
+    </w:p>
+    <w:p>
+      <w:pPr>
+        <w:rPr>
+          <w:b/>
+          <w:bCs/>
+        </w:rPr>
+      </w:pPr>
+      <w:r>
+        <w:rPr>
+          <w:b/>
+          <w:bCs/>
+        </w:rPr>
+        <w:t xml:space="preserve">    private ?int $Km_inicio, private ?int $Km_fin, private ?string $Dias, private ?int $Precio, private ?int $Precio_km, private ?int $id_comercial, private ?int $Empresa, private ?string $Ciudad, </w:t>
+      </w:r>
+    </w:p>
+    <w:p>
+      <w:pPr>
+        <w:rPr>
+          <w:b/>
+          <w:bCs/>
+        </w:rPr>
+      </w:pPr>
+      <w:r>
+        <w:rPr>
+          <w:b/>
+          <w:bCs/>
+        </w:rPr>
+        <w:t>    private ?string $Entrega, private ?int $Comision_comercial, private ?int $Ganancia, private ?string $Observaciones, private ?Vehiculo $vehiculo = null){}</w:t>
+      </w:r>
+    </w:p>
+    <w:p>
+      <w:pPr>
+        <w:rPr>
+          <w:b/>
+          <w:bCs/>
+        </w:rPr>
+      </w:pPr>
+    </w:p>
+    <w:p>
+      <w:pPr>
+        <w:rPr>
+          <w:b/>
+          <w:bCs/>
+        </w:rPr>
+      </w:pPr>
+      <w:r>
+        <w:rPr>
+          <w:b/>
+          <w:bCs/>
+        </w:rPr>
+        <w:t>    public function getVehiculo(): ?Vehiculo {</w:t>
+      </w:r>
+    </w:p>
+    <w:p>
+      <w:pPr>
+        <w:rPr>
+          <w:b/>
+          <w:bCs/>
+        </w:rPr>
+      </w:pPr>
+      <w:r>
+        <w:rPr>
+          <w:b/>
+          <w:bCs/>
+        </w:rPr>
+        <w:t>        return $this-&gt;vehiculo;</w:t>
+      </w:r>
+    </w:p>
+    <w:p>
+      <w:pPr>
+        <w:rPr>
+          <w:b/>
+          <w:bCs/>
+        </w:rPr>
+      </w:pPr>
+      <w:r>
+        <w:rPr>
+          <w:b/>
+          <w:bCs/>
+        </w:rPr>
+        <w:t>    }</w:t>
+      </w:r>
+    </w:p>
+    <w:p>
+      <w:pPr>
+        <w:rPr>
+          <w:b/>
+          <w:bCs/>
+        </w:rPr>
+      </w:pPr>
+      <w:r>
+        <w:rPr>
+          <w:b/>
+          <w:bCs/>
+        </w:rPr>
+        <w:t>    public function setVehiculo(Vehiculo $vehiculo) {</w:t>
+      </w:r>
+    </w:p>
+    <w:p>
+      <w:pPr>
+        <w:rPr>
+          <w:b/>
+          <w:bCs/>
+        </w:rPr>
+      </w:pPr>
+      <w:r>
+        <w:rPr>
+          <w:b/>
+          <w:bCs/>
+        </w:rPr>
+        <w:t>        $this-&gt;vehiculo = $vehiculo;</w:t>
+      </w:r>
+    </w:p>
+    <w:p>
+      <w:pPr>
+        <w:rPr>
+          <w:b/>
+          <w:bCs/>
+        </w:rPr>
+      </w:pPr>
+      <w:r>
+        <w:rPr>
+          <w:b/>
+          <w:bCs/>
+        </w:rPr>
+        <w:t>    }</w:t>
+      </w:r>
+    </w:p>
+    <w:p>
+      <w:pPr>
+        <w:rPr>
+          <w:b/>
+          <w:bCs/>
+          <w:color w:val="FF0000"/>
+        </w:rPr>
+      </w:pPr>
+      <w:r>
+        <w:rPr>
+          <w:b/>
+          <w:bCs/>
+          <w:color w:val="FF0000"/>
+        </w:rPr>
+        <w:t>HIJA</w:t>
+      </w:r>
+    </w:p>
+    <w:p>
+      <w:pPr>
+        <w:rPr>
+          <w:b/>
+          <w:bCs/>
+        </w:rPr>
+      </w:pPr>
+      <w:r>
+        <w:rPr>
+          <w:b/>
+          <w:bCs/>
+        </w:rPr>
+        <w:t>class Alquiler_vehiculo extends Alquiler {</w:t>
+      </w:r>
+    </w:p>
+    <w:p>
+      <w:pPr>
+        <w:rPr>
+          <w:b/>
+          <w:bCs/>
+          <w:color w:val="FF0000"/>
+        </w:rPr>
+      </w:pPr>
+      <w:r>
+        <w:rPr>
+          <w:b/>
+          <w:bCs/>
+        </w:rPr>
+        <w:t>        function __construct (</w:t>
+      </w:r>
+      <w:r>
+        <w:rPr>
+          <w:b/>
+          <w:bCs/>
+          <w:color w:val="FF0000"/>
+        </w:rPr>
+        <w:t>int $id_alquiler, string $Contrato, int $id_vehiculo, int $Cliente, string $Fecha_inicio, ?string $Fecha_fin, ?int $Km, ?int $Km_inicio, ?int $Km_fin, ?string $Dias,</w:t>
+      </w:r>
+    </w:p>
+    <w:p>
+      <w:pPr>
+        <w:rPr>
+          <w:b/>
+          <w:bCs/>
+          <w:color w:val="FF0000"/>
+        </w:rPr>
+      </w:pPr>
+      <w:r>
+        <w:rPr>
+          <w:b/>
+          <w:bCs/>
+          <w:color w:val="FF0000"/>
+        </w:rPr>
+        <w:t>                          ?int $Precio, ?int $Precio_km, ?int $id_comercial, ?int $Empresa, ?string $Ciudad, ?string $Entrega, ?int $Comision_comercial, ?int $Ganancia,</w:t>
+      </w:r>
+    </w:p>
+    <w:p>
+      <w:pPr>
+        <w:rPr>
+          <w:b/>
+          <w:bCs/>
+        </w:rPr>
+      </w:pPr>
+      <w:r>
+        <w:rPr>
+          <w:b/>
+          <w:bCs/>
+          <w:color w:val="FF0000"/>
+        </w:rPr>
+        <w:t>                          ?string $Observaciones</w:t>
+      </w:r>
+      <w:r>
+        <w:rPr>
+          <w:b/>
+          <w:bCs/>
+        </w:rPr>
+        <w:t>, private string $Marca_modelo, private ?string $Matricula){</w:t>
+      </w:r>
+    </w:p>
+    <w:p>
+      <w:pPr>
+        <w:rPr>
+          <w:b/>
+          <w:bCs/>
+        </w:rPr>
+      </w:pPr>
+      <w:r>
+        <w:rPr>
+          <w:b/>
+          <w:bCs/>
+        </w:rPr>
+        <w:lastRenderedPageBreak/>
+        <w:t xml:space="preserve">                            </w:t>
+      </w:r>
+    </w:p>
+    <w:p>
+      <w:pPr>
+        <w:rPr>
+          <w:b/>
+          <w:bCs/>
+        </w:rPr>
+      </w:pPr>
+      <w:r>
+        <w:rPr>
+          <w:b/>
+          <w:bCs/>
+        </w:rPr>
+        <w:t>                            parent::__construct($id_alquiler, $Contrato, $id_vehiculo, $Cliente, $Fecha_inicio, $Fecha_fin, $Km, $Km_inicio, $Km_fin, $Dias, $Precio, $Precio_km, $id_comercial,</w:t>
+      </w:r>
+    </w:p>
+    <w:p>
+      <w:pPr>
+        <w:rPr>
+          <w:b/>
+          <w:bCs/>
+        </w:rPr>
+      </w:pPr>
+      <w:r>
+        <w:rPr>
+          <w:b/>
+          <w:bCs/>
+        </w:rPr>
+        <w:t>                                                $Empresa, $Ciudad, $Entrega, $Comision_comercial, $Ganancia, $Observaciones);</w:t>
+      </w:r>
+    </w:p>
+    <w:p>
+      <w:pPr>
+        <w:rPr>
+          <w:b/>
+          <w:bCs/>
+        </w:rPr>
+      </w:pPr>
+      <w:r>
+        <w:rPr>
+          <w:b/>
+          <w:bCs/>
+        </w:rPr>
+        <w:t>                          }</w:t>
+      </w:r>
+    </w:p>
+    <w:p>
+      <w:pPr>
+        <w:rPr>
+          <w:b/>
+          <w:bCs/>
+        </w:rPr>
+      </w:pPr>
+      <w:r>
+        <w:rPr>
+          <w:b/>
+          <w:bCs/>
+        </w:rPr>
+        <w:t xml:space="preserve">    </w:t>
+      </w:r>
+    </w:p>
+    <w:p>
+      <w:pPr>
+        <w:rPr>
+          <w:b/>
+          <w:bCs/>
+        </w:rPr>
+      </w:pPr>
+      <w:r>
+        <w:rPr>
+          <w:b/>
+          <w:bCs/>
+        </w:rPr>
+        <w:t>    public function getMarca_modelo(): string {</w:t>
+      </w:r>
+    </w:p>
+    <w:p>
+      <w:pPr>
+        <w:rPr>
+          <w:b/>
+          <w:bCs/>
+        </w:rPr>
+      </w:pPr>
+      <w:r>
+        <w:rPr>
+          <w:b/>
+          <w:bCs/>
+        </w:rPr>
+        <w:t>        return $this-&gt;Marca_modelo;</w:t>
+      </w:r>
+    </w:p>
+    <w:p>
+      <w:pPr>
+        <w:rPr>
+          <w:b/>
+          <w:bCs/>
+        </w:rPr>
+      </w:pPr>
+      <w:r>
+        <w:rPr>
+          <w:b/>
+          <w:bCs/>
+        </w:rPr>
+        <w:t>    }</w:t>
+      </w:r>
+    </w:p>
+    <w:p>
+      <w:pPr>
+        <w:rPr>
+          <w:b/>
+          <w:bCs/>
+        </w:rPr>
+      </w:pPr>
+      <w:r>
+        <w:rPr>
+          <w:b/>
+          <w:bCs/>
+        </w:rPr>
+        <w:t>    public function setMarca_modelo(string $marca_modelo) {</w:t>
+      </w:r>
+    </w:p>
+    <w:p>
+      <w:pPr>
+        <w:rPr>
+          <w:b/>
+          <w:bCs/>
+        </w:rPr>
+      </w:pPr>
+      <w:r>
+        <w:rPr>
+          <w:b/>
+          <w:bCs/>
+        </w:rPr>
+        <w:t>        $this-&gt;Marca_modelo = $marca_modelo;</w:t>
+      </w:r>
+    </w:p>
+    <w:p>
+      <w:pPr>
+        <w:rPr>
+          <w:b/>
+          <w:bCs/>
+        </w:rPr>
+      </w:pPr>
+      <w:r>
+        <w:rPr>
+          <w:b/>
+          <w:bCs/>
+        </w:rPr>
+        <w:t>    }</w:t>
+      </w:r>
+    </w:p>
+    <w:p>
+      <w:pPr>
+        <w:rPr>
+          <w:b/>
+          <w:bCs/>
+        </w:rPr>
+      </w:pPr>
+    </w:p>
+    <w:p>
+      <w:pPr>
+        <w:rPr>
+          <w:b/>
+          <w:bCs/>
+        </w:rPr>
+      </w:pPr>
+      <w:r>
+        <w:rPr>
+          <w:b/>
+          <w:bCs/>
+        </w:rPr>
+        <w:t>    public function getMatricula(): ?string {</w:t>
+      </w:r>
+    </w:p>
+    <w:p>
+      <w:pPr>
+        <w:rPr>
+          <w:b/>
+          <w:bCs/>
+        </w:rPr>
+      </w:pPr>
+      <w:r>
+        <w:rPr>
+          <w:b/>
+          <w:bCs/>
+        </w:rPr>
+        <w:t>        return $this-&gt;Matricula;</w:t>
+      </w:r>
+    </w:p>
+    <w:p>
+      <w:pPr>
+        <w:rPr>
+          <w:b/>
+          <w:bCs/>
+        </w:rPr>
+      </w:pPr>
+      <w:r>
+        <w:rPr>
+          <w:b/>
+          <w:bCs/>
+        </w:rPr>
+        <w:t>    }</w:t>
+      </w:r>
+    </w:p>
+    <w:p>
+      <w:pPr>
+        <w:rPr>
+          <w:b/>
+          <w:bCs/>
+        </w:rPr>
+      </w:pPr>
+      <w:r>
+        <w:rPr>
+          <w:b/>
+          <w:bCs/>
+        </w:rPr>
+        <w:t>    public function setMatricula(?string $matricula) {</w:t>
+      </w:r>
+    </w:p>
+    <w:p>
+      <w:pPr>
+        <w:rPr>
+          <w:b/>
+          <w:bCs/>
+        </w:rPr>
+      </w:pPr>
+      <w:r>
+        <w:rPr>
+          <w:b/>
+          <w:bCs/>
+        </w:rPr>
+        <w:t>        $this-&gt;Matricula = $matricula;</w:t>
+      </w:r>
+    </w:p>
+    <w:p>
+      <w:pPr>
+        <w:rPr>
+          <w:b/>
+          <w:bCs/>
+        </w:rPr>
+      </w:pPr>
+      <w:r>
+        <w:rPr>
+          <w:b/>
+          <w:bCs/>
+        </w:rPr>
+        <w:t>    }</w:t>
       </w:r>
     </w:p>
     <w:p>
@@ -10861,7 +11417,6 @@
   <w:style w:type="character" w:default="1" w:styleId="Fuentedeprrafopredeter">
     <w:name w:val="Default Paragraph Font"/>
     <w:uiPriority w:val="1"/>
-    <w:semiHidden/>
     <w:unhideWhenUsed/>
   </w:style>
   <w:style w:type="table" w:default="1" w:styleId="Tablanormal">

</xml_diff>

<commit_message>
nuevo acceso a datos PDO
</commit_message>
<xml_diff>
--- a/BASE DATOS EMPRESA/EMPRESA/FUNCIONAMIENTO DE TODO.docx
+++ b/BASE DATOS EMPRESA/EMPRESA/FUNCIONAMIENTO DE TODO.docx
@@ -4802,13 +4802,34 @@
           <w:lang w:eastAsia="es-ES"/>
           <w14:ligatures w14:val="none"/>
         </w:rPr>
-        <w:t>= “p</w:t>
-      </w:r>
-      <w:r>
-        <w:rPr>
-          <w:color w:val="EE0000"/>
-        </w:rPr>
-        <w:t>ages/borrar/&lt;?=$entidad-&gt;getId()?&gt;</w:t>
+        <w:t>= “</w:t>
+      </w:r>
+      <w:proofErr w:type="spellStart"/>
+      <w:r>
+        <w:rPr>
+          <w:rFonts w:ascii="Consolas" w:eastAsia="Times New Roman" w:hAnsi="Consolas" w:cs="Times New Roman"/>
+          <w:noProof w:val="0"/>
+          <w:color w:val="CE9178"/>
+          <w:kern w:val="0"/>
+          <w:sz w:val="21"/>
+          <w:szCs w:val="21"/>
+          <w:lang w:eastAsia="es-ES"/>
+          <w14:ligatures w14:val="none"/>
+        </w:rPr>
+        <w:t>p</w:t>
+      </w:r>
+      <w:r>
+        <w:rPr>
+          <w:color w:val="EE0000"/>
+        </w:rPr>
+        <w:t>ages</w:t>
+      </w:r>
+      <w:proofErr w:type="spellEnd"/>
+      <w:r>
+        <w:rPr>
+          <w:color w:val="EE0000"/>
+        </w:rPr>
+        <w:t>/borrar/&lt;?=$entidad-&gt;getId()?&gt;</w:t>
       </w:r>
     </w:p>
     <w:p>
@@ -9485,10 +9506,257 @@
     </w:p>
     <w:p/>
     <w:p/>
-    <w:p/>
-    <w:p/>
-    <w:p/>
-    <w:p/>
+    <w:p>
+      <w:r>
+        <w:lastRenderedPageBreak/>
+        <w:t>OJO CON USAR TABLA CON INDICES ASOCIATIVOS.</w:t>
+      </w:r>
+    </w:p>
+    <w:p>
+      <w:r>
+        <w:t>Si alguno de los indices es igual a otro, el segundo indice machaca el contenido del primero.</w:t>
+      </w:r>
+    </w:p>
+    <w:p>
+      <w:pPr>
+        <w:rPr>
+          <w:color w:val="FF0000"/>
+        </w:rPr>
+      </w:pPr>
+      <w:r>
+        <w:rPr>
+          <w:color w:val="FF0000"/>
+        </w:rPr>
+        <w:t>[  "id_vehiculo" =&gt; 'gastosvehiculo',   "id_vehiculo" =&gt; 'alquileres',   "id_vehiculo" =&gt; 'compraventas']</w:t>
+      </w:r>
+    </w:p>
+    <w:p>
+      <w:r>
+        <w:t xml:space="preserve">En este ejemplo esta tabla solo contiene un elemento, el ultimo insertado: ,   </w:t>
+      </w:r>
+      <w:r>
+        <w:rPr>
+          <w:color w:val="FF0000"/>
+        </w:rPr>
+        <w:t>["id_vehiculo" =&gt; 'compraventas'],</w:t>
+      </w:r>
+      <w:r>
+        <w:t xml:space="preserve"> este ultimo ha machacado los demas.</w:t>
+      </w:r>
+    </w:p>
+    <w:p>
+      <w:r>
+        <w:t>Para poder usar tablas con indices asociatvos que se pueden repetir habria que usar una tabla que contenga tablas, y cada tabla contiene dos elementos, uno que es el indice id_vehiculo y otro que es el valor:</w:t>
+      </w:r>
+    </w:p>
+    <w:p>
+      <w:pPr>
+        <w:pStyle w:val="Sinespaciado"/>
+        <w:rPr>
+          <w:color w:val="2F5496" w:themeColor="accent1" w:themeShade="BF"/>
+        </w:rPr>
+      </w:pPr>
+      <w:r>
+        <w:rPr>
+          <w:color w:val="2F5496" w:themeColor="accent1" w:themeShade="BF"/>
+        </w:rPr>
+        <w:t>$relaciones = [</w:t>
+      </w:r>
+    </w:p>
+    <w:p>
+      <w:pPr>
+        <w:pStyle w:val="Sinespaciado"/>
+        <w:rPr>
+          <w:color w:val="2F5496" w:themeColor="accent1" w:themeShade="BF"/>
+        </w:rPr>
+      </w:pPr>
+      <w:r>
+        <w:rPr>
+          <w:color w:val="2F5496" w:themeColor="accent1" w:themeShade="BF"/>
+        </w:rPr>
+        <w:t xml:space="preserve">    ['campo' =&gt; 'id_vehiculo', 'tabla' =&gt; 'gastosvehiculo'], //elemento [0]</w:t>
+      </w:r>
+    </w:p>
+    <w:p>
+      <w:pPr>
+        <w:pStyle w:val="Sinespaciado"/>
+        <w:rPr>
+          <w:color w:val="2F5496" w:themeColor="accent1" w:themeShade="BF"/>
+        </w:rPr>
+      </w:pPr>
+      <w:r>
+        <w:rPr>
+          <w:color w:val="2F5496" w:themeColor="accent1" w:themeShade="BF"/>
+        </w:rPr>
+        <w:t xml:space="preserve">    ['campo' =&gt; 'id_vehiculo', 'tabla' =&gt; 'alquileres'],</w:t>
+      </w:r>
+      <w:r>
+        <w:rPr>
+          <w:color w:val="2F5496" w:themeColor="accent1" w:themeShade="BF"/>
+        </w:rPr>
+        <w:tab/>
+        <w:t>//elemento [1]</w:t>
+      </w:r>
+    </w:p>
+    <w:p>
+      <w:pPr>
+        <w:pStyle w:val="Sinespaciado"/>
+        <w:rPr>
+          <w:color w:val="2F5496" w:themeColor="accent1" w:themeShade="BF"/>
+        </w:rPr>
+      </w:pPr>
+      <w:r>
+        <w:rPr>
+          <w:color w:val="2F5496" w:themeColor="accent1" w:themeShade="BF"/>
+        </w:rPr>
+        <w:t xml:space="preserve">    ['campo' =&gt; 'id_vehiculo', 'tabla' =&gt; 'compraventas'],  //elemento [2]</w:t>
+      </w:r>
+    </w:p>
+    <w:p>
+      <w:pPr>
+        <w:pStyle w:val="Sinespaciado"/>
+        <w:rPr>
+          <w:color w:val="2F5496" w:themeColor="accent1" w:themeShade="BF"/>
+        </w:rPr>
+      </w:pPr>
+      <w:r>
+        <w:rPr>
+          <w:color w:val="2F5496" w:themeColor="accent1" w:themeShade="BF"/>
+        </w:rPr>
+        <w:t>];</w:t>
+      </w:r>
+    </w:p>
+    <w:p>
+      <w:r>
+        <w:t xml:space="preserve">Para sacar el indice y el valor seria asi: </w:t>
+      </w:r>
+    </w:p>
+    <w:p>
+      <w:pPr>
+        <w:pStyle w:val="Sinespaciado"/>
+        <w:rPr>
+          <w:color w:val="2F5496" w:themeColor="accent1" w:themeShade="BF"/>
+        </w:rPr>
+      </w:pPr>
+      <w:r>
+        <w:rPr>
+          <w:color w:val="2F5496" w:themeColor="accent1" w:themeShade="BF"/>
+        </w:rPr>
+        <w:t>foreach ($relaciones as $relacion) {</w:t>
+      </w:r>
+    </w:p>
+    <w:p>
+      <w:pPr>
+        <w:pStyle w:val="Sinespaciado"/>
+        <w:rPr>
+          <w:color w:val="2F5496" w:themeColor="accent1" w:themeShade="BF"/>
+        </w:rPr>
+      </w:pPr>
+      <w:r>
+        <w:rPr>
+          <w:color w:val="2F5496" w:themeColor="accent1" w:themeShade="BF"/>
+        </w:rPr>
+        <w:t xml:space="preserve">    $campo = $relacion['campo'];</w:t>
+      </w:r>
+    </w:p>
+    <w:p>
+      <w:pPr>
+        <w:pStyle w:val="Sinespaciado"/>
+        <w:rPr>
+          <w:color w:val="2F5496" w:themeColor="accent1" w:themeShade="BF"/>
+        </w:rPr>
+      </w:pPr>
+      <w:r>
+        <w:rPr>
+          <w:color w:val="2F5496" w:themeColor="accent1" w:themeShade="BF"/>
+        </w:rPr>
+        <w:t xml:space="preserve">    $tabla = $relacion['tabla'];</w:t>
+      </w:r>
+    </w:p>
+    <w:p>
+      <w:pPr>
+        <w:pStyle w:val="Sinespaciado"/>
+        <w:rPr>
+          <w:color w:val="2F5496" w:themeColor="accent1" w:themeShade="BF"/>
+        </w:rPr>
+      </w:pPr>
+      <w:r>
+        <w:rPr>
+          <w:color w:val="2F5496" w:themeColor="accent1" w:themeShade="BF"/>
+        </w:rPr>
+        <w:t xml:space="preserve">    $consulta = "SELECT COUNT(*) as total FROM $tabla WHERE $campo = $id";</w:t>
+      </w:r>
+    </w:p>
+    <w:p>
+      <w:pPr>
+        <w:pStyle w:val="Sinespaciado"/>
+        <w:rPr>
+          <w:color w:val="2F5496" w:themeColor="accent1" w:themeShade="BF"/>
+        </w:rPr>
+      </w:pPr>
+      <w:r>
+        <w:rPr>
+          <w:color w:val="2F5496" w:themeColor="accent1" w:themeShade="BF"/>
+        </w:rPr>
+        <w:t xml:space="preserve">    echo "&lt;pre&gt;$consulta&lt;/pre&gt;";</w:t>
+      </w:r>
+    </w:p>
+    <w:p>
+      <w:pPr>
+        <w:pStyle w:val="Sinespaciado"/>
+        <w:rPr>
+          <w:color w:val="2F5496" w:themeColor="accent1" w:themeShade="BF"/>
+        </w:rPr>
+      </w:pPr>
+      <w:r>
+        <w:rPr>
+          <w:color w:val="2F5496" w:themeColor="accent1" w:themeShade="BF"/>
+        </w:rPr>
+        <w:t xml:space="preserve">    $this-&gt;conexion-&gt;consulta($consulta);</w:t>
+      </w:r>
+    </w:p>
+    <w:p>
+      <w:pPr>
+        <w:pStyle w:val="Sinespaciado"/>
+        <w:rPr>
+          <w:color w:val="2F5496" w:themeColor="accent1" w:themeShade="BF"/>
+        </w:rPr>
+      </w:pPr>
+      <w:r>
+        <w:rPr>
+          <w:color w:val="2F5496" w:themeColor="accent1" w:themeShade="BF"/>
+        </w:rPr>
+        <w:t xml:space="preserve">    $resultado = $this-&gt;conexion-&gt;extraer_registro();</w:t>
+      </w:r>
+    </w:p>
+    <w:p>
+      <w:pPr>
+        <w:pStyle w:val="Sinespaciado"/>
+        <w:rPr>
+          <w:color w:val="2F5496" w:themeColor="accent1" w:themeShade="BF"/>
+        </w:rPr>
+      </w:pPr>
+      <w:r>
+        <w:rPr>
+          <w:color w:val="2F5496" w:themeColor="accent1" w:themeShade="BF"/>
+        </w:rPr>
+        <w:t xml:space="preserve">    $encontrados += $resultado['total'];</w:t>
+      </w:r>
+    </w:p>
+    <w:p>
+      <w:pPr>
+        <w:pStyle w:val="Sinespaciado"/>
+        <w:rPr>
+          <w:color w:val="2F5496" w:themeColor="accent1" w:themeShade="BF"/>
+        </w:rPr>
+      </w:pPr>
+      <w:r>
+        <w:rPr>
+          <w:color w:val="2F5496" w:themeColor="accent1" w:themeShade="BF"/>
+        </w:rPr>
+        <w:t>}</w:t>
+      </w:r>
+    </w:p>
     <w:p/>
     <w:sectPr>
       <w:footerReference w:type="default" r:id="rId8"/>
@@ -11417,6 +11685,7 @@
   <w:style w:type="character" w:default="1" w:styleId="Fuentedeprrafopredeter">
     <w:name w:val="Default Paragraph Font"/>
     <w:uiPriority w:val="1"/>
+    <w:semiHidden/>
     <w:unhideWhenUsed/>
   </w:style>
   <w:style w:type="table" w:default="1" w:styleId="Tablanormal">

</xml_diff>

<commit_message>
campos tipo fecha entero y lista desplagable
</commit_message>
<xml_diff>
--- a/BASE DATOS EMPRESA/EMPRESA/FUNCIONAMIENTO DE TODO.docx
+++ b/BASE DATOS EMPRESA/EMPRESA/FUNCIONAMIENTO DE TODO.docx
@@ -9507,7 +9507,18 @@
     <w:p/>
     <w:p/>
     <w:p>
-      <w:r>
+      <w:pPr>
+        <w:jc w:val="center"/>
+        <w:rPr>
+          <w:b/>
+          <w:bCs/>
+        </w:rPr>
+      </w:pPr>
+      <w:r>
+        <w:rPr>
+          <w:b/>
+          <w:bCs/>
+        </w:rPr>
         <w:lastRenderedPageBreak/>
         <w:t>OJO CON USAR TABLA CON INDICES ASOCIATIVOS.</w:t>
       </w:r>
@@ -9649,112 +9660,836 @@
       <w:pPr>
         <w:pStyle w:val="Sinespaciado"/>
         <w:rPr>
+          <w:color w:val="FF0000"/>
+        </w:rPr>
+      </w:pPr>
+      <w:r>
+        <w:rPr>
           <w:color w:val="2F5496" w:themeColor="accent1" w:themeShade="BF"/>
         </w:rPr>
-      </w:pPr>
-      <w:r>
+        <w:t xml:space="preserve">    </w:t>
+      </w:r>
+      <w:r>
+        <w:rPr>
+          <w:color w:val="FF0000"/>
+        </w:rPr>
+        <w:t>$campo = $relacion['campo'];</w:t>
+      </w:r>
+    </w:p>
+    <w:p>
+      <w:pPr>
+        <w:pStyle w:val="Sinespaciado"/>
+        <w:rPr>
+          <w:color w:val="FF0000"/>
+        </w:rPr>
+      </w:pPr>
+      <w:r>
+        <w:rPr>
+          <w:color w:val="FF0000"/>
+        </w:rPr>
+        <w:t xml:space="preserve">    $tabla = $relacion['tabla'];</w:t>
+      </w:r>
+    </w:p>
+    <w:p>
+      <w:pPr>
+        <w:pStyle w:val="Sinespaciado"/>
         <w:rPr>
           <w:color w:val="2F5496" w:themeColor="accent1" w:themeShade="BF"/>
         </w:rPr>
-        <w:t xml:space="preserve">    $campo = $relacion['campo'];</w:t>
-      </w:r>
-    </w:p>
-    <w:p>
-      <w:pPr>
-        <w:pStyle w:val="Sinespaciado"/>
+      </w:pPr>
+      <w:r>
         <w:rPr>
           <w:color w:val="2F5496" w:themeColor="accent1" w:themeShade="BF"/>
         </w:rPr>
-      </w:pPr>
-      <w:r>
+        <w:t xml:space="preserve">    $consulta = "SELECT COUNT(*) as total FROM $tabla WHERE $campo = $id";</w:t>
+      </w:r>
+    </w:p>
+    <w:p>
+      <w:pPr>
+        <w:pStyle w:val="Sinespaciado"/>
         <w:rPr>
           <w:color w:val="2F5496" w:themeColor="accent1" w:themeShade="BF"/>
         </w:rPr>
-        <w:t xml:space="preserve">    $tabla = $relacion['tabla'];</w:t>
-      </w:r>
-    </w:p>
-    <w:p>
-      <w:pPr>
-        <w:pStyle w:val="Sinespaciado"/>
+      </w:pPr>
+      <w:r>
         <w:rPr>
           <w:color w:val="2F5496" w:themeColor="accent1" w:themeShade="BF"/>
         </w:rPr>
-      </w:pPr>
-      <w:r>
+        <w:t xml:space="preserve">    echo "&lt;pre&gt;$consulta&lt;/pre&gt;";</w:t>
+      </w:r>
+    </w:p>
+    <w:p>
+      <w:pPr>
+        <w:pStyle w:val="Sinespaciado"/>
         <w:rPr>
           <w:color w:val="2F5496" w:themeColor="accent1" w:themeShade="BF"/>
         </w:rPr>
-        <w:t xml:space="preserve">    $consulta = "SELECT COUNT(*) as total FROM $tabla WHERE $campo = $id";</w:t>
-      </w:r>
-    </w:p>
-    <w:p>
-      <w:pPr>
-        <w:pStyle w:val="Sinespaciado"/>
+      </w:pPr>
+      <w:r>
         <w:rPr>
           <w:color w:val="2F5496" w:themeColor="accent1" w:themeShade="BF"/>
         </w:rPr>
-      </w:pPr>
-      <w:r>
+        <w:t xml:space="preserve">    $this-&gt;conexion-&gt;consulta($consulta);</w:t>
+      </w:r>
+    </w:p>
+    <w:p>
+      <w:pPr>
+        <w:pStyle w:val="Sinespaciado"/>
         <w:rPr>
           <w:color w:val="2F5496" w:themeColor="accent1" w:themeShade="BF"/>
         </w:rPr>
-        <w:t xml:space="preserve">    echo "&lt;pre&gt;$consulta&lt;/pre&gt;";</w:t>
-      </w:r>
-    </w:p>
-    <w:p>
-      <w:pPr>
-        <w:pStyle w:val="Sinespaciado"/>
+      </w:pPr>
+      <w:r>
         <w:rPr>
           <w:color w:val="2F5496" w:themeColor="accent1" w:themeShade="BF"/>
         </w:rPr>
-      </w:pPr>
-      <w:r>
+        <w:t xml:space="preserve">    $resultado = $this-&gt;conexion-&gt;extraer_registro();</w:t>
+      </w:r>
+    </w:p>
+    <w:p>
+      <w:pPr>
+        <w:pStyle w:val="Sinespaciado"/>
         <w:rPr>
           <w:color w:val="2F5496" w:themeColor="accent1" w:themeShade="BF"/>
         </w:rPr>
-        <w:t xml:space="preserve">    $this-&gt;conexion-&gt;consulta($consulta);</w:t>
-      </w:r>
-    </w:p>
-    <w:p>
-      <w:pPr>
-        <w:pStyle w:val="Sinespaciado"/>
+      </w:pPr>
+      <w:r>
         <w:rPr>
           <w:color w:val="2F5496" w:themeColor="accent1" w:themeShade="BF"/>
         </w:rPr>
-      </w:pPr>
-      <w:r>
+        <w:t xml:space="preserve">    $encontrados += $resultado['total'];</w:t>
+      </w:r>
+    </w:p>
+    <w:p>
+      <w:pPr>
+        <w:pStyle w:val="Sinespaciado"/>
         <w:rPr>
           <w:color w:val="2F5496" w:themeColor="accent1" w:themeShade="BF"/>
         </w:rPr>
-        <w:t xml:space="preserve">    $resultado = $this-&gt;conexion-&gt;extraer_registro();</w:t>
-      </w:r>
-    </w:p>
-    <w:p>
-      <w:pPr>
-        <w:pStyle w:val="Sinespaciado"/>
+      </w:pPr>
+      <w:r>
         <w:rPr>
           <w:color w:val="2F5496" w:themeColor="accent1" w:themeShade="BF"/>
         </w:rPr>
-      </w:pPr>
-      <w:r>
-        <w:rPr>
-          <w:color w:val="2F5496" w:themeColor="accent1" w:themeShade="BF"/>
-        </w:rPr>
-        <w:t xml:space="preserve">    $encontrados += $resultado['total'];</w:t>
-      </w:r>
-    </w:p>
-    <w:p>
-      <w:pPr>
-        <w:pStyle w:val="Sinespaciado"/>
-        <w:rPr>
-          <w:color w:val="2F5496" w:themeColor="accent1" w:themeShade="BF"/>
-        </w:rPr>
-      </w:pPr>
-      <w:r>
-        <w:rPr>
-          <w:color w:val="2F5496" w:themeColor="accent1" w:themeShade="BF"/>
-        </w:rPr>
         <w:t>}</w:t>
+      </w:r>
+    </w:p>
+    <w:p/>
+    <w:p>
+      <w:r>
+        <w:t>FUNCION INTERESANTE CON ARRAY</w:t>
+      </w:r>
+    </w:p>
+    <w:p>
+      <w:pPr>
+        <w:rPr>
+          <w:b/>
+          <w:bCs/>
+        </w:rPr>
+      </w:pPr>
+      <w:r>
+        <w:t xml:space="preserve">array_map es una función de PHP que aplica una </w:t>
+      </w:r>
+      <w:r>
+        <w:rPr>
+          <w:b/>
+          <w:bCs/>
+        </w:rPr>
+        <w:t>función a cada elemento de un array</w:t>
+      </w:r>
+      <w:r>
+        <w:t xml:space="preserve"> y devuelve un </w:t>
+      </w:r>
+      <w:r>
+        <w:rPr>
+          <w:b/>
+          <w:bCs/>
+        </w:rPr>
+        <w:t>nuevo array con los resultados</w:t>
+      </w:r>
+      <w:r>
+        <w:rPr>
+          <w:b/>
+          <w:bCs/>
+        </w:rPr>
+        <w:t>.</w:t>
+      </w:r>
+    </w:p>
+    <w:p>
+      <w:r>
+        <w:t xml:space="preserve">EJEMPLO: </w:t>
+      </w:r>
+    </w:p>
+    <w:p>
+      <w:pPr>
+        <w:rPr>
+          <w:color w:val="FF0000"/>
+        </w:rPr>
+      </w:pPr>
+      <w:r>
+        <w:rPr>
+          <w:color w:val="FF0000"/>
+        </w:rPr>
+        <w:t>$campos = ['Marca_modelo', 'Matricula', 'Fecha_itv'];</w:t>
+      </w:r>
+    </w:p>
+    <w:p>
+      <w:r>
+        <w:rPr>
+          <w:color w:val="FF0000"/>
+        </w:rPr>
+        <w:t xml:space="preserve">$resultado= </w:t>
+      </w:r>
+      <w:r>
+        <w:rPr>
+          <w:color w:val="FF0000"/>
+        </w:rPr>
+        <w:t>array_map(fn($campo) =&gt; ':' . $campo, $campos)</w:t>
+      </w:r>
+      <w:r>
+        <w:t>;</w:t>
+      </w:r>
+      <w:r>
+        <w:t>//$</w:t>
+      </w:r>
+      <w:r>
+        <w:rPr>
+          <w:color w:val="FF0000"/>
+        </w:rPr>
+        <w:t>campo</w:t>
+      </w:r>
+      <w:r>
+        <w:t xml:space="preserve"> hace referencia a uno de los campos del array, le concatena </w:t>
+      </w:r>
+      <w:r>
+        <w:rPr>
+          <w:color w:val="FF0000"/>
+        </w:rPr>
+        <w:t>:</w:t>
+      </w:r>
+      <w:r>
+        <w:t xml:space="preserve"> a $</w:t>
+      </w:r>
+      <w:r>
+        <w:rPr>
+          <w:color w:val="FF0000"/>
+        </w:rPr>
+        <w:t>campo</w:t>
+      </w:r>
+      <w:r>
+        <w:t>. Array_map lo hace para todos los campos del array y devuelve un nuevo array</w:t>
+      </w:r>
+    </w:p>
+    <w:p>
+      <w:r>
+        <w:rPr>
+          <w:color w:val="FF0000"/>
+        </w:rPr>
+        <w:lastRenderedPageBreak/>
+        <w:t>fn($campo) =&gt; ':' . $camp</w:t>
+      </w:r>
+      <w:r>
+        <w:t xml:space="preserve">o es una </w:t>
+      </w:r>
+      <w:r>
+        <w:rPr>
+          <w:b/>
+          <w:bCs/>
+        </w:rPr>
+        <w:t>función anónima</w:t>
+      </w:r>
+      <w:r>
+        <w:t xml:space="preserve"> (arrow function) que:</w:t>
+      </w:r>
+    </w:p>
+    <w:p>
+      <w:pPr>
+        <w:numPr>
+          <w:ilvl w:val="0"/>
+          <w:numId w:val="10"/>
+        </w:numPr>
+      </w:pPr>
+      <w:r>
+        <w:t>Toma cada elemento del array ($campo)</w:t>
+      </w:r>
+    </w:p>
+    <w:p>
+      <w:pPr>
+        <w:numPr>
+          <w:ilvl w:val="0"/>
+          <w:numId w:val="10"/>
+        </w:numPr>
+      </w:pPr>
+      <w:r>
+        <w:t xml:space="preserve">Le antepone dos puntos : (esto es lo que usan los </w:t>
+      </w:r>
+      <w:r>
+        <w:rPr>
+          <w:i/>
+          <w:iCs/>
+        </w:rPr>
+        <w:t>placeholders</w:t>
+      </w:r>
+      <w:r>
+        <w:t xml:space="preserve"> en consultas preparadas de PDO)</w:t>
+      </w:r>
+    </w:p>
+    <w:p>
+      <w:pPr>
+        <w:numPr>
+          <w:ilvl w:val="0"/>
+          <w:numId w:val="10"/>
+        </w:numPr>
+      </w:pPr>
+      <w:r>
+        <w:t xml:space="preserve">Devuelve el string resultante, como :Marca_modelo, :Matricula, :Fecha_itv, </w:t>
+      </w:r>
+    </w:p>
+    <w:p>
+      <w:r>
+        <w:t>Con este codigo se hace sin usar array_maps</w:t>
+      </w:r>
+    </w:p>
+    <w:p>
+      <w:pPr>
+        <w:pStyle w:val="Sinespaciado"/>
+        <w:rPr>
+          <w:color w:val="FF0000"/>
+        </w:rPr>
+      </w:pPr>
+      <w:r>
+        <w:rPr>
+          <w:color w:val="FF0000"/>
+        </w:rPr>
+        <w:t>$placeholders = [];</w:t>
+      </w:r>
+    </w:p>
+    <w:p>
+      <w:pPr>
+        <w:pStyle w:val="Sinespaciado"/>
+        <w:rPr>
+          <w:color w:val="FF0000"/>
+        </w:rPr>
+      </w:pPr>
+      <w:r>
+        <w:rPr>
+          <w:color w:val="FF0000"/>
+        </w:rPr>
+        <w:t>foreach ($campos as $campo) {</w:t>
+      </w:r>
+    </w:p>
+    <w:p>
+      <w:pPr>
+        <w:pStyle w:val="Sinespaciado"/>
+        <w:rPr>
+          <w:color w:val="FF0000"/>
+        </w:rPr>
+      </w:pPr>
+      <w:r>
+        <w:rPr>
+          <w:color w:val="FF0000"/>
+        </w:rPr>
+        <w:t xml:space="preserve">    $placeholders[] = ':' . $campo;</w:t>
+      </w:r>
+    </w:p>
+    <w:p>
+      <w:pPr>
+        <w:pStyle w:val="Sinespaciado"/>
+        <w:rPr>
+          <w:color w:val="FF0000"/>
+        </w:rPr>
+      </w:pPr>
+      <w:r>
+        <w:rPr>
+          <w:color w:val="FF0000"/>
+        </w:rPr>
+        <w:t>}</w:t>
+      </w:r>
+    </w:p>
+    <w:p>
+      <w:r>
+        <w:t>Aquí hay mas ejemplos de uso:</w:t>
+      </w:r>
+    </w:p>
+    <w:p>
+      <w:pPr>
+        <w:pStyle w:val="Sinespaciado"/>
+      </w:pPr>
+      <w:r>
+        <w:rPr>
+          <w:rFonts w:ascii="Segoe UI Emoji" w:hAnsi="Segoe UI Emoji" w:cs="Segoe UI Emoji"/>
+        </w:rPr>
+        <w:t>✅</w:t>
+      </w:r>
+      <w:r>
+        <w:t xml:space="preserve"> Ejemplo 1: Convertir todos los nombres a mayúsculas</w:t>
+      </w:r>
+      <w:r>
+        <w:t>$nombres = ['juan', 'maria', 'carlos'];</w:t>
+      </w:r>
+    </w:p>
+    <w:p>
+      <w:pPr>
+        <w:pStyle w:val="Sinespaciado"/>
+      </w:pPr>
+    </w:p>
+    <w:p>
+      <w:pPr>
+        <w:pStyle w:val="Sinespaciado"/>
+        <w:rPr>
+          <w:color w:val="FF0000"/>
+        </w:rPr>
+      </w:pPr>
+      <w:r>
+        <w:rPr>
+          <w:color w:val="FF0000"/>
+        </w:rPr>
+        <w:t>$mayusculas = array_map('strtoupper', $nombres);</w:t>
+      </w:r>
+    </w:p>
+    <w:p>
+      <w:pPr>
+        <w:pStyle w:val="Sinespaciado"/>
+        <w:rPr>
+          <w:color w:val="FF0000"/>
+        </w:rPr>
+      </w:pPr>
+      <w:r>
+        <w:rPr>
+          <w:color w:val="FF0000"/>
+        </w:rPr>
+        <w:t>print_r($mayusculas);</w:t>
+      </w:r>
+    </w:p>
+    <w:p>
+      <w:pPr>
+        <w:pStyle w:val="Sinespaciado"/>
+      </w:pPr>
+      <w:r>
+        <w:t>Array</w:t>
+      </w:r>
+    </w:p>
+    <w:p>
+      <w:pPr>
+        <w:pStyle w:val="Sinespaciado"/>
+      </w:pPr>
+      <w:r>
+        <w:t>(</w:t>
+      </w:r>
+    </w:p>
+    <w:p>
+      <w:pPr>
+        <w:pStyle w:val="Sinespaciado"/>
+      </w:pPr>
+      <w:r>
+        <w:t xml:space="preserve">    [0] =&gt; JUAN</w:t>
+      </w:r>
+    </w:p>
+    <w:p>
+      <w:pPr>
+        <w:pStyle w:val="Sinespaciado"/>
+      </w:pPr>
+      <w:r>
+        <w:t xml:space="preserve">    [1] =&gt; MARIA</w:t>
+      </w:r>
+    </w:p>
+    <w:p>
+      <w:pPr>
+        <w:pStyle w:val="Sinespaciado"/>
+      </w:pPr>
+      <w:r>
+        <w:t xml:space="preserve">    [2] =&gt; CARLOS</w:t>
+      </w:r>
+    </w:p>
+    <w:p>
+      <w:pPr>
+        <w:pStyle w:val="Sinespaciado"/>
+      </w:pPr>
+      <w:r>
+        <w:t>)</w:t>
+      </w:r>
+    </w:p>
+    <w:p>
+      <w:pPr>
+        <w:pStyle w:val="Sinespaciado"/>
+      </w:pPr>
+      <w:r>
+        <w:rPr>
+          <w:rFonts w:ascii="Segoe UI Emoji" w:hAnsi="Segoe UI Emoji" w:cs="Segoe UI Emoji"/>
+        </w:rPr>
+        <w:t>✅</w:t>
+      </w:r>
+      <w:r>
+        <w:t xml:space="preserve"> Ejemplo 2: Multiplicar todos los números por 2</w:t>
+      </w:r>
+    </w:p>
+    <w:p>
+      <w:pPr>
+        <w:pStyle w:val="Sinespaciado"/>
+        <w:rPr>
+          <w:color w:val="FF0000"/>
+        </w:rPr>
+      </w:pPr>
+      <w:r>
+        <w:rPr>
+          <w:color w:val="FF0000"/>
+        </w:rPr>
+        <w:t>$numeros = [1, 2, 3, 4, 5];</w:t>
+      </w:r>
+    </w:p>
+    <w:p>
+      <w:pPr>
+        <w:pStyle w:val="Sinespaciado"/>
+        <w:rPr>
+          <w:color w:val="FF0000"/>
+        </w:rPr>
+      </w:pPr>
+      <w:r>
+        <w:rPr>
+          <w:color w:val="FF0000"/>
+        </w:rPr>
+        <w:t>$dobles = array_map(fn($n) =&gt; $n * 2, $numeros);</w:t>
+      </w:r>
+    </w:p>
+    <w:p>
+      <w:pPr>
+        <w:pStyle w:val="Sinespaciado"/>
+      </w:pPr>
+    </w:p>
+    <w:p>
+      <w:pPr>
+        <w:pStyle w:val="Sinespaciado"/>
+      </w:pPr>
+      <w:r>
+        <w:t>print_r($dobles);</w:t>
+      </w:r>
+    </w:p>
+    <w:p>
+      <w:pPr>
+        <w:pStyle w:val="Sinespaciado"/>
+      </w:pPr>
+      <w:r>
+        <w:t>Array</w:t>
+      </w:r>
+    </w:p>
+    <w:p>
+      <w:pPr>
+        <w:pStyle w:val="Sinespaciado"/>
+      </w:pPr>
+      <w:r>
+        <w:t>(</w:t>
+      </w:r>
+    </w:p>
+    <w:p>
+      <w:pPr>
+        <w:pStyle w:val="Sinespaciado"/>
+      </w:pPr>
+      <w:r>
+        <w:t xml:space="preserve">    [0] =&gt; 2</w:t>
+      </w:r>
+    </w:p>
+    <w:p>
+      <w:pPr>
+        <w:pStyle w:val="Sinespaciado"/>
+      </w:pPr>
+      <w:r>
+        <w:t xml:space="preserve">    [1] =&gt; 4</w:t>
+      </w:r>
+    </w:p>
+    <w:p>
+      <w:pPr>
+        <w:pStyle w:val="Sinespaciado"/>
+      </w:pPr>
+      <w:r>
+        <w:t xml:space="preserve">    [2] =&gt; 6</w:t>
+      </w:r>
+    </w:p>
+    <w:p>
+      <w:pPr>
+        <w:pStyle w:val="Sinespaciado"/>
+      </w:pPr>
+      <w:r>
+        <w:t xml:space="preserve">    [3] =&gt; 8</w:t>
+      </w:r>
+    </w:p>
+    <w:p>
+      <w:pPr>
+        <w:pStyle w:val="Sinespaciado"/>
+      </w:pPr>
+      <w:r>
+        <w:t xml:space="preserve">    [4] =&gt; 10</w:t>
+      </w:r>
+    </w:p>
+    <w:p>
+      <w:pPr>
+        <w:pStyle w:val="Sinespaciado"/>
+      </w:pPr>
+      <w:r>
+        <w:lastRenderedPageBreak/>
+        <w:t>)</w:t>
+      </w:r>
+    </w:p>
+    <w:p>
+      <w:pPr>
+        <w:pStyle w:val="Sinespaciado"/>
+      </w:pPr>
+      <w:r>
+        <w:rPr>
+          <w:rFonts w:ascii="Segoe UI Emoji" w:hAnsi="Segoe UI Emoji" w:cs="Segoe UI Emoji"/>
+        </w:rPr>
+        <w:t>✅</w:t>
+      </w:r>
+      <w:r>
+        <w:t xml:space="preserve"> Ejemplo 3: Añadir un prefijo a un array de correos</w:t>
+      </w:r>
+    </w:p>
+    <w:p>
+      <w:pPr>
+        <w:pStyle w:val="Sinespaciado"/>
+        <w:rPr>
+          <w:color w:val="FF0000"/>
+        </w:rPr>
+      </w:pPr>
+      <w:r>
+        <w:rPr>
+          <w:color w:val="FF0000"/>
+        </w:rPr>
+        <w:t>$usuarios = ['ana', 'luis', 'marco'];</w:t>
+      </w:r>
+    </w:p>
+    <w:p>
+      <w:pPr>
+        <w:pStyle w:val="Sinespaciado"/>
+        <w:rPr>
+          <w:color w:val="FF0000"/>
+        </w:rPr>
+      </w:pPr>
+      <w:r>
+        <w:rPr>
+          <w:color w:val="FF0000"/>
+        </w:rPr>
+        <w:t>$emails = array_map(fn($usuario) =&gt; $usuario . '@ejemplo.com', $usuarios);</w:t>
+      </w:r>
+    </w:p>
+    <w:p>
+      <w:pPr>
+        <w:pStyle w:val="Sinespaciado"/>
+        <w:rPr>
+          <w:color w:val="FF0000"/>
+        </w:rPr>
+      </w:pPr>
+      <w:r>
+        <w:rPr>
+          <w:color w:val="FF0000"/>
+        </w:rPr>
+        <w:t>print_r($emails);</w:t>
+      </w:r>
+    </w:p>
+    <w:p>
+      <w:pPr>
+        <w:pStyle w:val="Sinespaciado"/>
+      </w:pPr>
+      <w:r>
+        <w:t>Array</w:t>
+      </w:r>
+    </w:p>
+    <w:p>
+      <w:pPr>
+        <w:pStyle w:val="Sinespaciado"/>
+      </w:pPr>
+      <w:r>
+        <w:t>(</w:t>
+      </w:r>
+    </w:p>
+    <w:p>
+      <w:pPr>
+        <w:pStyle w:val="Sinespaciado"/>
+      </w:pPr>
+      <w:r>
+        <w:t xml:space="preserve">    [0] =&gt; ana@ejemplo.com</w:t>
+      </w:r>
+    </w:p>
+    <w:p>
+      <w:pPr>
+        <w:pStyle w:val="Sinespaciado"/>
+      </w:pPr>
+      <w:r>
+        <w:t xml:space="preserve">    [1] =&gt; luis@ejemplo.com</w:t>
+      </w:r>
+    </w:p>
+    <w:p>
+      <w:pPr>
+        <w:pStyle w:val="Sinespaciado"/>
+      </w:pPr>
+      <w:r>
+        <w:t xml:space="preserve">    [2] =&gt; marco@ejemplo.com</w:t>
+      </w:r>
+    </w:p>
+    <w:p>
+      <w:pPr>
+        <w:pStyle w:val="Sinespaciado"/>
+      </w:pPr>
+      <w:r>
+        <w:t>)</w:t>
+      </w:r>
+    </w:p>
+    <w:p>
+      <w:pPr>
+        <w:pStyle w:val="Sinespaciado"/>
+      </w:pPr>
+      <w:r>
+        <w:rPr>
+          <w:rFonts w:ascii="Segoe UI Emoji" w:hAnsi="Segoe UI Emoji" w:cs="Segoe UI Emoji"/>
+        </w:rPr>
+        <w:t>✅</w:t>
+      </w:r>
+      <w:r>
+        <w:t xml:space="preserve"> Ejemplo 4: Usar array_map con múltiples arrays</w:t>
+      </w:r>
+    </w:p>
+    <w:p>
+      <w:pPr>
+        <w:pStyle w:val="Sinespaciado"/>
+        <w:rPr>
+          <w:color w:val="FF0000"/>
+        </w:rPr>
+      </w:pPr>
+      <w:r>
+        <w:rPr>
+          <w:color w:val="FF0000"/>
+        </w:rPr>
+        <w:t>$nombres = ['juan', 'maria', 'pablo'];</w:t>
+      </w:r>
+    </w:p>
+    <w:p>
+      <w:pPr>
+        <w:pStyle w:val="Sinespaciado"/>
+        <w:rPr>
+          <w:color w:val="FF0000"/>
+        </w:rPr>
+      </w:pPr>
+      <w:r>
+        <w:rPr>
+          <w:color w:val="FF0000"/>
+        </w:rPr>
+        <w:t>$edades = [20, 25, 30];</w:t>
+      </w:r>
+    </w:p>
+    <w:p>
+      <w:pPr>
+        <w:pStyle w:val="Sinespaciado"/>
+      </w:pPr>
+    </w:p>
+    <w:p>
+      <w:pPr>
+        <w:pStyle w:val="Sinespaciado"/>
+        <w:rPr>
+          <w:color w:val="FF0000"/>
+        </w:rPr>
+      </w:pPr>
+      <w:r>
+        <w:rPr>
+          <w:color w:val="FF0000"/>
+        </w:rPr>
+        <w:t>$datos = array_map(function($nombre, $edad) {</w:t>
+      </w:r>
+    </w:p>
+    <w:p>
+      <w:pPr>
+        <w:pStyle w:val="Sinespaciado"/>
+        <w:rPr>
+          <w:color w:val="FF0000"/>
+        </w:rPr>
+      </w:pPr>
+      <w:r>
+        <w:rPr>
+          <w:color w:val="FF0000"/>
+        </w:rPr>
+        <w:t xml:space="preserve">    return "$nombre tiene $edad años";</w:t>
+      </w:r>
+    </w:p>
+    <w:p>
+      <w:pPr>
+        <w:pStyle w:val="Sinespaciado"/>
+        <w:rPr>
+          <w:color w:val="FF0000"/>
+        </w:rPr>
+      </w:pPr>
+      <w:r>
+        <w:rPr>
+          <w:color w:val="FF0000"/>
+        </w:rPr>
+        <w:t>}, $nombres, $edades);</w:t>
+      </w:r>
+    </w:p>
+    <w:p>
+      <w:pPr>
+        <w:pStyle w:val="Sinespaciado"/>
+        <w:rPr>
+          <w:color w:val="FF0000"/>
+        </w:rPr>
+      </w:pPr>
+    </w:p>
+    <w:p>
+      <w:pPr>
+        <w:pStyle w:val="Sinespaciado"/>
+        <w:rPr>
+          <w:color w:val="FF0000"/>
+        </w:rPr>
+      </w:pPr>
+      <w:r>
+        <w:rPr>
+          <w:color w:val="FF0000"/>
+        </w:rPr>
+        <w:t>print_r($datos);</w:t>
+      </w:r>
+    </w:p>
+    <w:p>
+      <w:pPr>
+        <w:pStyle w:val="Sinespaciado"/>
+      </w:pPr>
+      <w:r>
+        <w:t>Array</w:t>
+      </w:r>
+    </w:p>
+    <w:p>
+      <w:pPr>
+        <w:pStyle w:val="Sinespaciado"/>
+      </w:pPr>
+      <w:r>
+        <w:t>(</w:t>
+      </w:r>
+    </w:p>
+    <w:p>
+      <w:pPr>
+        <w:pStyle w:val="Sinespaciado"/>
+      </w:pPr>
+      <w:r>
+        <w:t xml:space="preserve">    [0] =&gt; juan tiene 20 años</w:t>
+      </w:r>
+    </w:p>
+    <w:p>
+      <w:pPr>
+        <w:pStyle w:val="Sinespaciado"/>
+      </w:pPr>
+      <w:r>
+        <w:t xml:space="preserve">    [1] =&gt; maria tiene 25 años</w:t>
+      </w:r>
+    </w:p>
+    <w:p>
+      <w:pPr>
+        <w:pStyle w:val="Sinespaciado"/>
+      </w:pPr>
+      <w:r>
+        <w:t xml:space="preserve">    [2] =&gt; pablo tiene 30 años</w:t>
+      </w:r>
+    </w:p>
+    <w:p>
+      <w:pPr>
+        <w:pStyle w:val="Sinespaciado"/>
+      </w:pPr>
+      <w:r>
+        <w:t>)</w:t>
       </w:r>
     </w:p>
     <w:p/>
@@ -9864,9 +10599,9 @@
 <file path=word/numbering.xml><?xml version="1.0" encoding="utf-8"?>
 <w:numbering xmlns:wpc="http://schemas.microsoft.com/office/word/2010/wordprocessingCanvas" xmlns:cx="http://schemas.microsoft.com/office/drawing/2014/chartex" xmlns:cx1="http://schemas.microsoft.com/office/drawing/2015/9/8/chartex" xmlns:cx2="http://schemas.microsoft.com/office/drawing/2015/10/21/chartex" xmlns:cx3="http://schemas.microsoft.com/office/drawing/2016/5/9/chartex" xmlns:cx4="http://schemas.microsoft.com/office/drawing/2016/5/10/chartex" xmlns:cx5="http://schemas.microsoft.com/office/drawing/2016/5/11/chartex" xmlns:cx6="http://schemas.microsoft.com/office/drawing/2016/5/12/chartex" xmlns:cx7="http://schemas.microsoft.com/office/drawing/2016/5/13/chartex" xmlns:cx8="http://schemas.microsoft.com/office/drawing/2016/5/14/chartex" xmlns:mc="http://schemas.openxmlformats.org/markup-compatibility/2006" xmlns:aink="http://schemas.microsoft.com/office/drawing/2016/ink" xmlns:am3d="http://schemas.microsoft.com/office/drawing/2017/model3d" xmlns:o="urn:schemas-microsoft-com:office:office" xmlns:oel="http://schemas.microsoft.com/office/2019/extlst" xmlns:r="http://schemas.openxmlformats.org/officeDocument/2006/relationships" xmlns:m="http://schemas.openxmlformats.org/officeDocument/2006/math" xmlns:v="urn:schemas-microsoft-com:vml" xmlns:wp14="http://schemas.microsoft.com/office/word/2010/wordprocessingDrawing" xmlns:wp="http://schemas.openxmlformats.org/drawingml/2006/wordprocessingDrawing" xmlns:w10="urn:schemas-microsoft-com:office:word" xmlns:w="http://schemas.openxmlformats.org/wordprocessingml/2006/main" xmlns:w14="http://schemas.microsoft.com/office/word/2010/wordml" xmlns:w15="http://schemas.microsoft.com/office/word/2012/wordml" xmlns:w16cex="http://schemas.microsoft.com/office/word/2018/wordml/cex" xmlns:w16cid="http://schemas.microsoft.com/office/word/2016/wordml/cid" xmlns:w16="http://schemas.microsoft.com/office/word/2018/wordml" xmlns:w16du="http://schemas.microsoft.com/office/word/2023/wordml/word16du" xmlns:w16sdtdh="http://schemas.microsoft.com/office/word/2020/wordml/sdtdatahash" xmlns:w16sdtfl="http://schemas.microsoft.com/office/word/2024/wordml/sdtformatlock" xmlns:w16se="http://schemas.microsoft.com/office/word/2015/wordml/symex" xmlns:wpg="http://schemas.microsoft.com/office/word/2010/wordprocessingGroup" xmlns:wpi="http://schemas.microsoft.com/office/word/2010/wordprocessingInk" xmlns:wne="http://schemas.microsoft.com/office/word/2006/wordml" xmlns:wps="http://schemas.microsoft.com/office/word/2010/wordprocessingShape" mc:Ignorable="w14 w15 w16se w16cid w16 w16cex w16sdtdh w16sdtfl w16du wp14">
   <w:abstractNum w:abstractNumId="0" w15:restartNumberingAfterBreak="0">
-    <w:nsid w:val="0E5B7748"/>
+    <w:nsid w:val="0C1E0381"/>
     <w:multiLevelType w:val="multilevel"/>
-    <w:tmpl w:val="28965F00"/>
+    <w:tmpl w:val="5756DB1E"/>
     <w:lvl w:ilvl="0">
       <w:start w:val="1"/>
       <w:numFmt w:val="bullet"/>
@@ -10013,9 +10748,9 @@
     </w:lvl>
   </w:abstractNum>
   <w:abstractNum w:abstractNumId="1" w15:restartNumberingAfterBreak="0">
-    <w:nsid w:val="100B22EF"/>
+    <w:nsid w:val="0E5B7748"/>
     <w:multiLevelType w:val="multilevel"/>
-    <w:tmpl w:val="FFFFFFFF"/>
+    <w:tmpl w:val="28965F00"/>
     <w:lvl w:ilvl="0">
       <w:start w:val="1"/>
       <w:numFmt w:val="bullet"/>
@@ -10162,9 +10897,9 @@
     </w:lvl>
   </w:abstractNum>
   <w:abstractNum w:abstractNumId="2" w15:restartNumberingAfterBreak="0">
-    <w:nsid w:val="13B705ED"/>
+    <w:nsid w:val="100B22EF"/>
     <w:multiLevelType w:val="multilevel"/>
-    <w:tmpl w:val="28965F00"/>
+    <w:tmpl w:val="FFFFFFFF"/>
     <w:lvl w:ilvl="0">
       <w:start w:val="1"/>
       <w:numFmt w:val="bullet"/>
@@ -10311,300 +11046,9 @@
     </w:lvl>
   </w:abstractNum>
   <w:abstractNum w:abstractNumId="3" w15:restartNumberingAfterBreak="0">
-    <w:nsid w:val="23855272"/>
-    <w:multiLevelType w:val="hybridMultilevel"/>
-    <w:tmpl w:val="2EAAB886"/>
-    <w:lvl w:ilvl="0" w:tplc="0C0A0001">
-      <w:start w:val="1"/>
-      <w:numFmt w:val="bullet"/>
-      <w:lvlText w:val=""/>
-      <w:lvlJc w:val="left"/>
-      <w:pPr>
-        <w:ind w:left="720" w:hanging="360"/>
-      </w:pPr>
-      <w:rPr>
-        <w:rFonts w:ascii="Symbol" w:hAnsi="Symbol" w:hint="default"/>
-      </w:rPr>
-    </w:lvl>
-    <w:lvl w:ilvl="1" w:tplc="0C0A0003" w:tentative="1">
-      <w:start w:val="1"/>
-      <w:numFmt w:val="bullet"/>
-      <w:lvlText w:val="o"/>
-      <w:lvlJc w:val="left"/>
-      <w:pPr>
-        <w:ind w:left="1440" w:hanging="360"/>
-      </w:pPr>
-      <w:rPr>
-        <w:rFonts w:ascii="Courier New" w:hAnsi="Courier New" w:cs="Courier New" w:hint="default"/>
-      </w:rPr>
-    </w:lvl>
-    <w:lvl w:ilvl="2" w:tplc="0C0A0005" w:tentative="1">
-      <w:start w:val="1"/>
-      <w:numFmt w:val="bullet"/>
-      <w:lvlText w:val=""/>
-      <w:lvlJc w:val="left"/>
-      <w:pPr>
-        <w:ind w:left="2160" w:hanging="360"/>
-      </w:pPr>
-      <w:rPr>
-        <w:rFonts w:ascii="Wingdings" w:hAnsi="Wingdings" w:hint="default"/>
-      </w:rPr>
-    </w:lvl>
-    <w:lvl w:ilvl="3" w:tplc="0C0A0001" w:tentative="1">
-      <w:start w:val="1"/>
-      <w:numFmt w:val="bullet"/>
-      <w:lvlText w:val=""/>
-      <w:lvlJc w:val="left"/>
-      <w:pPr>
-        <w:ind w:left="2880" w:hanging="360"/>
-      </w:pPr>
-      <w:rPr>
-        <w:rFonts w:ascii="Symbol" w:hAnsi="Symbol" w:hint="default"/>
-      </w:rPr>
-    </w:lvl>
-    <w:lvl w:ilvl="4" w:tplc="0C0A0003" w:tentative="1">
-      <w:start w:val="1"/>
-      <w:numFmt w:val="bullet"/>
-      <w:lvlText w:val="o"/>
-      <w:lvlJc w:val="left"/>
-      <w:pPr>
-        <w:ind w:left="3600" w:hanging="360"/>
-      </w:pPr>
-      <w:rPr>
-        <w:rFonts w:ascii="Courier New" w:hAnsi="Courier New" w:cs="Courier New" w:hint="default"/>
-      </w:rPr>
-    </w:lvl>
-    <w:lvl w:ilvl="5" w:tplc="0C0A0005" w:tentative="1">
-      <w:start w:val="1"/>
-      <w:numFmt w:val="bullet"/>
-      <w:lvlText w:val=""/>
-      <w:lvlJc w:val="left"/>
-      <w:pPr>
-        <w:ind w:left="4320" w:hanging="360"/>
-      </w:pPr>
-      <w:rPr>
-        <w:rFonts w:ascii="Wingdings" w:hAnsi="Wingdings" w:hint="default"/>
-      </w:rPr>
-    </w:lvl>
-    <w:lvl w:ilvl="6" w:tplc="0C0A0001" w:tentative="1">
-      <w:start w:val="1"/>
-      <w:numFmt w:val="bullet"/>
-      <w:lvlText w:val=""/>
-      <w:lvlJc w:val="left"/>
-      <w:pPr>
-        <w:ind w:left="5040" w:hanging="360"/>
-      </w:pPr>
-      <w:rPr>
-        <w:rFonts w:ascii="Symbol" w:hAnsi="Symbol" w:hint="default"/>
-      </w:rPr>
-    </w:lvl>
-    <w:lvl w:ilvl="7" w:tplc="0C0A0003" w:tentative="1">
-      <w:start w:val="1"/>
-      <w:numFmt w:val="bullet"/>
-      <w:lvlText w:val="o"/>
-      <w:lvlJc w:val="left"/>
-      <w:pPr>
-        <w:ind w:left="5760" w:hanging="360"/>
-      </w:pPr>
-      <w:rPr>
-        <w:rFonts w:ascii="Courier New" w:hAnsi="Courier New" w:cs="Courier New" w:hint="default"/>
-      </w:rPr>
-    </w:lvl>
-    <w:lvl w:ilvl="8" w:tplc="0C0A0005" w:tentative="1">
-      <w:start w:val="1"/>
-      <w:numFmt w:val="bullet"/>
-      <w:lvlText w:val=""/>
-      <w:lvlJc w:val="left"/>
-      <w:pPr>
-        <w:ind w:left="6480" w:hanging="360"/>
-      </w:pPr>
-      <w:rPr>
-        <w:rFonts w:ascii="Wingdings" w:hAnsi="Wingdings" w:hint="default"/>
-      </w:rPr>
-    </w:lvl>
-  </w:abstractNum>
-  <w:abstractNum w:abstractNumId="4" w15:restartNumberingAfterBreak="0">
-    <w:nsid w:val="2EFB02CA"/>
-    <w:multiLevelType w:val="hybridMultilevel"/>
-    <w:tmpl w:val="4E687C9E"/>
-    <w:lvl w:ilvl="0" w:tplc="0C0A000F">
-      <w:start w:val="1"/>
-      <w:numFmt w:val="decimal"/>
-      <w:lvlText w:val="%1."/>
-      <w:lvlJc w:val="left"/>
-      <w:pPr>
-        <w:ind w:left="360" w:hanging="360"/>
-      </w:pPr>
-      <w:rPr>
-        <w:rFonts w:hint="default"/>
-      </w:rPr>
-    </w:lvl>
-    <w:lvl w:ilvl="1" w:tplc="0C0A0019" w:tentative="1">
-      <w:start w:val="1"/>
-      <w:numFmt w:val="lowerLetter"/>
-      <w:lvlText w:val="%2."/>
-      <w:lvlJc w:val="left"/>
-      <w:pPr>
-        <w:ind w:left="1080" w:hanging="360"/>
-      </w:pPr>
-    </w:lvl>
-    <w:lvl w:ilvl="2" w:tplc="0C0A001B" w:tentative="1">
-      <w:start w:val="1"/>
-      <w:numFmt w:val="lowerRoman"/>
-      <w:lvlText w:val="%3."/>
-      <w:lvlJc w:val="right"/>
-      <w:pPr>
-        <w:ind w:left="1800" w:hanging="180"/>
-      </w:pPr>
-    </w:lvl>
-    <w:lvl w:ilvl="3" w:tplc="0C0A000F" w:tentative="1">
-      <w:start w:val="1"/>
-      <w:numFmt w:val="decimal"/>
-      <w:lvlText w:val="%4."/>
-      <w:lvlJc w:val="left"/>
-      <w:pPr>
-        <w:ind w:left="2520" w:hanging="360"/>
-      </w:pPr>
-    </w:lvl>
-    <w:lvl w:ilvl="4" w:tplc="0C0A0019" w:tentative="1">
-      <w:start w:val="1"/>
-      <w:numFmt w:val="lowerLetter"/>
-      <w:lvlText w:val="%5."/>
-      <w:lvlJc w:val="left"/>
-      <w:pPr>
-        <w:ind w:left="3240" w:hanging="360"/>
-      </w:pPr>
-    </w:lvl>
-    <w:lvl w:ilvl="5" w:tplc="0C0A001B" w:tentative="1">
-      <w:start w:val="1"/>
-      <w:numFmt w:val="lowerRoman"/>
-      <w:lvlText w:val="%6."/>
-      <w:lvlJc w:val="right"/>
-      <w:pPr>
-        <w:ind w:left="3960" w:hanging="180"/>
-      </w:pPr>
-    </w:lvl>
-    <w:lvl w:ilvl="6" w:tplc="0C0A000F" w:tentative="1">
-      <w:start w:val="1"/>
-      <w:numFmt w:val="decimal"/>
-      <w:lvlText w:val="%7."/>
-      <w:lvlJc w:val="left"/>
-      <w:pPr>
-        <w:ind w:left="4680" w:hanging="360"/>
-      </w:pPr>
-    </w:lvl>
-    <w:lvl w:ilvl="7" w:tplc="0C0A0019" w:tentative="1">
-      <w:start w:val="1"/>
-      <w:numFmt w:val="lowerLetter"/>
-      <w:lvlText w:val="%8."/>
-      <w:lvlJc w:val="left"/>
-      <w:pPr>
-        <w:ind w:left="5400" w:hanging="360"/>
-      </w:pPr>
-    </w:lvl>
-    <w:lvl w:ilvl="8" w:tplc="0C0A001B" w:tentative="1">
-      <w:start w:val="1"/>
-      <w:numFmt w:val="lowerRoman"/>
-      <w:lvlText w:val="%9."/>
-      <w:lvlJc w:val="right"/>
-      <w:pPr>
-        <w:ind w:left="6120" w:hanging="180"/>
-      </w:pPr>
-    </w:lvl>
-  </w:abstractNum>
-  <w:abstractNum w:abstractNumId="5" w15:restartNumberingAfterBreak="0">
-    <w:nsid w:val="3F4D3A17"/>
-    <w:multiLevelType w:val="hybridMultilevel"/>
-    <w:tmpl w:val="52B8E63E"/>
-    <w:lvl w:ilvl="0" w:tplc="0C0A0015">
-      <w:start w:val="1"/>
-      <w:numFmt w:val="upperLetter"/>
-      <w:lvlText w:val="%1."/>
-      <w:lvlJc w:val="left"/>
-      <w:pPr>
-        <w:ind w:left="720" w:hanging="360"/>
-      </w:pPr>
-      <w:rPr>
-        <w:rFonts w:hint="default"/>
-      </w:rPr>
-    </w:lvl>
-    <w:lvl w:ilvl="1" w:tplc="0C0A0019" w:tentative="1">
-      <w:start w:val="1"/>
-      <w:numFmt w:val="lowerLetter"/>
-      <w:lvlText w:val="%2."/>
-      <w:lvlJc w:val="left"/>
-      <w:pPr>
-        <w:ind w:left="1440" w:hanging="360"/>
-      </w:pPr>
-    </w:lvl>
-    <w:lvl w:ilvl="2" w:tplc="0C0A001B" w:tentative="1">
-      <w:start w:val="1"/>
-      <w:numFmt w:val="lowerRoman"/>
-      <w:lvlText w:val="%3."/>
-      <w:lvlJc w:val="right"/>
-      <w:pPr>
-        <w:ind w:left="2160" w:hanging="180"/>
-      </w:pPr>
-    </w:lvl>
-    <w:lvl w:ilvl="3" w:tplc="0C0A000F" w:tentative="1">
-      <w:start w:val="1"/>
-      <w:numFmt w:val="decimal"/>
-      <w:lvlText w:val="%4."/>
-      <w:lvlJc w:val="left"/>
-      <w:pPr>
-        <w:ind w:left="2880" w:hanging="360"/>
-      </w:pPr>
-    </w:lvl>
-    <w:lvl w:ilvl="4" w:tplc="0C0A0019" w:tentative="1">
-      <w:start w:val="1"/>
-      <w:numFmt w:val="lowerLetter"/>
-      <w:lvlText w:val="%5."/>
-      <w:lvlJc w:val="left"/>
-      <w:pPr>
-        <w:ind w:left="3600" w:hanging="360"/>
-      </w:pPr>
-    </w:lvl>
-    <w:lvl w:ilvl="5" w:tplc="0C0A001B" w:tentative="1">
-      <w:start w:val="1"/>
-      <w:numFmt w:val="lowerRoman"/>
-      <w:lvlText w:val="%6."/>
-      <w:lvlJc w:val="right"/>
-      <w:pPr>
-        <w:ind w:left="4320" w:hanging="180"/>
-      </w:pPr>
-    </w:lvl>
-    <w:lvl w:ilvl="6" w:tplc="0C0A000F" w:tentative="1">
-      <w:start w:val="1"/>
-      <w:numFmt w:val="decimal"/>
-      <w:lvlText w:val="%7."/>
-      <w:lvlJc w:val="left"/>
-      <w:pPr>
-        <w:ind w:left="5040" w:hanging="360"/>
-      </w:pPr>
-    </w:lvl>
-    <w:lvl w:ilvl="7" w:tplc="0C0A0019" w:tentative="1">
-      <w:start w:val="1"/>
-      <w:numFmt w:val="lowerLetter"/>
-      <w:lvlText w:val="%8."/>
-      <w:lvlJc w:val="left"/>
-      <w:pPr>
-        <w:ind w:left="5760" w:hanging="360"/>
-      </w:pPr>
-    </w:lvl>
-    <w:lvl w:ilvl="8" w:tplc="0C0A001B" w:tentative="1">
-      <w:start w:val="1"/>
-      <w:numFmt w:val="lowerRoman"/>
-      <w:lvlText w:val="%9."/>
-      <w:lvlJc w:val="right"/>
-      <w:pPr>
-        <w:ind w:left="6480" w:hanging="180"/>
-      </w:pPr>
-    </w:lvl>
-  </w:abstractNum>
-  <w:abstractNum w:abstractNumId="6" w15:restartNumberingAfterBreak="0">
-    <w:nsid w:val="6DBD3631"/>
+    <w:nsid w:val="13B705ED"/>
     <w:multiLevelType w:val="multilevel"/>
-    <w:tmpl w:val="62ACF0FE"/>
+    <w:tmpl w:val="28965F00"/>
     <w:lvl w:ilvl="0">
       <w:start w:val="1"/>
       <w:numFmt w:val="bullet"/>
@@ -10750,10 +11194,301 @@
       </w:rPr>
     </w:lvl>
   </w:abstractNum>
+  <w:abstractNum w:abstractNumId="4" w15:restartNumberingAfterBreak="0">
+    <w:nsid w:val="23855272"/>
+    <w:multiLevelType w:val="hybridMultilevel"/>
+    <w:tmpl w:val="2EAAB886"/>
+    <w:lvl w:ilvl="0" w:tplc="0C0A0001">
+      <w:start w:val="1"/>
+      <w:numFmt w:val="bullet"/>
+      <w:lvlText w:val=""/>
+      <w:lvlJc w:val="left"/>
+      <w:pPr>
+        <w:ind w:left="720" w:hanging="360"/>
+      </w:pPr>
+      <w:rPr>
+        <w:rFonts w:ascii="Symbol" w:hAnsi="Symbol" w:hint="default"/>
+      </w:rPr>
+    </w:lvl>
+    <w:lvl w:ilvl="1" w:tplc="0C0A0003" w:tentative="1">
+      <w:start w:val="1"/>
+      <w:numFmt w:val="bullet"/>
+      <w:lvlText w:val="o"/>
+      <w:lvlJc w:val="left"/>
+      <w:pPr>
+        <w:ind w:left="1440" w:hanging="360"/>
+      </w:pPr>
+      <w:rPr>
+        <w:rFonts w:ascii="Courier New" w:hAnsi="Courier New" w:cs="Courier New" w:hint="default"/>
+      </w:rPr>
+    </w:lvl>
+    <w:lvl w:ilvl="2" w:tplc="0C0A0005" w:tentative="1">
+      <w:start w:val="1"/>
+      <w:numFmt w:val="bullet"/>
+      <w:lvlText w:val=""/>
+      <w:lvlJc w:val="left"/>
+      <w:pPr>
+        <w:ind w:left="2160" w:hanging="360"/>
+      </w:pPr>
+      <w:rPr>
+        <w:rFonts w:ascii="Wingdings" w:hAnsi="Wingdings" w:hint="default"/>
+      </w:rPr>
+    </w:lvl>
+    <w:lvl w:ilvl="3" w:tplc="0C0A0001" w:tentative="1">
+      <w:start w:val="1"/>
+      <w:numFmt w:val="bullet"/>
+      <w:lvlText w:val=""/>
+      <w:lvlJc w:val="left"/>
+      <w:pPr>
+        <w:ind w:left="2880" w:hanging="360"/>
+      </w:pPr>
+      <w:rPr>
+        <w:rFonts w:ascii="Symbol" w:hAnsi="Symbol" w:hint="default"/>
+      </w:rPr>
+    </w:lvl>
+    <w:lvl w:ilvl="4" w:tplc="0C0A0003" w:tentative="1">
+      <w:start w:val="1"/>
+      <w:numFmt w:val="bullet"/>
+      <w:lvlText w:val="o"/>
+      <w:lvlJc w:val="left"/>
+      <w:pPr>
+        <w:ind w:left="3600" w:hanging="360"/>
+      </w:pPr>
+      <w:rPr>
+        <w:rFonts w:ascii="Courier New" w:hAnsi="Courier New" w:cs="Courier New" w:hint="default"/>
+      </w:rPr>
+    </w:lvl>
+    <w:lvl w:ilvl="5" w:tplc="0C0A0005" w:tentative="1">
+      <w:start w:val="1"/>
+      <w:numFmt w:val="bullet"/>
+      <w:lvlText w:val=""/>
+      <w:lvlJc w:val="left"/>
+      <w:pPr>
+        <w:ind w:left="4320" w:hanging="360"/>
+      </w:pPr>
+      <w:rPr>
+        <w:rFonts w:ascii="Wingdings" w:hAnsi="Wingdings" w:hint="default"/>
+      </w:rPr>
+    </w:lvl>
+    <w:lvl w:ilvl="6" w:tplc="0C0A0001" w:tentative="1">
+      <w:start w:val="1"/>
+      <w:numFmt w:val="bullet"/>
+      <w:lvlText w:val=""/>
+      <w:lvlJc w:val="left"/>
+      <w:pPr>
+        <w:ind w:left="5040" w:hanging="360"/>
+      </w:pPr>
+      <w:rPr>
+        <w:rFonts w:ascii="Symbol" w:hAnsi="Symbol" w:hint="default"/>
+      </w:rPr>
+    </w:lvl>
+    <w:lvl w:ilvl="7" w:tplc="0C0A0003" w:tentative="1">
+      <w:start w:val="1"/>
+      <w:numFmt w:val="bullet"/>
+      <w:lvlText w:val="o"/>
+      <w:lvlJc w:val="left"/>
+      <w:pPr>
+        <w:ind w:left="5760" w:hanging="360"/>
+      </w:pPr>
+      <w:rPr>
+        <w:rFonts w:ascii="Courier New" w:hAnsi="Courier New" w:cs="Courier New" w:hint="default"/>
+      </w:rPr>
+    </w:lvl>
+    <w:lvl w:ilvl="8" w:tplc="0C0A0005" w:tentative="1">
+      <w:start w:val="1"/>
+      <w:numFmt w:val="bullet"/>
+      <w:lvlText w:val=""/>
+      <w:lvlJc w:val="left"/>
+      <w:pPr>
+        <w:ind w:left="6480" w:hanging="360"/>
+      </w:pPr>
+      <w:rPr>
+        <w:rFonts w:ascii="Wingdings" w:hAnsi="Wingdings" w:hint="default"/>
+      </w:rPr>
+    </w:lvl>
+  </w:abstractNum>
+  <w:abstractNum w:abstractNumId="5" w15:restartNumberingAfterBreak="0">
+    <w:nsid w:val="2EFB02CA"/>
+    <w:multiLevelType w:val="hybridMultilevel"/>
+    <w:tmpl w:val="4E687C9E"/>
+    <w:lvl w:ilvl="0" w:tplc="0C0A000F">
+      <w:start w:val="1"/>
+      <w:numFmt w:val="decimal"/>
+      <w:lvlText w:val="%1."/>
+      <w:lvlJc w:val="left"/>
+      <w:pPr>
+        <w:ind w:left="360" w:hanging="360"/>
+      </w:pPr>
+      <w:rPr>
+        <w:rFonts w:hint="default"/>
+      </w:rPr>
+    </w:lvl>
+    <w:lvl w:ilvl="1" w:tplc="0C0A0019" w:tentative="1">
+      <w:start w:val="1"/>
+      <w:numFmt w:val="lowerLetter"/>
+      <w:lvlText w:val="%2."/>
+      <w:lvlJc w:val="left"/>
+      <w:pPr>
+        <w:ind w:left="1080" w:hanging="360"/>
+      </w:pPr>
+    </w:lvl>
+    <w:lvl w:ilvl="2" w:tplc="0C0A001B" w:tentative="1">
+      <w:start w:val="1"/>
+      <w:numFmt w:val="lowerRoman"/>
+      <w:lvlText w:val="%3."/>
+      <w:lvlJc w:val="right"/>
+      <w:pPr>
+        <w:ind w:left="1800" w:hanging="180"/>
+      </w:pPr>
+    </w:lvl>
+    <w:lvl w:ilvl="3" w:tplc="0C0A000F" w:tentative="1">
+      <w:start w:val="1"/>
+      <w:numFmt w:val="decimal"/>
+      <w:lvlText w:val="%4."/>
+      <w:lvlJc w:val="left"/>
+      <w:pPr>
+        <w:ind w:left="2520" w:hanging="360"/>
+      </w:pPr>
+    </w:lvl>
+    <w:lvl w:ilvl="4" w:tplc="0C0A0019" w:tentative="1">
+      <w:start w:val="1"/>
+      <w:numFmt w:val="lowerLetter"/>
+      <w:lvlText w:val="%5."/>
+      <w:lvlJc w:val="left"/>
+      <w:pPr>
+        <w:ind w:left="3240" w:hanging="360"/>
+      </w:pPr>
+    </w:lvl>
+    <w:lvl w:ilvl="5" w:tplc="0C0A001B" w:tentative="1">
+      <w:start w:val="1"/>
+      <w:numFmt w:val="lowerRoman"/>
+      <w:lvlText w:val="%6."/>
+      <w:lvlJc w:val="right"/>
+      <w:pPr>
+        <w:ind w:left="3960" w:hanging="180"/>
+      </w:pPr>
+    </w:lvl>
+    <w:lvl w:ilvl="6" w:tplc="0C0A000F" w:tentative="1">
+      <w:start w:val="1"/>
+      <w:numFmt w:val="decimal"/>
+      <w:lvlText w:val="%7."/>
+      <w:lvlJc w:val="left"/>
+      <w:pPr>
+        <w:ind w:left="4680" w:hanging="360"/>
+      </w:pPr>
+    </w:lvl>
+    <w:lvl w:ilvl="7" w:tplc="0C0A0019" w:tentative="1">
+      <w:start w:val="1"/>
+      <w:numFmt w:val="lowerLetter"/>
+      <w:lvlText w:val="%8."/>
+      <w:lvlJc w:val="left"/>
+      <w:pPr>
+        <w:ind w:left="5400" w:hanging="360"/>
+      </w:pPr>
+    </w:lvl>
+    <w:lvl w:ilvl="8" w:tplc="0C0A001B" w:tentative="1">
+      <w:start w:val="1"/>
+      <w:numFmt w:val="lowerRoman"/>
+      <w:lvlText w:val="%9."/>
+      <w:lvlJc w:val="right"/>
+      <w:pPr>
+        <w:ind w:left="6120" w:hanging="180"/>
+      </w:pPr>
+    </w:lvl>
+  </w:abstractNum>
+  <w:abstractNum w:abstractNumId="6" w15:restartNumberingAfterBreak="0">
+    <w:nsid w:val="3F4D3A17"/>
+    <w:multiLevelType w:val="hybridMultilevel"/>
+    <w:tmpl w:val="52B8E63E"/>
+    <w:lvl w:ilvl="0" w:tplc="0C0A0015">
+      <w:start w:val="1"/>
+      <w:numFmt w:val="upperLetter"/>
+      <w:lvlText w:val="%1."/>
+      <w:lvlJc w:val="left"/>
+      <w:pPr>
+        <w:ind w:left="720" w:hanging="360"/>
+      </w:pPr>
+      <w:rPr>
+        <w:rFonts w:hint="default"/>
+      </w:rPr>
+    </w:lvl>
+    <w:lvl w:ilvl="1" w:tplc="0C0A0019" w:tentative="1">
+      <w:start w:val="1"/>
+      <w:numFmt w:val="lowerLetter"/>
+      <w:lvlText w:val="%2."/>
+      <w:lvlJc w:val="left"/>
+      <w:pPr>
+        <w:ind w:left="1440" w:hanging="360"/>
+      </w:pPr>
+    </w:lvl>
+    <w:lvl w:ilvl="2" w:tplc="0C0A001B" w:tentative="1">
+      <w:start w:val="1"/>
+      <w:numFmt w:val="lowerRoman"/>
+      <w:lvlText w:val="%3."/>
+      <w:lvlJc w:val="right"/>
+      <w:pPr>
+        <w:ind w:left="2160" w:hanging="180"/>
+      </w:pPr>
+    </w:lvl>
+    <w:lvl w:ilvl="3" w:tplc="0C0A000F" w:tentative="1">
+      <w:start w:val="1"/>
+      <w:numFmt w:val="decimal"/>
+      <w:lvlText w:val="%4."/>
+      <w:lvlJc w:val="left"/>
+      <w:pPr>
+        <w:ind w:left="2880" w:hanging="360"/>
+      </w:pPr>
+    </w:lvl>
+    <w:lvl w:ilvl="4" w:tplc="0C0A0019" w:tentative="1">
+      <w:start w:val="1"/>
+      <w:numFmt w:val="lowerLetter"/>
+      <w:lvlText w:val="%5."/>
+      <w:lvlJc w:val="left"/>
+      <w:pPr>
+        <w:ind w:left="3600" w:hanging="360"/>
+      </w:pPr>
+    </w:lvl>
+    <w:lvl w:ilvl="5" w:tplc="0C0A001B" w:tentative="1">
+      <w:start w:val="1"/>
+      <w:numFmt w:val="lowerRoman"/>
+      <w:lvlText w:val="%6."/>
+      <w:lvlJc w:val="right"/>
+      <w:pPr>
+        <w:ind w:left="4320" w:hanging="180"/>
+      </w:pPr>
+    </w:lvl>
+    <w:lvl w:ilvl="6" w:tplc="0C0A000F" w:tentative="1">
+      <w:start w:val="1"/>
+      <w:numFmt w:val="decimal"/>
+      <w:lvlText w:val="%7."/>
+      <w:lvlJc w:val="left"/>
+      <w:pPr>
+        <w:ind w:left="5040" w:hanging="360"/>
+      </w:pPr>
+    </w:lvl>
+    <w:lvl w:ilvl="7" w:tplc="0C0A0019" w:tentative="1">
+      <w:start w:val="1"/>
+      <w:numFmt w:val="lowerLetter"/>
+      <w:lvlText w:val="%8."/>
+      <w:lvlJc w:val="left"/>
+      <w:pPr>
+        <w:ind w:left="5760" w:hanging="360"/>
+      </w:pPr>
+    </w:lvl>
+    <w:lvl w:ilvl="8" w:tplc="0C0A001B" w:tentative="1">
+      <w:start w:val="1"/>
+      <w:numFmt w:val="lowerRoman"/>
+      <w:lvlText w:val="%9."/>
+      <w:lvlJc w:val="right"/>
+      <w:pPr>
+        <w:ind w:left="6480" w:hanging="180"/>
+      </w:pPr>
+    </w:lvl>
+  </w:abstractNum>
   <w:abstractNum w:abstractNumId="7" w15:restartNumberingAfterBreak="0">
-    <w:nsid w:val="6E1F78C9"/>
+    <w:nsid w:val="6DBD3631"/>
     <w:multiLevelType w:val="multilevel"/>
-    <w:tmpl w:val="2B5609A0"/>
+    <w:tmpl w:val="62ACF0FE"/>
     <w:lvl w:ilvl="0">
       <w:start w:val="1"/>
       <w:numFmt w:val="bullet"/>
@@ -10900,9 +11635,9 @@
     </w:lvl>
   </w:abstractNum>
   <w:abstractNum w:abstractNumId="8" w15:restartNumberingAfterBreak="0">
-    <w:nsid w:val="74762AC3"/>
+    <w:nsid w:val="6E1F78C9"/>
     <w:multiLevelType w:val="multilevel"/>
-    <w:tmpl w:val="28965F00"/>
+    <w:tmpl w:val="2B5609A0"/>
     <w:lvl w:ilvl="0">
       <w:start w:val="1"/>
       <w:numFmt w:val="bullet"/>
@@ -11048,32 +11783,184 @@
       </w:rPr>
     </w:lvl>
   </w:abstractNum>
+  <w:abstractNum w:abstractNumId="9" w15:restartNumberingAfterBreak="0">
+    <w:nsid w:val="74762AC3"/>
+    <w:multiLevelType w:val="multilevel"/>
+    <w:tmpl w:val="28965F00"/>
+    <w:lvl w:ilvl="0">
+      <w:start w:val="1"/>
+      <w:numFmt w:val="bullet"/>
+      <w:lvlText w:val=""/>
+      <w:lvlJc w:val="left"/>
+      <w:pPr>
+        <w:tabs>
+          <w:tab w:val="num" w:pos="720"/>
+        </w:tabs>
+        <w:ind w:left="720" w:hanging="360"/>
+      </w:pPr>
+      <w:rPr>
+        <w:rFonts w:ascii="Symbol" w:hAnsi="Symbol" w:hint="default"/>
+        <w:sz w:val="20"/>
+      </w:rPr>
+    </w:lvl>
+    <w:lvl w:ilvl="1" w:tentative="1">
+      <w:start w:val="1"/>
+      <w:numFmt w:val="bullet"/>
+      <w:lvlText w:val="o"/>
+      <w:lvlJc w:val="left"/>
+      <w:pPr>
+        <w:tabs>
+          <w:tab w:val="num" w:pos="1440"/>
+        </w:tabs>
+        <w:ind w:left="1440" w:hanging="360"/>
+      </w:pPr>
+      <w:rPr>
+        <w:rFonts w:ascii="Courier New" w:hAnsi="Courier New" w:hint="default"/>
+        <w:sz w:val="20"/>
+      </w:rPr>
+    </w:lvl>
+    <w:lvl w:ilvl="2" w:tentative="1">
+      <w:start w:val="1"/>
+      <w:numFmt w:val="bullet"/>
+      <w:lvlText w:val=""/>
+      <w:lvlJc w:val="left"/>
+      <w:pPr>
+        <w:tabs>
+          <w:tab w:val="num" w:pos="2160"/>
+        </w:tabs>
+        <w:ind w:left="2160" w:hanging="360"/>
+      </w:pPr>
+      <w:rPr>
+        <w:rFonts w:ascii="Wingdings" w:hAnsi="Wingdings" w:hint="default"/>
+        <w:sz w:val="20"/>
+      </w:rPr>
+    </w:lvl>
+    <w:lvl w:ilvl="3" w:tentative="1">
+      <w:start w:val="1"/>
+      <w:numFmt w:val="bullet"/>
+      <w:lvlText w:val=""/>
+      <w:lvlJc w:val="left"/>
+      <w:pPr>
+        <w:tabs>
+          <w:tab w:val="num" w:pos="2880"/>
+        </w:tabs>
+        <w:ind w:left="2880" w:hanging="360"/>
+      </w:pPr>
+      <w:rPr>
+        <w:rFonts w:ascii="Wingdings" w:hAnsi="Wingdings" w:hint="default"/>
+        <w:sz w:val="20"/>
+      </w:rPr>
+    </w:lvl>
+    <w:lvl w:ilvl="4" w:tentative="1">
+      <w:start w:val="1"/>
+      <w:numFmt w:val="bullet"/>
+      <w:lvlText w:val=""/>
+      <w:lvlJc w:val="left"/>
+      <w:pPr>
+        <w:tabs>
+          <w:tab w:val="num" w:pos="3600"/>
+        </w:tabs>
+        <w:ind w:left="3600" w:hanging="360"/>
+      </w:pPr>
+      <w:rPr>
+        <w:rFonts w:ascii="Wingdings" w:hAnsi="Wingdings" w:hint="default"/>
+        <w:sz w:val="20"/>
+      </w:rPr>
+    </w:lvl>
+    <w:lvl w:ilvl="5" w:tentative="1">
+      <w:start w:val="1"/>
+      <w:numFmt w:val="bullet"/>
+      <w:lvlText w:val=""/>
+      <w:lvlJc w:val="left"/>
+      <w:pPr>
+        <w:tabs>
+          <w:tab w:val="num" w:pos="4320"/>
+        </w:tabs>
+        <w:ind w:left="4320" w:hanging="360"/>
+      </w:pPr>
+      <w:rPr>
+        <w:rFonts w:ascii="Wingdings" w:hAnsi="Wingdings" w:hint="default"/>
+        <w:sz w:val="20"/>
+      </w:rPr>
+    </w:lvl>
+    <w:lvl w:ilvl="6" w:tentative="1">
+      <w:start w:val="1"/>
+      <w:numFmt w:val="bullet"/>
+      <w:lvlText w:val=""/>
+      <w:lvlJc w:val="left"/>
+      <w:pPr>
+        <w:tabs>
+          <w:tab w:val="num" w:pos="5040"/>
+        </w:tabs>
+        <w:ind w:left="5040" w:hanging="360"/>
+      </w:pPr>
+      <w:rPr>
+        <w:rFonts w:ascii="Wingdings" w:hAnsi="Wingdings" w:hint="default"/>
+        <w:sz w:val="20"/>
+      </w:rPr>
+    </w:lvl>
+    <w:lvl w:ilvl="7" w:tentative="1">
+      <w:start w:val="1"/>
+      <w:numFmt w:val="bullet"/>
+      <w:lvlText w:val=""/>
+      <w:lvlJc w:val="left"/>
+      <w:pPr>
+        <w:tabs>
+          <w:tab w:val="num" w:pos="5760"/>
+        </w:tabs>
+        <w:ind w:left="5760" w:hanging="360"/>
+      </w:pPr>
+      <w:rPr>
+        <w:rFonts w:ascii="Wingdings" w:hAnsi="Wingdings" w:hint="default"/>
+        <w:sz w:val="20"/>
+      </w:rPr>
+    </w:lvl>
+    <w:lvl w:ilvl="8" w:tentative="1">
+      <w:start w:val="1"/>
+      <w:numFmt w:val="bullet"/>
+      <w:lvlText w:val=""/>
+      <w:lvlJc w:val="left"/>
+      <w:pPr>
+        <w:tabs>
+          <w:tab w:val="num" w:pos="6480"/>
+        </w:tabs>
+        <w:ind w:left="6480" w:hanging="360"/>
+      </w:pPr>
+      <w:rPr>
+        <w:rFonts w:ascii="Wingdings" w:hAnsi="Wingdings" w:hint="default"/>
+        <w:sz w:val="20"/>
+      </w:rPr>
+    </w:lvl>
+  </w:abstractNum>
   <w:num w:numId="1" w16cid:durableId="1766531474">
+    <w:abstractNumId w:val="7"/>
+  </w:num>
+  <w:num w:numId="2" w16cid:durableId="1585794975">
+    <w:abstractNumId w:val="2"/>
+  </w:num>
+  <w:num w:numId="3" w16cid:durableId="1424642946">
+    <w:abstractNumId w:val="8"/>
+  </w:num>
+  <w:num w:numId="4" w16cid:durableId="202717371">
+    <w:abstractNumId w:val="3"/>
+  </w:num>
+  <w:num w:numId="5" w16cid:durableId="2012414202">
+    <w:abstractNumId w:val="4"/>
+  </w:num>
+  <w:num w:numId="6" w16cid:durableId="753549070">
+    <w:abstractNumId w:val="9"/>
+  </w:num>
+  <w:num w:numId="7" w16cid:durableId="1339042036">
+    <w:abstractNumId w:val="1"/>
+  </w:num>
+  <w:num w:numId="8" w16cid:durableId="1433822892">
     <w:abstractNumId w:val="6"/>
   </w:num>
-  <w:num w:numId="2" w16cid:durableId="1585794975">
-    <w:abstractNumId w:val="1"/>
-  </w:num>
-  <w:num w:numId="3" w16cid:durableId="1424642946">
-    <w:abstractNumId w:val="7"/>
-  </w:num>
-  <w:num w:numId="4" w16cid:durableId="202717371">
-    <w:abstractNumId w:val="2"/>
-  </w:num>
-  <w:num w:numId="5" w16cid:durableId="2012414202">
-    <w:abstractNumId w:val="3"/>
-  </w:num>
-  <w:num w:numId="6" w16cid:durableId="753549070">
-    <w:abstractNumId w:val="8"/>
-  </w:num>
-  <w:num w:numId="7" w16cid:durableId="1339042036">
-    <w:abstractNumId w:val="0"/>
-  </w:num>
-  <w:num w:numId="8" w16cid:durableId="1433822892">
+  <w:num w:numId="9" w16cid:durableId="1094284610">
     <w:abstractNumId w:val="5"/>
   </w:num>
-  <w:num w:numId="9" w16cid:durableId="1094284610">
-    <w:abstractNumId w:val="4"/>
+  <w:num w:numId="10" w16cid:durableId="1359158530">
+    <w:abstractNumId w:val="0"/>
   </w:num>
 </w:numbering>
 </file>
@@ -11685,7 +12572,6 @@
   <w:style w:type="character" w:default="1" w:styleId="Fuentedeprrafopredeter">
     <w:name w:val="Default Paragraph Font"/>
     <w:uiPriority w:val="1"/>
-    <w:semiHidden/>
     <w:unhideWhenUsed/>
   </w:style>
   <w:style w:type="table" w:default="1" w:styleId="Tablanormal">

</xml_diff>

<commit_message>
Paginacion en entidades tiene un error
</commit_message>
<xml_diff>
--- a/BASE DATOS EMPRESA/EMPRESA/FUNCIONAMIENTO DE TODO.docx
+++ b/BASE DATOS EMPRESA/EMPRESA/FUNCIONAMIENTO DE TODO.docx
@@ -3125,13 +3125,31 @@
       </w:pPr>
       <w:r>
         <w:lastRenderedPageBreak/>
-        <w:t>Con la sentencia [‘a’ =&gt; $a] dentro de una llamada a función o método, que necesita como parámetro una tabla, se crea una nueva tabla. Esta tabla que se crea no tiene nombre y en la función que la recibe cogerá el nombre del parámetro definido en la</w:t>
+        <w:t>Con la sentencia [‘</w:t>
+      </w:r>
+      <w:r>
+        <w:t>x</w:t>
+      </w:r>
+      <w:r>
+        <w:t>’ =&gt; $a] dentro de una llamada a función o método, que necesita como parámetro una tabla, se crea una nueva tabla</w:t>
+      </w:r>
+      <w:r>
+        <w:t xml:space="preserve"> con un elemento y con indice asociativo x</w:t>
+      </w:r>
+      <w:r>
+        <w:t>. Esta tabla que se crea no tiene nombre y en la función que la recibe cogerá el nombre del parámetro definido en la</w:t>
       </w:r>
       <w:r>
         <w:t xml:space="preserve"> cabecera de la</w:t>
       </w:r>
       <w:r>
-        <w:t xml:space="preserve"> función. Esta tabla solo tiene un elemento, tiene un único índice o key asociativo que se llama ‘a’, y en ese único elemento están todos los valores que tenía $a.</w:t>
+        <w:t xml:space="preserve"> función. Esta tabla solo tiene un elemento, tiene un único índice o key asociativo que se llama ‘</w:t>
+      </w:r>
+      <w:r>
+        <w:t>x</w:t>
+      </w:r>
+      <w:r>
+        <w:t>’, y en ese único elemento están todos los valores que tenía $a.</w:t>
       </w:r>
     </w:p>
     <w:p>
@@ -3179,23 +3197,35 @@
         <w:pStyle w:val="Sinespaciado"/>
       </w:pPr>
       <w:r>
-        <w:t xml:space="preserve"> esta tabla como no tiene nombre le pongo nombre anónimo y seria </w:t>
-      </w:r>
-    </w:p>
-    <w:p>
-      <w:pPr>
-        <w:pStyle w:val="Sinespaciado"/>
-      </w:pPr>
-      <w:r>
-        <w:t>Anónima [‘a’]== [‘a’,  ‘b’,  ‘c’]</w:t>
-      </w:r>
-    </w:p>
-    <w:p>
-      <w:pPr>
-        <w:pStyle w:val="Sinespaciado"/>
-      </w:pPr>
-      <w:r>
-        <w:t>Anónima [‘a’][0]==</w:t>
+        <w:t xml:space="preserve">esta tabla como no tiene nombre le pongo nombre anónimo y seria </w:t>
+      </w:r>
+    </w:p>
+    <w:p>
+      <w:pPr>
+        <w:pStyle w:val="Sinespaciado"/>
+      </w:pPr>
+      <w:r>
+        <w:t>Anónima [‘</w:t>
+      </w:r>
+      <w:r>
+        <w:t>x</w:t>
+      </w:r>
+      <w:r>
+        <w:t>’]== [‘a’,  ‘b’,  ‘c’]</w:t>
+      </w:r>
+    </w:p>
+    <w:p>
+      <w:pPr>
+        <w:pStyle w:val="Sinespaciado"/>
+      </w:pPr>
+      <w:r>
+        <w:t>Anónima [‘</w:t>
+      </w:r>
+      <w:r>
+        <w:t>x</w:t>
+      </w:r>
+      <w:r>
+        <w:t>’][0]==</w:t>
       </w:r>
       <w:r>
         <w:t xml:space="preserve"> </w:t>
@@ -3209,7 +3239,13 @@
         <w:pStyle w:val="Sinespaciado"/>
       </w:pPr>
       <w:r>
-        <w:t>Anónima [‘a’][1]==</w:t>
+        <w:t>Anónima [‘</w:t>
+      </w:r>
+      <w:r>
+        <w:t>x</w:t>
+      </w:r>
+      <w:r>
+        <w:t>’][1]==</w:t>
       </w:r>
       <w:r>
         <w:t xml:space="preserve"> </w:t>
@@ -3223,7 +3259,13 @@
         <w:pStyle w:val="Sinespaciado"/>
       </w:pPr>
       <w:r>
-        <w:t>Anónima [‘a’][2]==</w:t>
+        <w:t>Anónima [‘</w:t>
+      </w:r>
+      <w:r>
+        <w:t>x</w:t>
+      </w:r>
+      <w:r>
+        <w:t>’][2]==</w:t>
       </w:r>
       <w:r>
         <w:t xml:space="preserve"> </w:t>
@@ -3893,7 +3935,13 @@
     </w:p>
     <w:p>
       <w:r>
-        <w:t>Si dentro de $param solo le pasamos una tabla, en nuestro caso [‘entidades’] el foreach solo se ejecutara una vez</w:t>
+        <w:t>Si dentro de $param</w:t>
+      </w:r>
+      <w:r>
+        <w:t>s</w:t>
+      </w:r>
+      <w:r>
+        <w:t xml:space="preserve"> solo le pasamos una tabla, en nuestro caso [‘entidades’] el foreach solo se ejecutara una vez</w:t>
       </w:r>
       <w:r>
         <w:t>, y hará esto:</w:t>
@@ -3904,7 +3952,13 @@
         <w:pStyle w:val="Sinespaciado"/>
       </w:pPr>
       <w:r>
-        <w:t>$name es el índice de $params, luego $name tiene el valor ‘entidades’, y al hacer $$name = $value está creando una variable nueva llamada $entidades (que es el valor de $name), que contiene todos los datos de la tabla $entidades inicial antes de empaquetarla, así tenemos de nuevo:</w:t>
+        <w:t>$name es el índice de $params, luego $name tiene el valor ‘entidades’, y al hacer $$name = $value está creando una variable nueva llamada $entidades (que es el valor de $name</w:t>
+      </w:r>
+      <w:r>
+        <w:t xml:space="preserve"> del indice</w:t>
+      </w:r>
+      <w:r>
+        <w:t>), que contiene todos los datos de la tabla $entidades inicial antes de empaquetarla, así tenemos de nuevo:</w:t>
       </w:r>
     </w:p>
     <w:p>
@@ -4802,34 +4856,13 @@
           <w:lang w:eastAsia="es-ES"/>
           <w14:ligatures w14:val="none"/>
         </w:rPr>
-        <w:t>= “</w:t>
-      </w:r>
-      <w:proofErr w:type="spellStart"/>
-      <w:r>
-        <w:rPr>
-          <w:rFonts w:ascii="Consolas" w:eastAsia="Times New Roman" w:hAnsi="Consolas" w:cs="Times New Roman"/>
-          <w:noProof w:val="0"/>
-          <w:color w:val="CE9178"/>
-          <w:kern w:val="0"/>
-          <w:sz w:val="21"/>
-          <w:szCs w:val="21"/>
-          <w:lang w:eastAsia="es-ES"/>
-          <w14:ligatures w14:val="none"/>
-        </w:rPr>
-        <w:t>p</w:t>
-      </w:r>
-      <w:r>
-        <w:rPr>
-          <w:color w:val="EE0000"/>
-        </w:rPr>
-        <w:t>ages</w:t>
-      </w:r>
-      <w:proofErr w:type="spellEnd"/>
-      <w:r>
-        <w:rPr>
-          <w:color w:val="EE0000"/>
-        </w:rPr>
-        <w:t>/borrar/&lt;?=$entidad-&gt;getId()?&gt;</w:t>
+        <w:t>= “p</w:t>
+      </w:r>
+      <w:r>
+        <w:rPr>
+          <w:color w:val="EE0000"/>
+        </w:rPr>
+        <w:t>ages/borrar/&lt;?=$entidad-&gt;getId()?&gt;</w:t>
       </w:r>
     </w:p>
     <w:p>
@@ -12797,6 +12830,7 @@
   <w:style w:type="character" w:default="1" w:styleId="Fuentedeprrafopredeter">
     <w:name w:val="Default Paragraph Font"/>
     <w:uiPriority w:val="1"/>
+    <w:semiHidden/>
     <w:unhideWhenUsed/>
   </w:style>
   <w:style w:type="table" w:default="1" w:styleId="Tablanormal">

</xml_diff>

<commit_message>
mostrando las imagenes de un coche
</commit_message>
<xml_diff>
--- a/BASE DATOS EMPRESA/EMPRESA/FUNCIONAMIENTO DE TODO.docx
+++ b/BASE DATOS EMPRESA/EMPRESA/FUNCIONAMIENTO DE TODO.docx
@@ -4856,13 +4856,34 @@
           <w:lang w:eastAsia="es-ES"/>
           <w14:ligatures w14:val="none"/>
         </w:rPr>
-        <w:t>= “p</w:t>
-      </w:r>
-      <w:r>
-        <w:rPr>
-          <w:color w:val="EE0000"/>
-        </w:rPr>
-        <w:t>ages/borrar/&lt;?=$entidad-&gt;getId()?&gt;</w:t>
+        <w:t>= “</w:t>
+      </w:r>
+      <w:proofErr w:type="spellStart"/>
+      <w:r>
+        <w:rPr>
+          <w:rFonts w:ascii="Consolas" w:eastAsia="Times New Roman" w:hAnsi="Consolas" w:cs="Times New Roman"/>
+          <w:noProof w:val="0"/>
+          <w:color w:val="CE9178"/>
+          <w:kern w:val="0"/>
+          <w:sz w:val="21"/>
+          <w:szCs w:val="21"/>
+          <w:lang w:eastAsia="es-ES"/>
+          <w14:ligatures w14:val="none"/>
+        </w:rPr>
+        <w:t>p</w:t>
+      </w:r>
+      <w:r>
+        <w:rPr>
+          <w:color w:val="EE0000"/>
+        </w:rPr>
+        <w:t>ages</w:t>
+      </w:r>
+      <w:proofErr w:type="spellEnd"/>
+      <w:r>
+        <w:rPr>
+          <w:color w:val="EE0000"/>
+        </w:rPr>
+        <w:t>/borrar/&lt;?=$entidad-&gt;getId()?&gt;</w:t>
       </w:r>
     </w:p>
     <w:p>
@@ -10740,7 +10761,220 @@
         <w:t xml:space="preserve"> y sino exote le asigna ''</w:t>
       </w:r>
     </w:p>
+    <w:p>
+      <w:r>
+        <w:t>PROBLEMA AL ACCEDER A IMÁGENES EN LA CARPETA FOTOS QUE ESTA DENTRO DEL MIS PRUEBAS</w:t>
+      </w:r>
+    </w:p>
+    <w:p>
+      <w:r>
+        <w:t xml:space="preserve">En el default.conf que hay en </w:t>
+      </w:r>
+      <w:r>
+        <w:t>C:\Users\psand\curso-de-php-8-y-mysql-8\docker\nginx</w:t>
+      </w:r>
+      <w:r>
+        <w:t xml:space="preserve"> pusimos esta linea para que todas las url que contuvieran el texto mis_pruebas se mandara a mis_pruebas/index.php y se iniciara la carga de todo.</w:t>
+      </w:r>
+    </w:p>
+    <w:p>
+      <w:pPr>
+        <w:rPr>
+          <w:color w:val="FF0000"/>
+        </w:rPr>
+      </w:pPr>
+      <w:r>
+        <w:rPr>
+          <w:color w:val="FF0000"/>
+        </w:rPr>
+        <w:t>location /mis_pruebas {</w:t>
+      </w:r>
+    </w:p>
+    <w:p>
+      <w:pPr>
+        <w:rPr>
+          <w:color w:val="FF0000"/>
+        </w:rPr>
+      </w:pPr>
+      <w:r>
+        <w:rPr>
+          <w:color w:val="FF0000"/>
+        </w:rPr>
+        <w:t xml:space="preserve">    rewrite ^(.*)$ /mis_pruebas/index.php?$1 last;</w:t>
+      </w:r>
+    </w:p>
+    <w:p>
+      <w:pPr>
+        <w:rPr>
+          <w:color w:val="FF0000"/>
+        </w:rPr>
+      </w:pPr>
+      <w:r>
+        <w:rPr>
+          <w:color w:val="FF0000"/>
+        </w:rPr>
+        <w:t>}</w:t>
+      </w:r>
+    </w:p>
+    <w:p>
+      <w:r>
+        <w:t>El problema es que esa redireccion tmb afecta a las etiquetas &lt;img src=”ruta” &gt; de HTML para cargar imágenes si las imágenes estan dentro de “mis_pruebas”.</w:t>
+      </w:r>
+    </w:p>
+    <w:p>
+      <w:r>
+        <w:t>Asi que la IA me ha dicho que modifiqeu por esto:</w:t>
+      </w:r>
+    </w:p>
+    <w:p>
+      <w:pPr>
+        <w:rPr>
+          <w:color w:val="FF0000"/>
+        </w:rPr>
+      </w:pPr>
+      <w:r>
+        <w:rPr>
+          <w:color w:val="FF0000"/>
+        </w:rPr>
+        <w:t>location /mis_pruebas {</w:t>
+      </w:r>
+    </w:p>
+    <w:p>
+      <w:r>
+        <w:t xml:space="preserve">    # Si </w:t>
+      </w:r>
+      <w:r>
+        <w:t>la ruta d</w:t>
+      </w:r>
+      <w:r>
+        <w:t>el archivo o carpeta existe, lo sirve directamente el servidor nginx sin enviar peticiones a PHP.</w:t>
+      </w:r>
+    </w:p>
+    <w:p>
+      <w:r>
+        <w:t xml:space="preserve">    # Si no, pasa la petición a index.php con los parámetros de la query.</w:t>
+      </w:r>
+      <w:r>
+        <w:t xml:space="preserve"> Solo hace redireccion si se pone una ruta que no existe, yo todas las rutas que he creado en Router no son relaes</w:t>
+      </w:r>
+    </w:p>
+    <w:p>
+      <w:pPr>
+        <w:rPr>
+          <w:color w:val="FF0000"/>
+        </w:rPr>
+      </w:pPr>
+      <w:r>
+        <w:rPr>
+          <w:color w:val="FF0000"/>
+        </w:rPr>
+        <w:t xml:space="preserve">    try_files $uri $uri/ /mis_pruebas/index.php?$query_string;</w:t>
+      </w:r>
+    </w:p>
+    <w:p>
+      <w:r>
+        <w:rPr>
+          <w:color w:val="FF0000"/>
+        </w:rPr>
+        <w:t>}</w:t>
+      </w:r>
+      <w:r>
+        <w:rPr>
+          <w:color w:val="FF0000"/>
+        </w:rPr>
+        <w:t xml:space="preserve"> </w:t>
+      </w:r>
+      <w:r>
+        <w:t>try_files $uri $uri quiere decir que si el intento de la uri funciona pues que siga con esa uri</w:t>
+      </w:r>
+    </w:p>
     <w:p/>
+    <w:p>
+      <w:pPr>
+        <w:rPr>
+          <w:color w:val="EE0000"/>
+        </w:rPr>
+      </w:pPr>
+      <w:r>
+        <w:t># Opcional: si quieres ser más explícito con archivos estáticos (imagenes, CSS, js) dentro de /mis_pruebas</w:t>
+      </w:r>
+      <w:r>
+        <w:rPr>
+          <w:color w:val="EE0000"/>
+        </w:rPr>
+        <w:t xml:space="preserve">    location ~* ^/mis_pruebas/(.+\.(jpg|jpeg|png|gif|ico|css|js|svg|woff2?|ttf|eot))$ {</w:t>
+      </w:r>
+    </w:p>
+    <w:p>
+      <w:pPr>
+        <w:rPr>
+          <w:color w:val="000000" w:themeColor="text1"/>
+        </w:rPr>
+      </w:pPr>
+      <w:r>
+        <w:rPr>
+          <w:color w:val="EE0000"/>
+        </w:rPr>
+        <w:t xml:space="preserve">    expires 30d;           </w:t>
+      </w:r>
+      <w:r>
+        <w:rPr>
+          <w:color w:val="000000" w:themeColor="text1"/>
+        </w:rPr>
+        <w:t># Cachea 30 días en el navegador web del cliente,hará que las imágenes no se vuelvan a pedir al servidor hasta que caduque la caché o cambien de nombre.</w:t>
+      </w:r>
+    </w:p>
+    <w:p>
+      <w:pPr>
+        <w:rPr>
+          <w:color w:val="000000" w:themeColor="text1"/>
+        </w:rPr>
+      </w:pPr>
+      <w:r>
+        <w:rPr>
+          <w:color w:val="EE0000"/>
+        </w:rPr>
+        <w:t xml:space="preserve">    access_log off</w:t>
+      </w:r>
+      <w:r>
+        <w:rPr>
+          <w:color w:val="000000" w:themeColor="text1"/>
+        </w:rPr>
+        <w:t xml:space="preserve">;        </w:t>
+      </w:r>
+      <w:r>
+        <w:rPr>
+          <w:color w:val="000000" w:themeColor="text1"/>
+        </w:rPr>
+        <w:t># No registrar accesos a estáticos evita llenar tus logs con peticiones de imágenes y CSS.</w:t>
+      </w:r>
+    </w:p>
+    <w:p>
+      <w:pPr>
+        <w:rPr>
+          <w:color w:val="EE0000"/>
+        </w:rPr>
+      </w:pPr>
+      <w:r>
+        <w:rPr>
+          <w:color w:val="EE0000"/>
+        </w:rPr>
+        <w:t xml:space="preserve">    try_files $uri =404;</w:t>
+      </w:r>
+    </w:p>
+    <w:p>
+      <w:pPr>
+        <w:rPr>
+          <w:color w:val="EE0000"/>
+        </w:rPr>
+      </w:pPr>
+      <w:r>
+        <w:rPr>
+          <w:color w:val="EE0000"/>
+        </w:rPr>
+        <w:t>}</w:t>
+      </w:r>
+    </w:p>
     <w:p>
       <w:pPr>
         <w:rPr>

</xml_diff>

<commit_message>
aplicando mis estilos css
</commit_message>
<xml_diff>
--- a/BASE DATOS EMPRESA/EMPRESA/FUNCIONAMIENTO DE TODO.docx
+++ b/BASE DATOS EMPRESA/EMPRESA/FUNCIONAMIENTO DE TODO.docx
@@ -2569,31 +2569,13 @@
     </w:p>
     <w:p>
       <w:r>
-        <w:t xml:space="preserve">Hay otro tipo de Link por ejempli para cargar una imagen se usa &lt;image src=”ruta”&gt; si por ejemplo estoy en la carpeta http:localhost/popo/juan y las  fotos estan en /popo/fotos puedo poner src= “../fotos  Los dos puntos hace que salga de un directorio (subir un nivel como hace cd..) y se coloca en </w:t>
-      </w:r>
-      <w:r>
-        <w:t>/popo/</w:t>
-      </w:r>
-      <w:r>
-        <w:t xml:space="preserve"> y despues le añade fotos ya que no hay barra antes de los ..</w:t>
+        <w:t>Hay otro tipo de Link por ejempli para cargar una imagen se usa &lt;image src=”ruta”&gt; si por ejemplo estoy en la carpeta http:localhost/popo/juan y las  fotos estan en /popo/fotos puedo poner src= “../fotos  Los dos puntos hace que salga de un directorio (subir un nivel como hace cd..) y se coloca en /popo/ y despues le añade fotos ya que no hay barra antes de los ..</w:t>
       </w:r>
       <w:r>
         <w:t xml:space="preserve">  Si pusiera /../fotos subiria un nivel y luego pondria la ruta absoluta /fotos </w:t>
       </w:r>
       <w:r>
-        <w:t xml:space="preserve">con lo que me da igual haber subido un nivel porque al final se va a </w:t>
-      </w:r>
-      <w:r>
-        <w:t>/</w:t>
-      </w:r>
-      <w:r>
-        <w:t>fotos</w:t>
-      </w:r>
-      <w:r>
-        <w:t>/</w:t>
-      </w:r>
-      <w:r>
-        <w:t xml:space="preserve"> Es decir con /../fotos sube nivel y se va a /fotos y con /fotos no sube nivel y se va a /fotos. Asi que lo usar los .. es para </w:t>
+        <w:t xml:space="preserve">con lo que me da igual haber subido un nivel porque al final se va a /fotos/ Es decir con /../fotos sube nivel y se va a /fotos y con /fotos no sube nivel y se va a /fotos. Asi que lo usar los .. es para </w:t>
       </w:r>
       <w:r>
         <w:t>usarlo sin barra antes, subo nivel y donde estoy añado la parte de ruta que falta.</w:t>
@@ -4903,13 +4885,34 @@
           <w:lang w:eastAsia="es-ES"/>
           <w14:ligatures w14:val="none"/>
         </w:rPr>
-        <w:t>= “p</w:t>
-      </w:r>
-      <w:r>
-        <w:rPr>
-          <w:color w:val="EE0000"/>
-        </w:rPr>
-        <w:t>ages/borrar/&lt;?=$entidad-&gt;getId()?&gt;</w:t>
+        <w:t>= “</w:t>
+      </w:r>
+      <w:proofErr w:type="spellStart"/>
+      <w:r>
+        <w:rPr>
+          <w:rFonts w:ascii="Consolas" w:eastAsia="Times New Roman" w:hAnsi="Consolas" w:cs="Times New Roman"/>
+          <w:noProof w:val="0"/>
+          <w:color w:val="CE9178"/>
+          <w:kern w:val="0"/>
+          <w:sz w:val="21"/>
+          <w:szCs w:val="21"/>
+          <w:lang w:eastAsia="es-ES"/>
+          <w14:ligatures w14:val="none"/>
+        </w:rPr>
+        <w:t>p</w:t>
+      </w:r>
+      <w:r>
+        <w:rPr>
+          <w:color w:val="EE0000"/>
+        </w:rPr>
+        <w:t>ages</w:t>
+      </w:r>
+      <w:proofErr w:type="spellEnd"/>
+      <w:r>
+        <w:rPr>
+          <w:color w:val="EE0000"/>
+        </w:rPr>
+        <w:t>/borrar/&lt;?=$entidad-&gt;getId()?&gt;</w:t>
       </w:r>
     </w:p>
     <w:p>
@@ -10981,6 +10984,155 @@
           <w:color w:val="EE0000"/>
         </w:rPr>
         <w:t>}</w:t>
+      </w:r>
+    </w:p>
+    <w:p>
+      <w:pPr>
+        <w:jc w:val="center"/>
+        <w:rPr>
+          <w:b/>
+          <w:bCs/>
+        </w:rPr>
+      </w:pPr>
+      <w:r>
+        <w:rPr>
+          <w:b/>
+          <w:bCs/>
+        </w:rPr>
+        <w:t>TAMAÑO MAXIMO DE ARCHIVO PARA SUBIR AL SERVIDOR</w:t>
+      </w:r>
+    </w:p>
+    <w:p>
+      <w:r>
+        <w:t>En C:\Users\psand\curso-de-php-8-y-mysql-8\docker\nginx esta el fichero default.conf con la condiguracion del servidor nginx. El limite de tamaño de archivo para subir desde un formulario lo tiene en unos 1.400kb. Poniendo esta linea     client_max_body_size 20M; se aunmenta a 20Mb. Hay que ponerla en todos los server que salen.</w:t>
+      </w:r>
+    </w:p>
+    <w:p>
+      <w:pPr>
+        <w:jc w:val="center"/>
+        <w:rPr>
+          <w:b/>
+          <w:bCs/>
+        </w:rPr>
+      </w:pPr>
+      <w:r>
+        <w:rPr>
+          <w:b/>
+          <w:bCs/>
+        </w:rPr>
+        <w:t>PROBLEMA CON FIREFOX Y LA CACHE</w:t>
+      </w:r>
+    </w:p>
+    <w:p>
+      <w:pPr>
+        <w:jc w:val="both"/>
+      </w:pPr>
+      <w:r>
+        <w:t>Tengo mi hoja de estilos, y he creado botones y textos con mi hoja en la aplicación. Cada vez que modifico mi CSS tengo que pulsar CTRL+F5 en firefox para forzar a cargar mi css porque sino usa al antigui que tiene en cache y no me salen los cambios. Asi que le pongo en el link de carga de mi CSS esto al final del nombre</w:t>
+      </w:r>
+    </w:p>
+    <w:p>
+      <w:pPr>
+        <w:jc w:val="both"/>
+      </w:pPr>
+      <w:r>
+        <w:rPr>
+          <w:color w:val="FF0000"/>
+        </w:rPr>
+        <w:t>css/estilos.css?v=&lt;?=rand(1,100)</w:t>
+      </w:r>
+      <w:r>
+        <w:rPr>
+          <w:color w:val="FF0000"/>
+        </w:rPr>
+        <w:t>;</w:t>
+      </w:r>
+      <w:r>
+        <w:t xml:space="preserve"> genero un numoer aleatorio y lo añado al nombre del archivo y asi obligo a firefox a volver a cargar. </w:t>
+      </w:r>
+    </w:p>
+    <w:p>
+      <w:pPr>
+        <w:jc w:val="both"/>
+      </w:pPr>
+      <w:r>
+        <w:t>Pues a veces me cargaba la hoja bien aplicando mis estilos a todos mis elementos, otras veces me  cargaba solo unos pocos estilos y otras veces no me cargaba ninguno.</w:t>
+      </w:r>
+    </w:p>
+    <w:p>
+      <w:pPr>
+        <w:jc w:val="both"/>
+      </w:pPr>
+      <w:r>
+        <w:t>Despues de mucho buscar me doy cuenta de que al ponerle rand() cada vez que cambio de pagina en mi aplicación se genera un nuevo nombre de css y asi firefox tiene muchos cargados en cache con diferentes nombres v</w:t>
+      </w:r>
+      <w:r>
+        <w:t>=xxx. Que pasa que de todos los que tiene unos son correctos, otros antiguos y otros medio antiguos, por eso a veces de manera aleatoria carga bien, medio bien o no carga el estilo, dependiendo del numero generado por rand y si conincide con alguna version de las que hay en cache. Una locura, porque no seguia un patron fijo, la IA estaba loca dandome indicaciones. Al final lo he deducido yo de manera luminosa.</w:t>
+      </w:r>
+      <w:r>
+        <w:t xml:space="preserve"> He tenido que borrar la cache de firefox en ajustes/privaciodad y seguridad/cookies y datos de sitio/limpiar datos de sitio/archivos y paginas temporales</w:t>
+      </w:r>
+      <w:r>
+        <w:t>. Todo encaja, si entraba en la consola de firefox con F12 en network le daba a desactivar cache entonces funcionaba bien. En google crome no falla porque gestiona de otra manera la cache.</w:t>
+      </w:r>
+    </w:p>
+    <w:p>
+      <w:pPr>
+        <w:jc w:val="both"/>
+      </w:pPr>
+      <w:r>
+        <w:lastRenderedPageBreak/>
+        <w:t xml:space="preserve">La ia dice que en lugar de usar rand use </w:t>
+      </w:r>
+      <w:r>
+        <w:t>css/estilos.css?v=&lt;?=filemtime(__DIR__ . '/css/estilos.css')</w:t>
+      </w:r>
+      <w:r>
+        <w:t xml:space="preserve"> </w:t>
+      </w:r>
+      <w:r>
+        <w:t>filemtime() devuelve la fecha de la última modificación del archivo en segundos desde 1970.</w:t>
+      </w:r>
+      <w:r>
+        <w:t xml:space="preserve"> </w:t>
+      </w:r>
+    </w:p>
+    <w:p>
+      <w:pPr>
+        <w:jc w:val="both"/>
+      </w:pPr>
+      <w:r>
+        <w:t>  Cada vez que guardas cambios en estilos.css, el número cambia automáticamente.</w:t>
+      </w:r>
+    </w:p>
+    <w:p>
+      <w:pPr>
+        <w:jc w:val="both"/>
+      </w:pPr>
+      <w:r>
+        <w:t>  El navegador entiende que es un recurso nuevo y lo recarga.</w:t>
+      </w:r>
+    </w:p>
+    <w:p>
+      <w:pPr>
+        <w:jc w:val="both"/>
+      </w:pPr>
+      <w:r>
+        <w:t>  No necesitas CTRL+F5, ni usar números aleatorios.</w:t>
+      </w:r>
+    </w:p>
+    <w:p>
+      <w:pPr>
+        <w:jc w:val="both"/>
+      </w:pPr>
+      <w:r>
+        <w:t xml:space="preserve">Esto genera una nueva version solo si cambio algo en mi css. </w:t>
+      </w:r>
+      <w:r>
+        <w:t>Vamos a ver si funciona porque al final acabaran creandose versiones en la cache de mi css pero todas con diferente nombre asi que nunca cogera una version anterior a la ultima</w:t>
+      </w:r>
+      <w:r>
+        <w:t>.</w:t>
       </w:r>
     </w:p>
     <w:p>
@@ -13072,7 +13224,6 @@
   <w:style w:type="character" w:default="1" w:styleId="Fuentedeprrafopredeter">
     <w:name w:val="Default Paragraph Font"/>
     <w:uiPriority w:val="1"/>
-    <w:semiHidden/>
     <w:unhideWhenUsed/>
   </w:style>
   <w:style w:type="table" w:default="1" w:styleId="Tablanormal">

</xml_diff>

<commit_message>
descarga de fotos coche
</commit_message>
<xml_diff>
--- a/BASE DATOS EMPRESA/EMPRESA/FUNCIONAMIENTO DE TODO.docx
+++ b/BASE DATOS EMPRESA/EMPRESA/FUNCIONAMIENTO DE TODO.docx
@@ -11082,66 +11082,185 @@
       </w:pPr>
       <w:r>
         <w:lastRenderedPageBreak/>
-        <w:t xml:space="preserve">La ia dice que en lugar de usar rand use </w:t>
-      </w:r>
-      <w:r>
-        <w:t>css/estilos.css?v=&lt;?=filemtime(__DIR__ . '/css/estilos.css')</w:t>
+        <w:t xml:space="preserve">La ia dice que en lugar de usar rand use css/estilos.css?v=&lt;?=filemtime(__DIR__ . '/css/estilos.css') filemtime() devuelve la fecha de la última modificación del archivo en segundos desde 1970. </w:t>
+      </w:r>
+    </w:p>
+    <w:p>
+      <w:pPr>
+        <w:jc w:val="both"/>
+      </w:pPr>
+      <w:r>
+        <w:t>  Cada vez que guardas cambios en estilos.css, el número cambia automáticamente.</w:t>
+      </w:r>
+    </w:p>
+    <w:p>
+      <w:pPr>
+        <w:jc w:val="both"/>
+      </w:pPr>
+      <w:r>
+        <w:t>  El navegador entiende que es un recurso nuevo y lo recarga.</w:t>
+      </w:r>
+    </w:p>
+    <w:p>
+      <w:pPr>
+        <w:jc w:val="both"/>
+      </w:pPr>
+      <w:r>
+        <w:t>  No necesitas CTRL+F5, ni usar números aleatorios.</w:t>
+      </w:r>
+    </w:p>
+    <w:p>
+      <w:pPr>
+        <w:jc w:val="both"/>
+      </w:pPr>
+      <w:r>
+        <w:t xml:space="preserve">Esto genera una nueva version solo si cambio algo en mi css. </w:t>
+      </w:r>
+      <w:r>
+        <w:t>Vamos a ver si funciona porque al final acabaran creandose versiones en la cache de mi css pero todas con diferente nombre asi que nunca cogera una version anterior a la ultima</w:t>
+      </w:r>
+      <w:r>
+        <w:t>.</w:t>
+      </w:r>
+    </w:p>
+    <w:p>
+      <w:pPr>
+        <w:jc w:val="center"/>
+        <w:rPr>
+          <w:b/>
+          <w:bCs/>
+        </w:rPr>
+      </w:pPr>
+      <w:r>
+        <w:rPr>
+          <w:b/>
+          <w:bCs/>
+        </w:rPr>
+        <w:t>PASO PARA CREAR UNA NUEVA PAGINA DE MI APLICACIÓN EMPRESA</w:t>
+      </w:r>
+    </w:p>
+    <w:p>
+      <w:pPr>
+        <w:pStyle w:val="Prrafodelista"/>
+        <w:numPr>
+          <w:ilvl w:val="0"/>
+          <w:numId w:val="11"/>
+        </w:numPr>
+        <w:jc w:val="both"/>
+      </w:pPr>
+      <w:r>
+        <w:t>Crear el modelo de datos, es decir, la clase que se va a usar para hacer las lecturas de datos de la tabla mysql. Si esta pagina tiene campos relacionados con otras tablas habra que inlcuir en su modelo, un tipo de objeto que nos permita leer tambien datos de otras tablas donde esta relacionada. Por ejemplo la pagina vehiculo tambien lee los datos del propietario del vehiculo, asi que el modelo vehiculo incluye una variable que es un obejto de la clase entidad, para poder leer los datos del propietario del vehiculo que estan en la tabla entidad.</w:t>
+      </w:r>
+    </w:p>
+    <w:p>
+      <w:pPr>
+        <w:pStyle w:val="Prrafodelista"/>
+        <w:numPr>
+          <w:ilvl w:val="0"/>
+          <w:numId w:val="11"/>
+        </w:numPr>
+        <w:jc w:val="both"/>
+      </w:pPr>
+      <w:r>
+        <w:t>Crear la ruta en index para poder ver el listado de datos de ese nuevo modelo.</w:t>
+      </w:r>
+    </w:p>
+    <w:p>
+      <w:pPr>
+        <w:pStyle w:val="Prrafodelista"/>
+        <w:numPr>
+          <w:ilvl w:val="0"/>
+          <w:numId w:val="11"/>
+        </w:numPr>
+        <w:jc w:val="both"/>
+      </w:pPr>
+      <w:r>
+        <w:t>Si el listado va en una pagina existente porque son datos vinculados a otro dato, ir a dicha pagina y añadir el html para poder listar, y añadir el formulario para poder crear un nuevo registro. Si por el contrario es independiente hay que crear una pagina para el, donde solo se listan, no se crear el formulario para crear nuevo.</w:t>
+      </w:r>
+    </w:p>
+    <w:p>
+      <w:pPr>
+        <w:pStyle w:val="Prrafodelista"/>
+        <w:numPr>
+          <w:ilvl w:val="0"/>
+          <w:numId w:val="11"/>
+        </w:numPr>
+        <w:jc w:val="both"/>
+      </w:pPr>
+      <w:r>
+        <w:t>Crear el controler para listar. Si el listado va en una pagina de otros datos hay que ir al controler de los otros datos y solo hacer la llamada a metodos list del reposotory de este nuevo dato. Hay que añadir a este controlor lo necesario para acceder al reposirtory ya que el repositori si que ira en un nuevo archivo.php para este nuevo dato.</w:t>
+      </w:r>
+    </w:p>
+    <w:p>
+      <w:pPr>
+        <w:pStyle w:val="Prrafodelista"/>
+        <w:numPr>
+          <w:ilvl w:val="0"/>
+          <w:numId w:val="11"/>
+        </w:numPr>
+        <w:jc w:val="both"/>
+      </w:pPr>
+      <w:r>
+        <w:t>Crear el repository de este nuevo dato y la funcion list.</w:t>
+      </w:r>
+    </w:p>
+    <w:p>
+      <w:pPr>
+        <w:pStyle w:val="Prrafodelista"/>
+        <w:numPr>
+          <w:ilvl w:val="0"/>
+          <w:numId w:val="11"/>
+        </w:numPr>
+        <w:jc w:val="both"/>
+      </w:pPr>
+      <w:r>
+        <w:t>Probar que se visualiza el lsitado.</w:t>
+      </w:r>
+    </w:p>
+    <w:p>
+      <w:pPr>
+        <w:pStyle w:val="Prrafodelista"/>
+        <w:numPr>
+          <w:ilvl w:val="0"/>
+          <w:numId w:val="11"/>
+        </w:numPr>
+        <w:jc w:val="both"/>
+      </w:pPr>
+      <w:r>
+        <w:t>Crear ruta para añadir y si va en una pagina compartida ya tenemos el formulario creado y si no pues crear nueva pagina con crear datos.</w:t>
       </w:r>
       <w:r>
         <w:t xml:space="preserve"> </w:t>
       </w:r>
       <w:r>
-        <w:t>filemtime() devuelve la fecha de la última modificación del archivo en segundos desde 1970.</w:t>
-      </w:r>
-      <w:r>
-        <w:t xml:space="preserve"> </w:t>
-      </w:r>
-    </w:p>
-    <w:p>
-      <w:pPr>
-        <w:jc w:val="both"/>
-      </w:pPr>
-      <w:r>
-        <w:t>  Cada vez que guardas cambios en estilos.css, el número cambia automáticamente.</w:t>
-      </w:r>
-    </w:p>
-    <w:p>
-      <w:pPr>
-        <w:jc w:val="both"/>
-      </w:pPr>
-      <w:r>
-        <w:t>  El navegador entiende que es un recurso nuevo y lo recarga.</w:t>
-      </w:r>
-    </w:p>
-    <w:p>
-      <w:pPr>
-        <w:jc w:val="both"/>
-      </w:pPr>
-      <w:r>
-        <w:t>  No necesitas CTRL+F5, ni usar números aleatorios.</w:t>
-      </w:r>
-    </w:p>
-    <w:p>
-      <w:pPr>
-        <w:jc w:val="both"/>
-      </w:pPr>
-      <w:r>
-        <w:t xml:space="preserve">Esto genera una nueva version solo si cambio algo en mi css. </w:t>
-      </w:r>
-      <w:r>
-        <w:t>Vamos a ver si funciona porque al final acabaran creandose versiones en la cache de mi css pero todas con diferente nombre asi que nunca cogera una version anterior a la ultima</w:t>
-      </w:r>
-      <w:r>
-        <w:t>.</w:t>
-      </w:r>
-    </w:p>
-    <w:p>
-      <w:pPr>
-        <w:rPr>
-          <w:b/>
-          <w:bCs/>
-        </w:rPr>
-      </w:pPr>
+        <w:t>Añadir en el controller y repository del dato los metodos necesarios. En controller se llama save y hay se comprueba si es nuevo o edicion para llamar al repository create o update. No hace falta crear un metodo add en el repository y que alli vea si es edicion o creacion para bifurcar a create o update.</w:t>
+      </w:r>
+    </w:p>
+    <w:p>
+      <w:pPr>
+        <w:pStyle w:val="Prrafodelista"/>
+        <w:numPr>
+          <w:ilvl w:val="0"/>
+          <w:numId w:val="11"/>
+        </w:numPr>
+        <w:jc w:val="both"/>
+      </w:pPr>
+      <w:r>
+        <w:t>Añadir ruta para editar y añadir metodos edit.</w:t>
+      </w:r>
+    </w:p>
+    <w:p>
+      <w:pPr>
+        <w:pStyle w:val="Prrafodelista"/>
+        <w:numPr>
+          <w:ilvl w:val="0"/>
+          <w:numId w:val="11"/>
+        </w:numPr>
+        <w:jc w:val="both"/>
+      </w:pPr>
+      <w:r>
+        <w:t>Aladir ruta borrar y añadir metodos delete.</w:t>
+      </w:r>
     </w:p>
     <w:p/>
     <w:p/>
@@ -11962,7 +12081,7 @@
   <w:abstractNum w:abstractNumId="5" w15:restartNumberingAfterBreak="0">
     <w:nsid w:val="2EFB02CA"/>
     <w:multiLevelType w:val="hybridMultilevel"/>
-    <w:tmpl w:val="4E687C9E"/>
+    <w:tmpl w:val="942834CE"/>
     <w:lvl w:ilvl="0" w:tplc="0C0A000F">
       <w:start w:val="1"/>
       <w:numFmt w:val="decimal"/>
@@ -12138,6 +12257,95 @@
     </w:lvl>
   </w:abstractNum>
   <w:abstractNum w:abstractNumId="7" w15:restartNumberingAfterBreak="0">
+    <w:nsid w:val="51090EF7"/>
+    <w:multiLevelType w:val="hybridMultilevel"/>
+    <w:tmpl w:val="FE689D6C"/>
+    <w:lvl w:ilvl="0" w:tplc="0C0A000F">
+      <w:start w:val="1"/>
+      <w:numFmt w:val="decimal"/>
+      <w:lvlText w:val="%1."/>
+      <w:lvlJc w:val="left"/>
+      <w:pPr>
+        <w:ind w:left="360" w:hanging="360"/>
+      </w:pPr>
+      <w:rPr>
+        <w:rFonts w:hint="default"/>
+      </w:rPr>
+    </w:lvl>
+    <w:lvl w:ilvl="1" w:tplc="FFFFFFFF" w:tentative="1">
+      <w:start w:val="1"/>
+      <w:numFmt w:val="lowerLetter"/>
+      <w:lvlText w:val="%2."/>
+      <w:lvlJc w:val="left"/>
+      <w:pPr>
+        <w:ind w:left="1080" w:hanging="360"/>
+      </w:pPr>
+    </w:lvl>
+    <w:lvl w:ilvl="2" w:tplc="FFFFFFFF" w:tentative="1">
+      <w:start w:val="1"/>
+      <w:numFmt w:val="lowerRoman"/>
+      <w:lvlText w:val="%3."/>
+      <w:lvlJc w:val="right"/>
+      <w:pPr>
+        <w:ind w:left="1800" w:hanging="180"/>
+      </w:pPr>
+    </w:lvl>
+    <w:lvl w:ilvl="3" w:tplc="FFFFFFFF" w:tentative="1">
+      <w:start w:val="1"/>
+      <w:numFmt w:val="decimal"/>
+      <w:lvlText w:val="%4."/>
+      <w:lvlJc w:val="left"/>
+      <w:pPr>
+        <w:ind w:left="2520" w:hanging="360"/>
+      </w:pPr>
+    </w:lvl>
+    <w:lvl w:ilvl="4" w:tplc="FFFFFFFF" w:tentative="1">
+      <w:start w:val="1"/>
+      <w:numFmt w:val="lowerLetter"/>
+      <w:lvlText w:val="%5."/>
+      <w:lvlJc w:val="left"/>
+      <w:pPr>
+        <w:ind w:left="3240" w:hanging="360"/>
+      </w:pPr>
+    </w:lvl>
+    <w:lvl w:ilvl="5" w:tplc="FFFFFFFF" w:tentative="1">
+      <w:start w:val="1"/>
+      <w:numFmt w:val="lowerRoman"/>
+      <w:lvlText w:val="%6."/>
+      <w:lvlJc w:val="right"/>
+      <w:pPr>
+        <w:ind w:left="3960" w:hanging="180"/>
+      </w:pPr>
+    </w:lvl>
+    <w:lvl w:ilvl="6" w:tplc="FFFFFFFF" w:tentative="1">
+      <w:start w:val="1"/>
+      <w:numFmt w:val="decimal"/>
+      <w:lvlText w:val="%7."/>
+      <w:lvlJc w:val="left"/>
+      <w:pPr>
+        <w:ind w:left="4680" w:hanging="360"/>
+      </w:pPr>
+    </w:lvl>
+    <w:lvl w:ilvl="7" w:tplc="FFFFFFFF" w:tentative="1">
+      <w:start w:val="1"/>
+      <w:numFmt w:val="lowerLetter"/>
+      <w:lvlText w:val="%8."/>
+      <w:lvlJc w:val="left"/>
+      <w:pPr>
+        <w:ind w:left="5400" w:hanging="360"/>
+      </w:pPr>
+    </w:lvl>
+    <w:lvl w:ilvl="8" w:tplc="FFFFFFFF" w:tentative="1">
+      <w:start w:val="1"/>
+      <w:numFmt w:val="lowerRoman"/>
+      <w:lvlText w:val="%9."/>
+      <w:lvlJc w:val="right"/>
+      <w:pPr>
+        <w:ind w:left="6120" w:hanging="180"/>
+      </w:pPr>
+    </w:lvl>
+  </w:abstractNum>
+  <w:abstractNum w:abstractNumId="8" w15:restartNumberingAfterBreak="0">
     <w:nsid w:val="6DBD3631"/>
     <w:multiLevelType w:val="multilevel"/>
     <w:tmpl w:val="62ACF0FE"/>
@@ -12286,7 +12494,7 @@
       </w:rPr>
     </w:lvl>
   </w:abstractNum>
-  <w:abstractNum w:abstractNumId="8" w15:restartNumberingAfterBreak="0">
+  <w:abstractNum w:abstractNumId="9" w15:restartNumberingAfterBreak="0">
     <w:nsid w:val="6E1F78C9"/>
     <w:multiLevelType w:val="multilevel"/>
     <w:tmpl w:val="2B5609A0"/>
@@ -12435,7 +12643,7 @@
       </w:rPr>
     </w:lvl>
   </w:abstractNum>
-  <w:abstractNum w:abstractNumId="9" w15:restartNumberingAfterBreak="0">
+  <w:abstractNum w:abstractNumId="10" w15:restartNumberingAfterBreak="0">
     <w:nsid w:val="74762AC3"/>
     <w:multiLevelType w:val="multilevel"/>
     <w:tmpl w:val="28965F00"/>
@@ -12585,13 +12793,13 @@
     </w:lvl>
   </w:abstractNum>
   <w:num w:numId="1" w16cid:durableId="1766531474">
-    <w:abstractNumId w:val="7"/>
+    <w:abstractNumId w:val="8"/>
   </w:num>
   <w:num w:numId="2" w16cid:durableId="1585794975">
     <w:abstractNumId w:val="2"/>
   </w:num>
   <w:num w:numId="3" w16cid:durableId="1424642946">
-    <w:abstractNumId w:val="8"/>
+    <w:abstractNumId w:val="9"/>
   </w:num>
   <w:num w:numId="4" w16cid:durableId="202717371">
     <w:abstractNumId w:val="3"/>
@@ -12600,7 +12808,7 @@
     <w:abstractNumId w:val="4"/>
   </w:num>
   <w:num w:numId="6" w16cid:durableId="753549070">
-    <w:abstractNumId w:val="9"/>
+    <w:abstractNumId w:val="10"/>
   </w:num>
   <w:num w:numId="7" w16cid:durableId="1339042036">
     <w:abstractNumId w:val="1"/>
@@ -12613,6 +12821,9 @@
   </w:num>
   <w:num w:numId="10" w16cid:durableId="1359158530">
     <w:abstractNumId w:val="0"/>
+  </w:num>
+  <w:num w:numId="11" w16cid:durableId="1412117743">
+    <w:abstractNumId w:val="7"/>
   </w:num>
 </w:numbering>
 </file>
@@ -13224,6 +13435,7 @@
   <w:style w:type="character" w:default="1" w:styleId="Fuentedeprrafopredeter">
     <w:name w:val="Default Paragraph Font"/>
     <w:uiPriority w:val="1"/>
+    <w:semiHidden/>
     <w:unhideWhenUsed/>
   </w:style>
   <w:style w:type="table" w:default="1" w:styleId="Tablanormal">

</xml_diff>

<commit_message>
empiezo pagina analizar movimientos
</commit_message>
<xml_diff>
--- a/BASE DATOS EMPRESA/EMPRESA/FUNCIONAMIENTO DE TODO.docx
+++ b/BASE DATOS EMPRESA/EMPRESA/FUNCIONAMIENTO DE TODO.docx
@@ -11317,7 +11317,2063 @@
         <w:t>El nombre de un campo que es clave ajena se llamara como se tenga que llamar, nombre indicativo de su tabla, no tiene que tener nombre indecativo de la clave con la que sta relacionada. (campo propietario en vehiculos no se tiene que llamar idEntidad, se llama propietario) porque el nombre del campo en la tabla principal tiene un sentido pero en la tabla relacionada tiene otro sentido.</w:t>
       </w:r>
     </w:p>
-    <w:p/>
+    <w:p>
+      <w:r>
+        <w:t>CONSULTA SQL PARA VER LAS ENTREGAS Y DEVOLUCIONES DE UN MOVIMIENTO (PRESTAMO)</w:t>
+      </w:r>
+    </w:p>
+    <w:p>
+      <w:r>
+        <w:t>Esto es para leer las entregas de un movimiento y sumar el campo importe de todas las entregas</w:t>
+      </w:r>
+    </w:p>
+    <w:p>
+      <w:pPr>
+        <w:pStyle w:val="Sinespaciado"/>
+        <w:rPr>
+          <w:color w:val="EE0000"/>
+        </w:rPr>
+      </w:pPr>
+      <w:r>
+        <w:rPr>
+          <w:color w:val="EE0000"/>
+        </w:rPr>
+        <w:t xml:space="preserve">SELECT </w:t>
+      </w:r>
+    </w:p>
+    <w:p>
+      <w:pPr>
+        <w:pStyle w:val="Sinespaciado"/>
+        <w:rPr>
+          <w:color w:val="FF0000"/>
+        </w:rPr>
+      </w:pPr>
+      <w:r>
+        <w:rPr>
+          <w:color w:val="FF0000"/>
+        </w:rPr>
+        <w:t xml:space="preserve">    M.*,</w:t>
+      </w:r>
+    </w:p>
+    <w:p>
+      <w:pPr>
+        <w:pStyle w:val="Sinespaciado"/>
+        <w:rPr>
+          <w:color w:val="FF0000"/>
+        </w:rPr>
+      </w:pPr>
+      <w:r>
+        <w:rPr>
+          <w:color w:val="FF0000"/>
+        </w:rPr>
+        <w:t xml:space="preserve">    A.Nombre AS nombreEnvia,</w:t>
+      </w:r>
+    </w:p>
+    <w:p>
+      <w:pPr>
+        <w:pStyle w:val="Sinespaciado"/>
+        <w:rPr>
+          <w:color w:val="FF0000"/>
+        </w:rPr>
+      </w:pPr>
+      <w:r>
+        <w:rPr>
+          <w:color w:val="FF0000"/>
+        </w:rPr>
+        <w:t xml:space="preserve">    B.Nombre AS nombreRecibe,</w:t>
+      </w:r>
+    </w:p>
+    <w:p>
+      <w:pPr>
+        <w:pStyle w:val="Sinespaciado"/>
+        <w:rPr>
+          <w:color w:val="FF0000"/>
+        </w:rPr>
+      </w:pPr>
+      <w:r>
+        <w:rPr>
+          <w:color w:val="FF0000"/>
+        </w:rPr>
+        <w:t xml:space="preserve">    V.Marca_modelo,</w:t>
+      </w:r>
+    </w:p>
+    <w:p>
+      <w:pPr>
+        <w:pStyle w:val="Sinespaciado"/>
+        <w:rPr>
+          <w:color w:val="FF0000"/>
+        </w:rPr>
+      </w:pPr>
+      <w:r>
+        <w:rPr>
+          <w:color w:val="FF0000"/>
+        </w:rPr>
+        <w:t xml:space="preserve">    C.Nombre AS nombrePropietario,</w:t>
+      </w:r>
+    </w:p>
+    <w:p>
+      <w:pPr>
+        <w:pStyle w:val="Sinespaciado"/>
+      </w:pPr>
+      <w:r>
+        <w:rPr>
+          <w:color w:val="FF0000"/>
+        </w:rPr>
+        <w:t xml:space="preserve">    COALESCE(SUM(E.importe), 0) AS totalImporte</w:t>
+      </w:r>
+      <w:r>
+        <w:rPr>
+          <w:color w:val="FF0000"/>
+        </w:rPr>
+        <w:t xml:space="preserve"> --</w:t>
+      </w:r>
+      <w:r>
+        <w:t xml:space="preserve">COALESCE(SUM(E.importe),0) para que salga </w:t>
+      </w:r>
+      <w:r>
+        <w:rPr>
+          <w:b/>
+          <w:bCs/>
+        </w:rPr>
+        <w:t>0</w:t>
+      </w:r>
+      <w:r>
+        <w:t xml:space="preserve"> en vez de NULL.</w:t>
+      </w:r>
+    </w:p>
+    <w:p>
+      <w:pPr>
+        <w:pStyle w:val="Sinespaciado"/>
+        <w:rPr>
+          <w:color w:val="FF0000"/>
+        </w:rPr>
+      </w:pPr>
+      <w:r>
+        <w:rPr>
+          <w:color w:val="FF0000"/>
+        </w:rPr>
+        <w:t>FROM movimientos M</w:t>
+      </w:r>
+    </w:p>
+    <w:p>
+      <w:pPr>
+        <w:pStyle w:val="Sinespaciado"/>
+        <w:rPr>
+          <w:color w:val="FF0000"/>
+        </w:rPr>
+      </w:pPr>
+      <w:r>
+        <w:rPr>
+          <w:color w:val="FF0000"/>
+        </w:rPr>
+        <w:t>LEFT JOIN entidad A ON M.envia = A.id_entidad</w:t>
+      </w:r>
+    </w:p>
+    <w:p>
+      <w:pPr>
+        <w:pStyle w:val="Sinespaciado"/>
+        <w:rPr>
+          <w:color w:val="FF0000"/>
+        </w:rPr>
+      </w:pPr>
+      <w:r>
+        <w:rPr>
+          <w:color w:val="FF0000"/>
+        </w:rPr>
+        <w:t>LEFT JOIN entidad B ON M.recibe = B.id_entidad</w:t>
+      </w:r>
+    </w:p>
+    <w:p>
+      <w:pPr>
+        <w:pStyle w:val="Sinespaciado"/>
+        <w:rPr>
+          <w:color w:val="FF0000"/>
+        </w:rPr>
+      </w:pPr>
+      <w:r>
+        <w:rPr>
+          <w:color w:val="FF0000"/>
+        </w:rPr>
+        <w:t>LEFT JOIN vehiculos V ON M.vehiculo = V.id_vehiculo</w:t>
+      </w:r>
+    </w:p>
+    <w:p>
+      <w:pPr>
+        <w:pStyle w:val="Sinespaciado"/>
+        <w:rPr>
+          <w:color w:val="FF0000"/>
+        </w:rPr>
+      </w:pPr>
+      <w:r>
+        <w:rPr>
+          <w:color w:val="FF0000"/>
+        </w:rPr>
+        <w:t>LEFT JOIN entidad C ON V.propietario = C.id_entidad</w:t>
+      </w:r>
+    </w:p>
+    <w:p>
+      <w:pPr>
+        <w:pStyle w:val="Sinespaciado"/>
+        <w:rPr>
+          <w:color w:val="FF0000"/>
+        </w:rPr>
+      </w:pPr>
+      <w:r>
+        <w:rPr>
+          <w:color w:val="FF0000"/>
+        </w:rPr>
+        <w:t>LEFT JOIN entregas E ON M.idMovimiento = E.movimiento</w:t>
+      </w:r>
+    </w:p>
+    <w:p>
+      <w:pPr>
+        <w:pStyle w:val="Sinespaciado"/>
+      </w:pPr>
+      <w:r>
+        <w:rPr>
+          <w:color w:val="FF0000"/>
+        </w:rPr>
+        <w:t xml:space="preserve">GROUP BY </w:t>
+      </w:r>
+      <w:r>
+        <w:rPr>
+          <w:color w:val="FF0000"/>
+        </w:rPr>
+        <w:t xml:space="preserve"> </w:t>
+      </w:r>
+      <w:r>
+        <w:t>-- se agr</w:t>
+      </w:r>
+      <w:r>
+        <w:t>u</w:t>
+      </w:r>
+      <w:r>
+        <w:t>pa por el id del movimiento pero ademas hay que poner el resto de campos que queremos que solo salgan una vez que son todos los que aperecen al principio</w:t>
+      </w:r>
+    </w:p>
+    <w:p>
+      <w:pPr>
+        <w:pStyle w:val="Sinespaciado"/>
+        <w:rPr>
+          <w:color w:val="FF0000"/>
+        </w:rPr>
+      </w:pPr>
+      <w:r>
+        <w:rPr>
+          <w:color w:val="FF0000"/>
+        </w:rPr>
+        <w:t xml:space="preserve">    M.idMovimiento,   </w:t>
+      </w:r>
+      <w:r>
+        <w:t xml:space="preserve">-- Esto te devuelve </w:t>
+      </w:r>
+      <w:r>
+        <w:rPr>
+          <w:b/>
+          <w:bCs/>
+        </w:rPr>
+        <w:t>una fila por cada movimiento</w:t>
+      </w:r>
+      <w:r>
+        <w:t>, con todos los datos que ya tenías más la suma de importe de sus entregas.</w:t>
+      </w:r>
+    </w:p>
+    <w:p>
+      <w:pPr>
+        <w:pStyle w:val="Sinespaciado"/>
+        <w:rPr>
+          <w:color w:val="FF0000"/>
+        </w:rPr>
+      </w:pPr>
+      <w:r>
+        <w:rPr>
+          <w:color w:val="FF0000"/>
+        </w:rPr>
+        <w:t xml:space="preserve">    A.Nombre,</w:t>
+      </w:r>
+    </w:p>
+    <w:p>
+      <w:pPr>
+        <w:pStyle w:val="Sinespaciado"/>
+        <w:rPr>
+          <w:color w:val="FF0000"/>
+        </w:rPr>
+      </w:pPr>
+      <w:r>
+        <w:rPr>
+          <w:color w:val="FF0000"/>
+        </w:rPr>
+        <w:t xml:space="preserve">    B.Nombre,</w:t>
+      </w:r>
+    </w:p>
+    <w:p>
+      <w:pPr>
+        <w:pStyle w:val="Sinespaciado"/>
+        <w:rPr>
+          <w:color w:val="FF0000"/>
+        </w:rPr>
+      </w:pPr>
+      <w:r>
+        <w:rPr>
+          <w:color w:val="FF0000"/>
+        </w:rPr>
+        <w:t xml:space="preserve">    V.Marca_modelo,</w:t>
+      </w:r>
+    </w:p>
+    <w:p>
+      <w:pPr>
+        <w:pStyle w:val="Sinespaciado"/>
+        <w:rPr>
+          <w:color w:val="FF0000"/>
+        </w:rPr>
+      </w:pPr>
+      <w:r>
+        <w:rPr>
+          <w:color w:val="FF0000"/>
+        </w:rPr>
+        <w:t xml:space="preserve">    C.Nombre;</w:t>
+      </w:r>
+    </w:p>
+    <w:p>
+      <w:r>
+        <w:t>Para ver tmb la suma del importe de las devoluiones hay que hacerlo asi:</w:t>
+      </w:r>
+    </w:p>
+    <w:p>
+      <w:pPr>
+        <w:pStyle w:val="Sinespaciado"/>
+        <w:rPr>
+          <w:color w:val="EE0000"/>
+        </w:rPr>
+      </w:pPr>
+      <w:r>
+        <w:rPr>
+          <w:color w:val="EE0000"/>
+        </w:rPr>
+        <w:t xml:space="preserve">SELECT </w:t>
+      </w:r>
+    </w:p>
+    <w:p>
+      <w:pPr>
+        <w:pStyle w:val="Sinespaciado"/>
+        <w:rPr>
+          <w:color w:val="EE0000"/>
+        </w:rPr>
+      </w:pPr>
+      <w:r>
+        <w:rPr>
+          <w:color w:val="EE0000"/>
+        </w:rPr>
+        <w:t xml:space="preserve">    M.*,</w:t>
+      </w:r>
+    </w:p>
+    <w:p>
+      <w:pPr>
+        <w:pStyle w:val="Sinespaciado"/>
+        <w:rPr>
+          <w:color w:val="EE0000"/>
+        </w:rPr>
+      </w:pPr>
+      <w:r>
+        <w:rPr>
+          <w:color w:val="EE0000"/>
+        </w:rPr>
+        <w:t xml:space="preserve">    A.Nombre AS nombreEnvia,</w:t>
+      </w:r>
+    </w:p>
+    <w:p>
+      <w:pPr>
+        <w:pStyle w:val="Sinespaciado"/>
+        <w:rPr>
+          <w:color w:val="EE0000"/>
+        </w:rPr>
+      </w:pPr>
+      <w:r>
+        <w:rPr>
+          <w:color w:val="EE0000"/>
+        </w:rPr>
+        <w:t xml:space="preserve">    B.Nombre AS nombreRecibe,</w:t>
+      </w:r>
+    </w:p>
+    <w:p>
+      <w:pPr>
+        <w:pStyle w:val="Sinespaciado"/>
+        <w:rPr>
+          <w:color w:val="EE0000"/>
+        </w:rPr>
+      </w:pPr>
+      <w:r>
+        <w:rPr>
+          <w:color w:val="EE0000"/>
+        </w:rPr>
+        <w:t xml:space="preserve">    V.Marca_modelo,</w:t>
+      </w:r>
+    </w:p>
+    <w:p>
+      <w:pPr>
+        <w:pStyle w:val="Sinespaciado"/>
+        <w:rPr>
+          <w:color w:val="EE0000"/>
+        </w:rPr>
+      </w:pPr>
+      <w:r>
+        <w:rPr>
+          <w:color w:val="EE0000"/>
+        </w:rPr>
+        <w:t xml:space="preserve">    C.Nombre AS nombrePropietario,</w:t>
+      </w:r>
+    </w:p>
+    <w:p>
+      <w:pPr>
+        <w:pStyle w:val="Sinespaciado"/>
+        <w:rPr>
+          <w:color w:val="EE0000"/>
+        </w:rPr>
+      </w:pPr>
+      <w:r>
+        <w:rPr>
+          <w:color w:val="EE0000"/>
+        </w:rPr>
+        <w:lastRenderedPageBreak/>
+        <w:t xml:space="preserve">    COALESCE(E.totalImporte, 0) AS totalEntregas,</w:t>
+      </w:r>
+      <w:r>
+        <w:rPr>
+          <w:color w:val="EE0000"/>
+        </w:rPr>
+        <w:t xml:space="preserve"> </w:t>
+      </w:r>
+      <w:r>
+        <w:t>--aquí no hace falta hacer la suma, ya viene sumado</w:t>
+      </w:r>
+    </w:p>
+    <w:p>
+      <w:pPr>
+        <w:pStyle w:val="Sinespaciado"/>
+        <w:rPr>
+          <w:color w:val="EE0000"/>
+        </w:rPr>
+      </w:pPr>
+      <w:r>
+        <w:rPr>
+          <w:color w:val="EE0000"/>
+        </w:rPr>
+        <w:t xml:space="preserve">    COALESCE(D.totalImporte, 0) AS totalDevoluciones</w:t>
+      </w:r>
+    </w:p>
+    <w:p>
+      <w:pPr>
+        <w:pStyle w:val="Sinespaciado"/>
+        <w:rPr>
+          <w:color w:val="EE0000"/>
+        </w:rPr>
+      </w:pPr>
+      <w:r>
+        <w:rPr>
+          <w:color w:val="EE0000"/>
+        </w:rPr>
+        <w:t>FROM movimientos M</w:t>
+      </w:r>
+    </w:p>
+    <w:p>
+      <w:pPr>
+        <w:pStyle w:val="Sinespaciado"/>
+        <w:rPr>
+          <w:color w:val="EE0000"/>
+        </w:rPr>
+      </w:pPr>
+      <w:r>
+        <w:rPr>
+          <w:color w:val="EE0000"/>
+        </w:rPr>
+        <w:t>LEFT JOIN entidad A ON M.envia = A.id_entidad</w:t>
+      </w:r>
+    </w:p>
+    <w:p>
+      <w:pPr>
+        <w:pStyle w:val="Sinespaciado"/>
+        <w:rPr>
+          <w:color w:val="EE0000"/>
+        </w:rPr>
+      </w:pPr>
+      <w:r>
+        <w:rPr>
+          <w:color w:val="EE0000"/>
+        </w:rPr>
+        <w:t>LEFT JOIN entidad B ON M.recibe = B.id_entidad</w:t>
+      </w:r>
+    </w:p>
+    <w:p>
+      <w:pPr>
+        <w:pStyle w:val="Sinespaciado"/>
+        <w:rPr>
+          <w:color w:val="EE0000"/>
+        </w:rPr>
+      </w:pPr>
+      <w:r>
+        <w:rPr>
+          <w:color w:val="EE0000"/>
+        </w:rPr>
+        <w:t>LEFT JOIN vehiculos V ON M.vehiculo = V.id_vehiculo</w:t>
+      </w:r>
+    </w:p>
+    <w:p>
+      <w:pPr>
+        <w:pStyle w:val="Sinespaciado"/>
+        <w:rPr>
+          <w:color w:val="EE0000"/>
+        </w:rPr>
+      </w:pPr>
+      <w:r>
+        <w:rPr>
+          <w:color w:val="EE0000"/>
+        </w:rPr>
+        <w:t>LEFT JOIN entidad C ON V.propietario = C.id_entidad</w:t>
+      </w:r>
+    </w:p>
+    <w:p>
+      <w:pPr>
+        <w:pStyle w:val="Sinespaciado"/>
+      </w:pPr>
+      <w:r>
+        <w:t>-- subconsulta para sumar entregas</w:t>
+      </w:r>
+      <w:r>
+        <w:t>, no se pueden hacer dos GROUP BY en un mismo SELECT, asi que hace el select principal y despues otro select para cada GROUP BY</w:t>
+      </w:r>
+    </w:p>
+    <w:p>
+      <w:pPr>
+        <w:pStyle w:val="Sinespaciado"/>
+      </w:pPr>
+      <w:r>
+        <w:rPr>
+          <w:color w:val="EE0000"/>
+        </w:rPr>
+        <w:t xml:space="preserve">LEFT JOIN </w:t>
+      </w:r>
+      <w:r>
+        <w:rPr>
+          <w:color w:val="00B050"/>
+        </w:rPr>
+        <w:t>(</w:t>
+      </w:r>
+      <w:r>
+        <w:t>--hace LEFT JOIN de una subtabla que contiene todas las entregas del movimiento, agrupadas por movimiento y sumando el importe. Este select genera una unica linea</w:t>
+      </w:r>
+      <w:r>
+        <w:t xml:space="preserve"> con un campo moviento E.movimiento usado en este mismo LEFT </w:t>
+      </w:r>
+    </w:p>
+    <w:p>
+      <w:pPr>
+        <w:pStyle w:val="Sinespaciado"/>
+        <w:rPr>
+          <w:color w:val="00B050"/>
+        </w:rPr>
+      </w:pPr>
+      <w:r>
+        <w:rPr>
+          <w:color w:val="00B050"/>
+        </w:rPr>
+        <w:t xml:space="preserve">    SELECT movimiento, SUM(importe) AS totalImporte</w:t>
+      </w:r>
+      <w:r>
+        <w:rPr>
+          <w:color w:val="00B050"/>
+        </w:rPr>
+        <w:t xml:space="preserve"> </w:t>
+      </w:r>
+      <w:r>
+        <w:t>---esto es una subtabla y devuelve una fila con campo movimiento y suma importe y con esta subtabla hace el JOIN</w:t>
+      </w:r>
+    </w:p>
+    <w:p>
+      <w:pPr>
+        <w:pStyle w:val="Sinespaciado"/>
+        <w:rPr>
+          <w:color w:val="00B050"/>
+        </w:rPr>
+      </w:pPr>
+      <w:r>
+        <w:rPr>
+          <w:color w:val="00B050"/>
+        </w:rPr>
+        <w:t xml:space="preserve">    FROM entregas</w:t>
+      </w:r>
+    </w:p>
+    <w:p>
+      <w:pPr>
+        <w:pStyle w:val="Sinespaciado"/>
+        <w:rPr>
+          <w:color w:val="00B050"/>
+        </w:rPr>
+      </w:pPr>
+      <w:r>
+        <w:rPr>
+          <w:color w:val="00B050"/>
+        </w:rPr>
+        <w:t xml:space="preserve">    GROUP BY movimiento</w:t>
+      </w:r>
+    </w:p>
+    <w:p>
+      <w:pPr>
+        <w:pStyle w:val="Sinespaciado"/>
+        <w:rPr>
+          <w:color w:val="EE0000"/>
+        </w:rPr>
+      </w:pPr>
+      <w:r>
+        <w:rPr>
+          <w:color w:val="00B050"/>
+        </w:rPr>
+        <w:t>)</w:t>
+      </w:r>
+      <w:r>
+        <w:rPr>
+          <w:color w:val="002060"/>
+        </w:rPr>
+        <w:t xml:space="preserve"> </w:t>
+      </w:r>
+      <w:r>
+        <w:rPr>
+          <w:color w:val="EE0000"/>
+          <w:highlight w:val="yellow"/>
+        </w:rPr>
+        <w:t>E</w:t>
+      </w:r>
+      <w:r>
+        <w:rPr>
+          <w:color w:val="EE0000"/>
+        </w:rPr>
+        <w:t xml:space="preserve"> ON M.idMovimiento = </w:t>
+      </w:r>
+      <w:r>
+        <w:rPr>
+          <w:color w:val="EE0000"/>
+          <w:highlight w:val="yellow"/>
+        </w:rPr>
+        <w:t>E</w:t>
+      </w:r>
+      <w:r>
+        <w:rPr>
+          <w:color w:val="EE0000"/>
+        </w:rPr>
+        <w:t>.movimiento</w:t>
+      </w:r>
+    </w:p>
+    <w:p>
+      <w:pPr>
+        <w:pStyle w:val="Sinespaciado"/>
+        <w:rPr>
+          <w:color w:val="EE0000"/>
+        </w:rPr>
+      </w:pPr>
+    </w:p>
+    <w:p>
+      <w:pPr>
+        <w:pStyle w:val="Sinespaciado"/>
+      </w:pPr>
+      <w:r>
+        <w:t>-- subconsulta para sumar devoluciones</w:t>
+      </w:r>
+    </w:p>
+    <w:p>
+      <w:pPr>
+        <w:pStyle w:val="Sinespaciado"/>
+        <w:rPr>
+          <w:color w:val="00B050"/>
+        </w:rPr>
+      </w:pPr>
+      <w:r>
+        <w:rPr>
+          <w:color w:val="EE0000"/>
+        </w:rPr>
+        <w:t xml:space="preserve">LEFT </w:t>
+      </w:r>
+      <w:r>
+        <w:rPr>
+          <w:color w:val="00B050"/>
+        </w:rPr>
+        <w:t>JOIN (</w:t>
+      </w:r>
+    </w:p>
+    <w:p>
+      <w:pPr>
+        <w:pStyle w:val="Sinespaciado"/>
+        <w:rPr>
+          <w:color w:val="00B050"/>
+        </w:rPr>
+      </w:pPr>
+      <w:r>
+        <w:rPr>
+          <w:color w:val="00B050"/>
+        </w:rPr>
+        <w:t xml:space="preserve">    SELECT movimiento, SUM(importe) AS totalImporte</w:t>
+      </w:r>
+      <w:r>
+        <w:rPr>
+          <w:color w:val="00B050"/>
+        </w:rPr>
+        <w:t xml:space="preserve"> </w:t>
+      </w:r>
+      <w:r>
+        <w:t>–otra subtabla para hacer otro JOIN</w:t>
+      </w:r>
+    </w:p>
+    <w:p>
+      <w:pPr>
+        <w:pStyle w:val="Sinespaciado"/>
+        <w:rPr>
+          <w:color w:val="00B050"/>
+        </w:rPr>
+      </w:pPr>
+      <w:r>
+        <w:rPr>
+          <w:color w:val="00B050"/>
+        </w:rPr>
+        <w:t xml:space="preserve">    FROM devoluciones</w:t>
+      </w:r>
+    </w:p>
+    <w:p>
+      <w:pPr>
+        <w:pStyle w:val="Sinespaciado"/>
+        <w:rPr>
+          <w:color w:val="00B050"/>
+        </w:rPr>
+      </w:pPr>
+      <w:r>
+        <w:rPr>
+          <w:color w:val="00B050"/>
+        </w:rPr>
+        <w:t xml:space="preserve">    GROUP BY movimiento</w:t>
+      </w:r>
+    </w:p>
+    <w:p>
+      <w:pPr>
+        <w:pStyle w:val="Sinespaciado"/>
+        <w:rPr>
+          <w:color w:val="EE0000"/>
+        </w:rPr>
+      </w:pPr>
+      <w:r>
+        <w:rPr>
+          <w:color w:val="00B050"/>
+        </w:rPr>
+        <w:t xml:space="preserve">) </w:t>
+      </w:r>
+      <w:r>
+        <w:rPr>
+          <w:color w:val="EE0000"/>
+          <w:highlight w:val="yellow"/>
+        </w:rPr>
+        <w:t>D</w:t>
+      </w:r>
+      <w:r>
+        <w:rPr>
+          <w:color w:val="EE0000"/>
+        </w:rPr>
+        <w:t xml:space="preserve"> ON M.idMovimiento = </w:t>
+      </w:r>
+      <w:r>
+        <w:rPr>
+          <w:color w:val="EE0000"/>
+          <w:highlight w:val="yellow"/>
+        </w:rPr>
+        <w:t>D</w:t>
+      </w:r>
+      <w:r>
+        <w:rPr>
+          <w:color w:val="EE0000"/>
+        </w:rPr>
+        <w:t>.movimiento</w:t>
+      </w:r>
+    </w:p>
+    <w:p>
+      <w:pPr>
+        <w:pStyle w:val="Sinespaciado"/>
+        <w:rPr>
+          <w:color w:val="EE0000"/>
+        </w:rPr>
+      </w:pPr>
+    </w:p>
+    <w:p>
+      <w:pPr>
+        <w:pStyle w:val="Sinespaciado"/>
+        <w:rPr>
+          <w:color w:val="EE0000"/>
+        </w:rPr>
+      </w:pPr>
+      <w:r>
+        <w:rPr>
+          <w:color w:val="EE0000"/>
+        </w:rPr>
+        <w:t xml:space="preserve">GROUP BY </w:t>
+      </w:r>
+    </w:p>
+    <w:p>
+      <w:pPr>
+        <w:pStyle w:val="Sinespaciado"/>
+        <w:rPr>
+          <w:color w:val="EE0000"/>
+        </w:rPr>
+      </w:pPr>
+      <w:r>
+        <w:rPr>
+          <w:color w:val="EE0000"/>
+        </w:rPr>
+        <w:t xml:space="preserve">    M.idMovimiento,   </w:t>
+      </w:r>
+    </w:p>
+    <w:p>
+      <w:pPr>
+        <w:pStyle w:val="Sinespaciado"/>
+        <w:rPr>
+          <w:color w:val="EE0000"/>
+        </w:rPr>
+      </w:pPr>
+      <w:r>
+        <w:rPr>
+          <w:color w:val="EE0000"/>
+        </w:rPr>
+        <w:t xml:space="preserve">    A.Nombre,</w:t>
+      </w:r>
+    </w:p>
+    <w:p>
+      <w:pPr>
+        <w:pStyle w:val="Sinespaciado"/>
+        <w:rPr>
+          <w:color w:val="EE0000"/>
+        </w:rPr>
+      </w:pPr>
+      <w:r>
+        <w:rPr>
+          <w:color w:val="EE0000"/>
+        </w:rPr>
+        <w:t xml:space="preserve">    B.Nombre,</w:t>
+      </w:r>
+    </w:p>
+    <w:p>
+      <w:pPr>
+        <w:pStyle w:val="Sinespaciado"/>
+        <w:rPr>
+          <w:color w:val="EE0000"/>
+        </w:rPr>
+      </w:pPr>
+      <w:r>
+        <w:rPr>
+          <w:color w:val="EE0000"/>
+        </w:rPr>
+        <w:t xml:space="preserve">    V.Marca_modelo,</w:t>
+      </w:r>
+    </w:p>
+    <w:p>
+      <w:pPr>
+        <w:pStyle w:val="Sinespaciado"/>
+        <w:rPr>
+          <w:color w:val="EE0000"/>
+        </w:rPr>
+      </w:pPr>
+      <w:r>
+        <w:rPr>
+          <w:color w:val="EE0000"/>
+        </w:rPr>
+        <w:t xml:space="preserve">    C.Nombre;</w:t>
+      </w:r>
+      <w:r>
+        <w:rPr>
+          <w:color w:val="EE0000"/>
+        </w:rPr>
+        <w:t xml:space="preserve"> </w:t>
+      </w:r>
+    </w:p>
+    <w:p>
+      <w:pPr>
+        <w:pStyle w:val="Sinespaciado"/>
+        <w:rPr>
+          <w:color w:val="EE0000"/>
+        </w:rPr>
+      </w:pPr>
+    </w:p>
+    <w:p>
+      <w:pPr>
+        <w:pStyle w:val="Sinespaciado"/>
+      </w:pPr>
+      <w:r>
+        <w:t>En resumen son varios JOIN algunos de ellos con subtablas en lugar de con tablas</w:t>
+      </w:r>
+    </w:p>
+    <w:p>
+      <w:pPr>
+        <w:pStyle w:val="Sinespaciado"/>
+      </w:pPr>
+      <w:r>
+        <w:t xml:space="preserve">  Uso </w:t>
+      </w:r>
+      <w:r>
+        <w:rPr>
+          <w:b/>
+          <w:bCs/>
+        </w:rPr>
+        <w:t>subconsultas agregadas</w:t>
+      </w:r>
+      <w:r>
+        <w:t xml:space="preserve"> (SUM(importe) GROUP BY movimiento) para cada tabla hija.</w:t>
+      </w:r>
+    </w:p>
+    <w:p>
+      <w:pPr>
+        <w:pStyle w:val="Sinespaciado"/>
+      </w:pPr>
+      <w:r>
+        <w:t>  Así evitamos que al hacer un JOIN directo con ambas tablas se multipliquen las filas (efecto "producto cartesiano").</w:t>
+      </w:r>
+    </w:p>
+    <w:p>
+      <w:pPr>
+        <w:pStyle w:val="Sinespaciado"/>
+      </w:pPr>
+      <w:r>
+        <w:t>  Cada subconsulta ya viene con su suma lista, y se une solo por idMovimiento.</w:t>
+      </w:r>
+    </w:p>
+    <w:p>
+      <w:pPr>
+        <w:pStyle w:val="Sinespaciado"/>
+      </w:pPr>
+      <w:r>
+        <w:t xml:space="preserve">  Luego simplemente uso COALESCE(...,0) para que los casos sin entregas o devoluciones salgan con </w:t>
+      </w:r>
+      <w:r>
+        <w:rPr>
+          <w:b/>
+          <w:bCs/>
+        </w:rPr>
+        <w:t>0</w:t>
+      </w:r>
+      <w:r>
+        <w:t>.</w:t>
+      </w:r>
+    </w:p>
+    <w:p>
+      <w:pPr>
+        <w:pStyle w:val="Sinespaciado"/>
+        <w:rPr>
+          <w:color w:val="EE0000"/>
+        </w:rPr>
+      </w:pPr>
+      <w:r>
+        <w:t>Añadiendo esta linea tendriamos la diferencia:</w:t>
+      </w:r>
+      <w:r>
+        <w:rPr>
+          <w:color w:val="EE0000"/>
+        </w:rPr>
+        <w:t xml:space="preserve"> </w:t>
+      </w:r>
+      <w:r>
+        <w:rPr>
+          <w:color w:val="EE0000"/>
+        </w:rPr>
+        <w:t>COALESCE(E.totalImporte, 0) - COALESCE(D.totalImporte, 0) AS diferencia</w:t>
+      </w:r>
+    </w:p>
+    <w:p>
+      <w:pPr>
+        <w:pStyle w:val="Sinespaciado"/>
+        <w:rPr>
+          <w:b/>
+          <w:bCs/>
+        </w:rPr>
+      </w:pPr>
+      <w:r>
+        <w:rPr>
+          <w:b/>
+          <w:bCs/>
+        </w:rPr>
+        <w:t>C</w:t>
+      </w:r>
+      <w:r>
+        <w:rPr>
+          <w:b/>
+          <w:bCs/>
+        </w:rPr>
+        <w:t>onsulta: movimientos + entregas + devoluciones</w:t>
+      </w:r>
+    </w:p>
+    <w:p>
+      <w:pPr>
+        <w:pStyle w:val="Sinespaciado"/>
+        <w:rPr>
+          <w:b/>
+          <w:bCs/>
+        </w:rPr>
+      </w:pPr>
+      <w:r>
+        <w:rPr>
+          <w:rFonts w:ascii="Segoe UI Emoji" w:hAnsi="Segoe UI Emoji" w:cs="Segoe UI Emoji"/>
+          <w:b/>
+          <w:bCs/>
+        </w:rPr>
+        <w:lastRenderedPageBreak/>
+        <w:t>🔹</w:t>
+      </w:r>
+      <w:r>
+        <w:rPr>
+          <w:b/>
+          <w:bCs/>
+        </w:rPr>
+        <w:t xml:space="preserve"> Tablas principales</w:t>
+      </w:r>
+    </w:p>
+    <w:p>
+      <w:pPr>
+        <w:pStyle w:val="Sinespaciado"/>
+        <w:numPr>
+          <w:ilvl w:val="0"/>
+          <w:numId w:val="12"/>
+        </w:numPr>
+      </w:pPr>
+      <w:r>
+        <w:rPr>
+          <w:b/>
+          <w:bCs/>
+        </w:rPr>
+        <w:t>movimientos (M)</w:t>
+      </w:r>
+      <w:r>
+        <w:t xml:space="preserve"> → tabla principal, 1 fila por movimiento.</w:t>
+      </w:r>
+    </w:p>
+    <w:p>
+      <w:pPr>
+        <w:pStyle w:val="Sinespaciado"/>
+        <w:numPr>
+          <w:ilvl w:val="0"/>
+          <w:numId w:val="12"/>
+        </w:numPr>
+      </w:pPr>
+      <w:r>
+        <w:rPr>
+          <w:b/>
+          <w:bCs/>
+        </w:rPr>
+        <w:t>entregas (E)</w:t>
+      </w:r>
+      <w:r>
+        <w:t xml:space="preserve"> → relacionada con movimientos (1:N), contiene importe.</w:t>
+      </w:r>
+    </w:p>
+    <w:p>
+      <w:pPr>
+        <w:pStyle w:val="Sinespaciado"/>
+        <w:numPr>
+          <w:ilvl w:val="0"/>
+          <w:numId w:val="12"/>
+        </w:numPr>
+      </w:pPr>
+      <w:r>
+        <w:rPr>
+          <w:b/>
+          <w:bCs/>
+        </w:rPr>
+        <w:t>devoluciones (D)</w:t>
+      </w:r>
+      <w:r>
+        <w:t xml:space="preserve"> → relacionada con movimientos (1:N), contiene importe.</w:t>
+      </w:r>
+    </w:p>
+    <w:p>
+      <w:pPr>
+        <w:pStyle w:val="Sinespaciado"/>
+      </w:pPr>
+      <w:r>
+        <w:pict w14:anchorId="3584FB60">
+          <v:rect id="_x0000_i1031" style="width:0;height:1.5pt" o:hralign="center" o:hrstd="t" o:hr="t" fillcolor="#a0a0a0" stroked="f"/>
+        </w:pict>
+      </w:r>
+    </w:p>
+    <w:p>
+      <w:pPr>
+        <w:pStyle w:val="Sinespaciado"/>
+        <w:rPr>
+          <w:b/>
+          <w:bCs/>
+        </w:rPr>
+      </w:pPr>
+      <w:r>
+        <w:rPr>
+          <w:rFonts w:ascii="Segoe UI Emoji" w:hAnsi="Segoe UI Emoji" w:cs="Segoe UI Emoji"/>
+          <w:b/>
+          <w:bCs/>
+        </w:rPr>
+        <w:t>🔹</w:t>
+      </w:r>
+      <w:r>
+        <w:rPr>
+          <w:b/>
+          <w:bCs/>
+        </w:rPr>
+        <w:t xml:space="preserve"> Qué devuelve la consulta</w:t>
+      </w:r>
+    </w:p>
+    <w:p>
+      <w:pPr>
+        <w:pStyle w:val="Sinespaciado"/>
+        <w:numPr>
+          <w:ilvl w:val="0"/>
+          <w:numId w:val="13"/>
+        </w:numPr>
+      </w:pPr>
+      <w:r>
+        <w:rPr>
+          <w:b/>
+          <w:bCs/>
+        </w:rPr>
+        <w:t>Datos del movimiento (M.*)</w:t>
+      </w:r>
+    </w:p>
+    <w:p>
+      <w:pPr>
+        <w:pStyle w:val="Sinespaciado"/>
+        <w:numPr>
+          <w:ilvl w:val="1"/>
+          <w:numId w:val="13"/>
+        </w:numPr>
+      </w:pPr>
+      <w:r>
+        <w:t>Más información de entidad (envía / recibe / propietario).</w:t>
+      </w:r>
+    </w:p>
+    <w:p>
+      <w:pPr>
+        <w:pStyle w:val="Sinespaciado"/>
+        <w:numPr>
+          <w:ilvl w:val="1"/>
+          <w:numId w:val="13"/>
+        </w:numPr>
+      </w:pPr>
+      <w:r>
+        <w:t>Más información de vehiculos.</w:t>
+      </w:r>
+    </w:p>
+    <w:p>
+      <w:pPr>
+        <w:pStyle w:val="Sinespaciado"/>
+        <w:numPr>
+          <w:ilvl w:val="0"/>
+          <w:numId w:val="13"/>
+        </w:numPr>
+      </w:pPr>
+      <w:r>
+        <w:rPr>
+          <w:b/>
+          <w:bCs/>
+        </w:rPr>
+        <w:t>Cálculos agregados:</w:t>
+      </w:r>
+    </w:p>
+    <w:p>
+      <w:pPr>
+        <w:pStyle w:val="Sinespaciado"/>
+        <w:numPr>
+          <w:ilvl w:val="1"/>
+          <w:numId w:val="13"/>
+        </w:numPr>
+      </w:pPr>
+      <w:r>
+        <w:t>totalEntregas → suma de importe en entregas del movimiento.</w:t>
+      </w:r>
+    </w:p>
+    <w:p>
+      <w:pPr>
+        <w:pStyle w:val="Sinespaciado"/>
+        <w:numPr>
+          <w:ilvl w:val="1"/>
+          <w:numId w:val="13"/>
+        </w:numPr>
+      </w:pPr>
+      <w:r>
+        <w:t>totalDevoluciones → suma de importe en devoluciones del movimiento.</w:t>
+      </w:r>
+    </w:p>
+    <w:p>
+      <w:pPr>
+        <w:pStyle w:val="Sinespaciado"/>
+        <w:numPr>
+          <w:ilvl w:val="1"/>
+          <w:numId w:val="13"/>
+        </w:numPr>
+      </w:pPr>
+      <w:r>
+        <w:t>diferencia → totalEntregas - totalDevoluciones.</w:t>
+      </w:r>
+    </w:p>
+    <w:p>
+      <w:pPr>
+        <w:spacing w:before="100" w:beforeAutospacing="1" w:after="100" w:afterAutospacing="1" w:line="240" w:lineRule="auto"/>
+        <w:rPr>
+          <w:rFonts w:ascii="Times New Roman" w:eastAsia="Times New Roman" w:hAnsi="Times New Roman" w:cs="Times New Roman"/>
+          <w:noProof w:val="0"/>
+          <w:kern w:val="0"/>
+          <w:sz w:val="24"/>
+          <w:szCs w:val="24"/>
+          <w:lang w:eastAsia="es-ES"/>
+          <w14:ligatures w14:val="none"/>
+        </w:rPr>
+      </w:pPr>
+      <w:r>
+        <w:rPr>
+          <w:rFonts w:ascii="Times New Roman" w:eastAsia="Times New Roman" w:hAnsi="Times New Roman" w:cs="Times New Roman"/>
+          <w:b/>
+          <w:bCs/>
+          <w:noProof w:val="0"/>
+          <w:kern w:val="0"/>
+          <w:sz w:val="24"/>
+          <w:szCs w:val="24"/>
+          <w:lang w:eastAsia="es-ES"/>
+          <w14:ligatures w14:val="none"/>
+        </w:rPr>
+        <w:t>Idea clave:</w:t>
+      </w:r>
+    </w:p>
+    <w:p>
+      <w:pPr>
+        <w:numPr>
+          <w:ilvl w:val="0"/>
+          <w:numId w:val="13"/>
+        </w:numPr>
+        <w:spacing w:before="100" w:beforeAutospacing="1" w:after="100" w:afterAutospacing="1" w:line="240" w:lineRule="auto"/>
+        <w:rPr>
+          <w:rFonts w:ascii="Times New Roman" w:eastAsia="Times New Roman" w:hAnsi="Times New Roman" w:cs="Times New Roman"/>
+          <w:noProof w:val="0"/>
+          <w:kern w:val="0"/>
+          <w:sz w:val="24"/>
+          <w:szCs w:val="24"/>
+          <w:lang w:eastAsia="es-ES"/>
+          <w14:ligatures w14:val="none"/>
+        </w:rPr>
+      </w:pPr>
+      <w:r>
+        <w:rPr>
+          <w:rFonts w:ascii="Times New Roman" w:eastAsia="Times New Roman" w:hAnsi="Times New Roman" w:cs="Times New Roman"/>
+          <w:noProof w:val="0"/>
+          <w:kern w:val="0"/>
+          <w:sz w:val="24"/>
+          <w:szCs w:val="24"/>
+          <w:lang w:eastAsia="es-ES"/>
+          <w14:ligatures w14:val="none"/>
+        </w:rPr>
+        <w:t>Cada subconsulta (</w:t>
+      </w:r>
+      <w:r>
+        <w:rPr>
+          <w:rFonts w:ascii="Courier New" w:eastAsia="Times New Roman" w:hAnsi="Courier New" w:cs="Courier New"/>
+          <w:noProof w:val="0"/>
+          <w:kern w:val="0"/>
+          <w:sz w:val="20"/>
+          <w:szCs w:val="20"/>
+          <w:lang w:eastAsia="es-ES"/>
+          <w14:ligatures w14:val="none"/>
+        </w:rPr>
+        <w:t>E</w:t>
+      </w:r>
+      <w:r>
+        <w:rPr>
+          <w:rFonts w:ascii="Times New Roman" w:eastAsia="Times New Roman" w:hAnsi="Times New Roman" w:cs="Times New Roman"/>
+          <w:noProof w:val="0"/>
+          <w:kern w:val="0"/>
+          <w:sz w:val="24"/>
+          <w:szCs w:val="24"/>
+          <w:lang w:eastAsia="es-ES"/>
+          <w14:ligatures w14:val="none"/>
+        </w:rPr>
+        <w:t xml:space="preserve"> y </w:t>
+      </w:r>
+      <w:r>
+        <w:rPr>
+          <w:rFonts w:ascii="Courier New" w:eastAsia="Times New Roman" w:hAnsi="Courier New" w:cs="Courier New"/>
+          <w:noProof w:val="0"/>
+          <w:kern w:val="0"/>
+          <w:sz w:val="20"/>
+          <w:szCs w:val="20"/>
+          <w:lang w:eastAsia="es-ES"/>
+          <w14:ligatures w14:val="none"/>
+        </w:rPr>
+        <w:t>D</w:t>
+      </w:r>
+      <w:r>
+        <w:rPr>
+          <w:rFonts w:ascii="Times New Roman" w:eastAsia="Times New Roman" w:hAnsi="Times New Roman" w:cs="Times New Roman"/>
+          <w:noProof w:val="0"/>
+          <w:kern w:val="0"/>
+          <w:sz w:val="24"/>
+          <w:szCs w:val="24"/>
+          <w:lang w:eastAsia="es-ES"/>
+          <w14:ligatures w14:val="none"/>
+        </w:rPr>
+        <w:t xml:space="preserve">) ya viene “resumida” con la suma por </w:t>
+      </w:r>
+      <w:r>
+        <w:rPr>
+          <w:rFonts w:ascii="Courier New" w:eastAsia="Times New Roman" w:hAnsi="Courier New" w:cs="Courier New"/>
+          <w:noProof w:val="0"/>
+          <w:kern w:val="0"/>
+          <w:sz w:val="20"/>
+          <w:szCs w:val="20"/>
+          <w:lang w:eastAsia="es-ES"/>
+          <w14:ligatures w14:val="none"/>
+        </w:rPr>
+        <w:t>movimiento</w:t>
+      </w:r>
+      <w:r>
+        <w:rPr>
+          <w:rFonts w:ascii="Times New Roman" w:eastAsia="Times New Roman" w:hAnsi="Times New Roman" w:cs="Times New Roman"/>
+          <w:noProof w:val="0"/>
+          <w:kern w:val="0"/>
+          <w:sz w:val="24"/>
+          <w:szCs w:val="24"/>
+          <w:lang w:eastAsia="es-ES"/>
+          <w14:ligatures w14:val="none"/>
+        </w:rPr>
+        <w:t>.</w:t>
+      </w:r>
+    </w:p>
+    <w:p>
+      <w:pPr>
+        <w:numPr>
+          <w:ilvl w:val="0"/>
+          <w:numId w:val="13"/>
+        </w:numPr>
+        <w:spacing w:before="100" w:beforeAutospacing="1" w:after="100" w:afterAutospacing="1" w:line="240" w:lineRule="auto"/>
+        <w:rPr>
+          <w:rFonts w:ascii="Times New Roman" w:eastAsia="Times New Roman" w:hAnsi="Times New Roman" w:cs="Times New Roman"/>
+          <w:noProof w:val="0"/>
+          <w:kern w:val="0"/>
+          <w:sz w:val="24"/>
+          <w:szCs w:val="24"/>
+          <w:lang w:eastAsia="es-ES"/>
+          <w14:ligatures w14:val="none"/>
+        </w:rPr>
+      </w:pPr>
+      <w:r>
+        <w:rPr>
+          <w:rFonts w:ascii="Times New Roman" w:eastAsia="Times New Roman" w:hAnsi="Times New Roman" w:cs="Times New Roman"/>
+          <w:noProof w:val="0"/>
+          <w:kern w:val="0"/>
+          <w:sz w:val="24"/>
+          <w:szCs w:val="24"/>
+          <w:lang w:eastAsia="es-ES"/>
+          <w14:ligatures w14:val="none"/>
+        </w:rPr>
+        <w:t xml:space="preserve">Luego solo se enlaza a </w:t>
+      </w:r>
+      <w:r>
+        <w:rPr>
+          <w:rFonts w:ascii="Courier New" w:eastAsia="Times New Roman" w:hAnsi="Courier New" w:cs="Courier New"/>
+          <w:noProof w:val="0"/>
+          <w:kern w:val="0"/>
+          <w:sz w:val="20"/>
+          <w:szCs w:val="20"/>
+          <w:lang w:eastAsia="es-ES"/>
+          <w14:ligatures w14:val="none"/>
+        </w:rPr>
+        <w:t>movimientos</w:t>
+      </w:r>
+      <w:r>
+        <w:rPr>
+          <w:rFonts w:ascii="Times New Roman" w:eastAsia="Times New Roman" w:hAnsi="Times New Roman" w:cs="Times New Roman"/>
+          <w:noProof w:val="0"/>
+          <w:kern w:val="0"/>
+          <w:sz w:val="24"/>
+          <w:szCs w:val="24"/>
+          <w:lang w:eastAsia="es-ES"/>
+          <w14:ligatures w14:val="none"/>
+        </w:rPr>
+        <w:t xml:space="preserve"> → garantizando 1 fila por movimiento.</w:t>
+      </w:r>
+    </w:p>
+    <w:p>
+      <w:pPr>
+        <w:numPr>
+          <w:ilvl w:val="0"/>
+          <w:numId w:val="13"/>
+        </w:numPr>
+        <w:spacing w:before="100" w:beforeAutospacing="1" w:after="100" w:afterAutospacing="1" w:line="240" w:lineRule="auto"/>
+        <w:rPr>
+          <w:rFonts w:ascii="Times New Roman" w:eastAsia="Times New Roman" w:hAnsi="Times New Roman" w:cs="Times New Roman"/>
+          <w:noProof w:val="0"/>
+          <w:kern w:val="0"/>
+          <w:sz w:val="24"/>
+          <w:szCs w:val="24"/>
+          <w:lang w:eastAsia="es-ES"/>
+          <w14:ligatures w14:val="none"/>
+        </w:rPr>
+      </w:pPr>
+      <w:r>
+        <w:rPr>
+          <w:rFonts w:ascii="Times New Roman" w:eastAsia="Times New Roman" w:hAnsi="Times New Roman" w:cs="Times New Roman"/>
+          <w:noProof w:val="0"/>
+          <w:kern w:val="0"/>
+          <w:sz w:val="24"/>
+          <w:szCs w:val="24"/>
+          <w:lang w:eastAsia="es-ES"/>
+          <w14:ligatures w14:val="none"/>
+        </w:rPr>
+        <w:t xml:space="preserve">Con </w:t>
+      </w:r>
+      <w:r>
+        <w:rPr>
+          <w:rFonts w:ascii="Courier New" w:eastAsia="Times New Roman" w:hAnsi="Courier New" w:cs="Courier New"/>
+          <w:noProof w:val="0"/>
+          <w:kern w:val="0"/>
+          <w:sz w:val="20"/>
+          <w:szCs w:val="20"/>
+          <w:lang w:eastAsia="es-ES"/>
+          <w14:ligatures w14:val="none"/>
+        </w:rPr>
+        <w:t>COALESCE(...,0)</w:t>
+      </w:r>
+      <w:r>
+        <w:rPr>
+          <w:rFonts w:ascii="Times New Roman" w:eastAsia="Times New Roman" w:hAnsi="Times New Roman" w:cs="Times New Roman"/>
+          <w:noProof w:val="0"/>
+          <w:kern w:val="0"/>
+          <w:sz w:val="24"/>
+          <w:szCs w:val="24"/>
+          <w:lang w:eastAsia="es-ES"/>
+          <w14:ligatures w14:val="none"/>
+        </w:rPr>
+        <w:t xml:space="preserve"> evitas que salgan </w:t>
+      </w:r>
+      <w:r>
+        <w:rPr>
+          <w:rFonts w:ascii="Courier New" w:eastAsia="Times New Roman" w:hAnsi="Courier New" w:cs="Courier New"/>
+          <w:noProof w:val="0"/>
+          <w:kern w:val="0"/>
+          <w:sz w:val="20"/>
+          <w:szCs w:val="20"/>
+          <w:lang w:eastAsia="es-ES"/>
+          <w14:ligatures w14:val="none"/>
+        </w:rPr>
+        <w:t>NULL</w:t>
+      </w:r>
+      <w:r>
+        <w:rPr>
+          <w:rFonts w:ascii="Times New Roman" w:eastAsia="Times New Roman" w:hAnsi="Times New Roman" w:cs="Times New Roman"/>
+          <w:noProof w:val="0"/>
+          <w:kern w:val="0"/>
+          <w:sz w:val="24"/>
+          <w:szCs w:val="24"/>
+          <w:lang w:eastAsia="es-ES"/>
+          <w14:ligatures w14:val="none"/>
+        </w:rPr>
+        <w:t xml:space="preserve"> si no hay entregas/devoluciones.</w:t>
+      </w:r>
+    </w:p>
+    <w:p>
+      <w:pPr>
+        <w:pStyle w:val="Sinespaciado"/>
+      </w:pPr>
+      <w:r>
+        <w:t>Esto es lo mismo pero otra manera sin usar GROUPBY. En el anterior tipo, el GROUP BY que hay dentro del sub select, es para conseguir que salga una unica fila con la suma del importe, genera todas las entregas de un movimiento, las agrupa por suma importe y luego genera una unica fila que con el LEFT JOIN se une al SELECT principal. LEFT necesita unir una unica fila al SELECT principal.</w:t>
+      </w:r>
+    </w:p>
+    <w:p>
+      <w:pPr>
+        <w:pStyle w:val="Sinespaciado"/>
+      </w:pPr>
+      <w:r>
+        <w:t>En este nu</w:t>
+      </w:r>
+      <w:r>
+        <w:t>e</w:t>
+      </w:r>
+      <w:r>
+        <w:t>vo tipo, no hace group porque hace el subselect dentro del select pricipal, y con el WHERE</w:t>
+      </w:r>
+      <w:r>
+        <w:t xml:space="preserve"> y el subselect ya consigue una unica fila con la suma</w:t>
+      </w:r>
+      <w:r>
+        <w:t>.</w:t>
+      </w:r>
+    </w:p>
+    <w:p>
+      <w:pPr>
+        <w:pStyle w:val="Sinespaciado"/>
+      </w:pPr>
+      <w:r>
+        <w:t xml:space="preserve">Que quede claro que el GROUP no es para sumar es para cuando salen varias filas repetidas y se quieren unir en una sola </w:t>
+      </w:r>
+      <w:r>
+        <w:t>por ejemplo con una suma o prodia agrupar por un campo texto, por ejemplo por un nombr de persona, si salen varias filas con el mismo nombre agrupo y me sale una sola</w:t>
+      </w:r>
+      <w:r>
+        <w:t>. Porque para sumar se puede hacer con un WHERE como se hace aqui</w:t>
+      </w:r>
+    </w:p>
+    <w:p>
+      <w:pPr>
+        <w:pStyle w:val="Sinespaciado"/>
+        <w:rPr>
+          <w:color w:val="EE0000"/>
+        </w:rPr>
+      </w:pPr>
+    </w:p>
+    <w:p>
+      <w:pPr>
+        <w:pStyle w:val="Sinespaciado"/>
+        <w:rPr>
+          <w:color w:val="EE0000"/>
+        </w:rPr>
+      </w:pPr>
+      <w:r>
+        <w:rPr>
+          <w:color w:val="EE0000"/>
+        </w:rPr>
+        <w:t xml:space="preserve">SELECT </w:t>
+      </w:r>
+    </w:p>
+    <w:p>
+      <w:pPr>
+        <w:pStyle w:val="Sinespaciado"/>
+        <w:rPr>
+          <w:color w:val="EE0000"/>
+        </w:rPr>
+      </w:pPr>
+      <w:r>
+        <w:rPr>
+          <w:color w:val="EE0000"/>
+        </w:rPr>
+        <w:t xml:space="preserve">    M.*,</w:t>
+      </w:r>
+    </w:p>
+    <w:p>
+      <w:pPr>
+        <w:pStyle w:val="Sinespaciado"/>
+        <w:rPr>
+          <w:color w:val="EE0000"/>
+        </w:rPr>
+      </w:pPr>
+      <w:r>
+        <w:rPr>
+          <w:color w:val="EE0000"/>
+        </w:rPr>
+        <w:t xml:space="preserve">    A.Nombre AS nombreEnvia,</w:t>
+      </w:r>
+    </w:p>
+    <w:p>
+      <w:pPr>
+        <w:pStyle w:val="Sinespaciado"/>
+        <w:rPr>
+          <w:color w:val="EE0000"/>
+        </w:rPr>
+      </w:pPr>
+      <w:r>
+        <w:rPr>
+          <w:color w:val="EE0000"/>
+        </w:rPr>
+        <w:t xml:space="preserve">    B.Nombre AS nombreRecibe,</w:t>
+      </w:r>
+    </w:p>
+    <w:p>
+      <w:pPr>
+        <w:pStyle w:val="Sinespaciado"/>
+        <w:rPr>
+          <w:color w:val="EE0000"/>
+        </w:rPr>
+      </w:pPr>
+      <w:r>
+        <w:rPr>
+          <w:color w:val="EE0000"/>
+        </w:rPr>
+        <w:t xml:space="preserve">    V.Marca_modelo,</w:t>
+      </w:r>
+    </w:p>
+    <w:p>
+      <w:pPr>
+        <w:pStyle w:val="Sinespaciado"/>
+        <w:rPr>
+          <w:color w:val="EE0000"/>
+        </w:rPr>
+      </w:pPr>
+      <w:r>
+        <w:rPr>
+          <w:color w:val="EE0000"/>
+        </w:rPr>
+        <w:t xml:space="preserve">    C.Nombre AS nombrePropietario,</w:t>
+      </w:r>
+    </w:p>
+    <w:p>
+      <w:pPr>
+        <w:pStyle w:val="Sinespaciado"/>
+        <w:rPr>
+          <w:color w:val="EE0000"/>
+        </w:rPr>
+      </w:pPr>
+      <w:r>
+        <w:rPr>
+          <w:color w:val="EE0000"/>
+        </w:rPr>
+        <w:t xml:space="preserve">    COALESCE(</w:t>
+      </w:r>
+    </w:p>
+    <w:p>
+      <w:pPr>
+        <w:pStyle w:val="Sinespaciado"/>
+        <w:rPr>
+          <w:color w:val="00B050"/>
+        </w:rPr>
+      </w:pPr>
+      <w:r>
+        <w:rPr>
+          <w:color w:val="EE0000"/>
+        </w:rPr>
+        <w:t xml:space="preserve">        </w:t>
+      </w:r>
+      <w:r>
+        <w:rPr>
+          <w:color w:val="00B050"/>
+        </w:rPr>
+        <w:t>(SELECT SUM(E.importe)</w:t>
+      </w:r>
+      <w:r>
+        <w:rPr>
+          <w:color w:val="00B050"/>
+        </w:rPr>
+        <w:t>—se genera una unica fila con la suma</w:t>
+      </w:r>
+      <w:r>
+        <w:rPr>
+          <w:color w:val="00B050"/>
+        </w:rPr>
+        <w:t xml:space="preserve"> </w:t>
+      </w:r>
+      <w:r>
+        <w:rPr>
+          <w:color w:val="00B050"/>
+        </w:rPr>
+        <w:t>la funcion SUM hace lo mismo que un GROUP agrupa todas las filas en una sola</w:t>
+      </w:r>
+    </w:p>
+    <w:p>
+      <w:pPr>
+        <w:pStyle w:val="Sinespaciado"/>
+        <w:rPr>
+          <w:color w:val="00B050"/>
+        </w:rPr>
+      </w:pPr>
+      <w:r>
+        <w:rPr>
+          <w:color w:val="00B050"/>
+        </w:rPr>
+        <w:lastRenderedPageBreak/>
+        <w:t xml:space="preserve">         FROM entregas E </w:t>
+      </w:r>
+    </w:p>
+    <w:p>
+      <w:pPr>
+        <w:pStyle w:val="Sinespaciado"/>
+        <w:rPr>
+          <w:color w:val="00B050"/>
+        </w:rPr>
+      </w:pPr>
+      <w:r>
+        <w:rPr>
+          <w:color w:val="00B050"/>
+        </w:rPr>
+        <w:t xml:space="preserve">         WHERE E.movimiento = M.idMovimiento), 0</w:t>
+      </w:r>
+    </w:p>
+    <w:p>
+      <w:pPr>
+        <w:pStyle w:val="Sinespaciado"/>
+        <w:rPr>
+          <w:color w:val="EE0000"/>
+        </w:rPr>
+      </w:pPr>
+      <w:r>
+        <w:rPr>
+          <w:color w:val="EE0000"/>
+        </w:rPr>
+        <w:t xml:space="preserve">    ) AS totalEntregas,</w:t>
+      </w:r>
+    </w:p>
+    <w:p>
+      <w:pPr>
+        <w:pStyle w:val="Sinespaciado"/>
+        <w:rPr>
+          <w:color w:val="EE0000"/>
+        </w:rPr>
+      </w:pPr>
+      <w:r>
+        <w:rPr>
+          <w:color w:val="EE0000"/>
+        </w:rPr>
+        <w:t xml:space="preserve">    COALESCE(</w:t>
+      </w:r>
+    </w:p>
+    <w:p>
+      <w:pPr>
+        <w:pStyle w:val="Sinespaciado"/>
+        <w:rPr>
+          <w:color w:val="00B050"/>
+        </w:rPr>
+      </w:pPr>
+      <w:r>
+        <w:rPr>
+          <w:color w:val="EE0000"/>
+        </w:rPr>
+        <w:t xml:space="preserve">        </w:t>
+      </w:r>
+      <w:r>
+        <w:rPr>
+          <w:color w:val="00B050"/>
+        </w:rPr>
+        <w:t xml:space="preserve">(SELECT SUM(D.importe) </w:t>
+      </w:r>
+    </w:p>
+    <w:p>
+      <w:pPr>
+        <w:pStyle w:val="Sinespaciado"/>
+        <w:rPr>
+          <w:color w:val="00B050"/>
+        </w:rPr>
+      </w:pPr>
+      <w:r>
+        <w:rPr>
+          <w:color w:val="00B050"/>
+        </w:rPr>
+        <w:t xml:space="preserve">         FROM devoluciones D </w:t>
+      </w:r>
+    </w:p>
+    <w:p>
+      <w:pPr>
+        <w:pStyle w:val="Sinespaciado"/>
+        <w:rPr>
+          <w:color w:val="00B050"/>
+        </w:rPr>
+      </w:pPr>
+      <w:r>
+        <w:rPr>
+          <w:color w:val="00B050"/>
+        </w:rPr>
+        <w:t xml:space="preserve">         WHERE D.movimiento = M.idMovimiento), 0</w:t>
+      </w:r>
+    </w:p>
+    <w:p>
+      <w:pPr>
+        <w:pStyle w:val="Sinespaciado"/>
+        <w:rPr>
+          <w:color w:val="EE0000"/>
+        </w:rPr>
+      </w:pPr>
+      <w:r>
+        <w:rPr>
+          <w:color w:val="EE0000"/>
+        </w:rPr>
+        <w:t xml:space="preserve">    ) AS totalDevoluciones,</w:t>
+      </w:r>
+    </w:p>
+    <w:p>
+      <w:pPr>
+        <w:pStyle w:val="Sinespaciado"/>
+        <w:rPr>
+          <w:color w:val="EE0000"/>
+        </w:rPr>
+      </w:pPr>
+      <w:r>
+        <w:rPr>
+          <w:color w:val="EE0000"/>
+        </w:rPr>
+        <w:t xml:space="preserve">    COALESCE(</w:t>
+      </w:r>
+    </w:p>
+    <w:p>
+      <w:pPr>
+        <w:pStyle w:val="Sinespaciado"/>
+        <w:rPr>
+          <w:color w:val="EE0000"/>
+        </w:rPr>
+      </w:pPr>
+      <w:r>
+        <w:rPr>
+          <w:color w:val="EE0000"/>
+        </w:rPr>
+        <w:t xml:space="preserve">        (SELECT SUM(E.importe) </w:t>
+      </w:r>
+    </w:p>
+    <w:p>
+      <w:pPr>
+        <w:pStyle w:val="Sinespaciado"/>
+        <w:rPr>
+          <w:color w:val="EE0000"/>
+        </w:rPr>
+      </w:pPr>
+      <w:r>
+        <w:rPr>
+          <w:color w:val="EE0000"/>
+        </w:rPr>
+        <w:t xml:space="preserve">         FROM entregas E </w:t>
+      </w:r>
+    </w:p>
+    <w:p>
+      <w:pPr>
+        <w:pStyle w:val="Sinespaciado"/>
+        <w:rPr>
+          <w:color w:val="EE0000"/>
+        </w:rPr>
+      </w:pPr>
+      <w:r>
+        <w:rPr>
+          <w:color w:val="EE0000"/>
+        </w:rPr>
+        <w:t xml:space="preserve">         WHERE E.movimiento = M.idMovimiento), 0</w:t>
+      </w:r>
+    </w:p>
+    <w:p>
+      <w:pPr>
+        <w:pStyle w:val="Sinespaciado"/>
+        <w:rPr>
+          <w:color w:val="EE0000"/>
+        </w:rPr>
+      </w:pPr>
+      <w:r>
+        <w:rPr>
+          <w:color w:val="EE0000"/>
+        </w:rPr>
+        <w:t xml:space="preserve">    ) - COALESCE(</w:t>
+      </w:r>
+    </w:p>
+    <w:p>
+      <w:pPr>
+        <w:pStyle w:val="Sinespaciado"/>
+        <w:rPr>
+          <w:color w:val="EE0000"/>
+        </w:rPr>
+      </w:pPr>
+      <w:r>
+        <w:rPr>
+          <w:color w:val="EE0000"/>
+        </w:rPr>
+        <w:t xml:space="preserve">        (SELECT SUM(D.importe) </w:t>
+      </w:r>
+    </w:p>
+    <w:p>
+      <w:pPr>
+        <w:pStyle w:val="Sinespaciado"/>
+        <w:rPr>
+          <w:color w:val="EE0000"/>
+        </w:rPr>
+      </w:pPr>
+      <w:r>
+        <w:rPr>
+          <w:color w:val="EE0000"/>
+        </w:rPr>
+        <w:t xml:space="preserve">         FROM devoluciones D </w:t>
+      </w:r>
+    </w:p>
+    <w:p>
+      <w:pPr>
+        <w:pStyle w:val="Sinespaciado"/>
+        <w:rPr>
+          <w:color w:val="EE0000"/>
+        </w:rPr>
+      </w:pPr>
+      <w:r>
+        <w:rPr>
+          <w:color w:val="EE0000"/>
+        </w:rPr>
+        <w:t xml:space="preserve">         WHERE D.movimiento = M.idMovimiento), 0</w:t>
+      </w:r>
+    </w:p>
+    <w:p>
+      <w:pPr>
+        <w:pStyle w:val="Sinespaciado"/>
+        <w:rPr>
+          <w:color w:val="EE0000"/>
+        </w:rPr>
+      </w:pPr>
+      <w:r>
+        <w:rPr>
+          <w:color w:val="EE0000"/>
+        </w:rPr>
+        <w:t xml:space="preserve">    ) AS diferencia</w:t>
+      </w:r>
+    </w:p>
+    <w:p>
+      <w:pPr>
+        <w:pStyle w:val="Sinespaciado"/>
+        <w:rPr>
+          <w:color w:val="EE0000"/>
+        </w:rPr>
+      </w:pPr>
+      <w:r>
+        <w:rPr>
+          <w:color w:val="EE0000"/>
+        </w:rPr>
+        <w:t>FROM movimientos M</w:t>
+      </w:r>
+    </w:p>
+    <w:p>
+      <w:pPr>
+        <w:pStyle w:val="Sinespaciado"/>
+        <w:rPr>
+          <w:color w:val="EE0000"/>
+        </w:rPr>
+      </w:pPr>
+      <w:r>
+        <w:rPr>
+          <w:color w:val="EE0000"/>
+        </w:rPr>
+        <w:t>LEFT JOIN entidad A ON M.envia = A.id_entidad</w:t>
+      </w:r>
+    </w:p>
+    <w:p>
+      <w:pPr>
+        <w:pStyle w:val="Sinespaciado"/>
+        <w:rPr>
+          <w:color w:val="EE0000"/>
+        </w:rPr>
+      </w:pPr>
+      <w:r>
+        <w:rPr>
+          <w:color w:val="EE0000"/>
+        </w:rPr>
+        <w:t>LEFT JOIN entidad B ON M.recibe = B.id_entidad</w:t>
+      </w:r>
+    </w:p>
+    <w:p>
+      <w:pPr>
+        <w:pStyle w:val="Sinespaciado"/>
+        <w:rPr>
+          <w:color w:val="EE0000"/>
+        </w:rPr>
+      </w:pPr>
+      <w:r>
+        <w:rPr>
+          <w:color w:val="EE0000"/>
+        </w:rPr>
+        <w:t>LEFT JOIN vehiculos V ON M.vehiculo = V.id_vehiculo</w:t>
+      </w:r>
+    </w:p>
+    <w:p>
+      <w:pPr>
+        <w:pStyle w:val="Sinespaciado"/>
+        <w:rPr>
+          <w:color w:val="EE0000"/>
+        </w:rPr>
+      </w:pPr>
+      <w:r>
+        <w:rPr>
+          <w:color w:val="EE0000"/>
+        </w:rPr>
+        <w:t>LEFT JOIN entidad C ON V.propietario = C.id_entidad;</w:t>
+      </w:r>
+    </w:p>
+    <w:p>
+      <w:pPr>
+        <w:pStyle w:val="Sinespaciado"/>
+        <w:rPr>
+          <w:b/>
+          <w:bCs/>
+        </w:rPr>
+      </w:pPr>
+      <w:r>
+        <w:rPr>
+          <w:b/>
+          <w:bCs/>
+        </w:rPr>
+        <w:t>Ventajas de esta versión:</w:t>
+      </w:r>
+    </w:p>
+    <w:p>
+      <w:pPr>
+        <w:pStyle w:val="Sinespaciado"/>
+        <w:numPr>
+          <w:ilvl w:val="0"/>
+          <w:numId w:val="15"/>
+        </w:numPr>
+      </w:pPr>
+      <w:r>
+        <w:t xml:space="preserve">No hay riesgo de </w:t>
+      </w:r>
+      <w:r>
+        <w:rPr>
+          <w:b/>
+          <w:bCs/>
+        </w:rPr>
+        <w:t>multiplicación de filas</w:t>
+      </w:r>
+      <w:r>
+        <w:t xml:space="preserve"> por joins.</w:t>
+      </w:r>
+    </w:p>
+    <w:p>
+      <w:pPr>
+        <w:pStyle w:val="Sinespaciado"/>
+        <w:numPr>
+          <w:ilvl w:val="0"/>
+          <w:numId w:val="15"/>
+        </w:numPr>
+      </w:pPr>
+      <w:r>
+        <w:t>Mantienes una fila por cada movimiento.</w:t>
+      </w:r>
+    </w:p>
+    <w:p>
+      <w:pPr>
+        <w:pStyle w:val="Sinespaciado"/>
+        <w:numPr>
+          <w:ilvl w:val="0"/>
+          <w:numId w:val="15"/>
+        </w:numPr>
+        <w:rPr>
+          <w:i/>
+          <w:iCs/>
+          <w:u w:val="single"/>
+        </w:rPr>
+      </w:pPr>
+      <w:r>
+        <w:rPr>
+          <w:i/>
+          <w:iCs/>
+          <w:u w:val="single"/>
+        </w:rPr>
+        <w:t>Muy legible: cada total se calcula directamente dentro del SELECT.</w:t>
+      </w:r>
+    </w:p>
+    <w:p>
+      <w:pPr>
+        <w:pStyle w:val="Sinespaciado"/>
+        <w:numPr>
+          <w:ilvl w:val="0"/>
+          <w:numId w:val="15"/>
+        </w:numPr>
+      </w:pPr>
+      <w:r>
+        <w:t xml:space="preserve">COALESCE(...,0) asegura que los movimientos sin entregas o devoluciones muestren </w:t>
+      </w:r>
+      <w:r>
+        <w:rPr>
+          <w:b/>
+          <w:bCs/>
+        </w:rPr>
+        <w:t>0</w:t>
+      </w:r>
+      <w:r>
+        <w:t>.</w:t>
+      </w:r>
+    </w:p>
+    <w:p>
+      <w:pPr>
+        <w:pStyle w:val="Sinespaciado"/>
+        <w:rPr>
+          <w:color w:val="EE0000"/>
+        </w:rPr>
+      </w:pPr>
+    </w:p>
     <w:sectPr>
       <w:footerReference w:type="default" r:id="rId8"/>
       <w:pgSz w:w="16838" w:h="11906" w:orient="landscape"/>
@@ -11424,9 +13480,9 @@
 <file path=word/numbering.xml><?xml version="1.0" encoding="utf-8"?>
 <w:numbering xmlns:wpc="http://schemas.microsoft.com/office/word/2010/wordprocessingCanvas" xmlns:cx="http://schemas.microsoft.com/office/drawing/2014/chartex" xmlns:cx1="http://schemas.microsoft.com/office/drawing/2015/9/8/chartex" xmlns:cx2="http://schemas.microsoft.com/office/drawing/2015/10/21/chartex" xmlns:cx3="http://schemas.microsoft.com/office/drawing/2016/5/9/chartex" xmlns:cx4="http://schemas.microsoft.com/office/drawing/2016/5/10/chartex" xmlns:cx5="http://schemas.microsoft.com/office/drawing/2016/5/11/chartex" xmlns:cx6="http://schemas.microsoft.com/office/drawing/2016/5/12/chartex" xmlns:cx7="http://schemas.microsoft.com/office/drawing/2016/5/13/chartex" xmlns:cx8="http://schemas.microsoft.com/office/drawing/2016/5/14/chartex" xmlns:mc="http://schemas.openxmlformats.org/markup-compatibility/2006" xmlns:aink="http://schemas.microsoft.com/office/drawing/2016/ink" xmlns:am3d="http://schemas.microsoft.com/office/drawing/2017/model3d" xmlns:o="urn:schemas-microsoft-com:office:office" xmlns:oel="http://schemas.microsoft.com/office/2019/extlst" xmlns:r="http://schemas.openxmlformats.org/officeDocument/2006/relationships" xmlns:m="http://schemas.openxmlformats.org/officeDocument/2006/math" xmlns:v="urn:schemas-microsoft-com:vml" xmlns:wp14="http://schemas.microsoft.com/office/word/2010/wordprocessingDrawing" xmlns:wp="http://schemas.openxmlformats.org/drawingml/2006/wordprocessingDrawing" xmlns:w10="urn:schemas-microsoft-com:office:word" xmlns:w="http://schemas.openxmlformats.org/wordprocessingml/2006/main" xmlns:w14="http://schemas.microsoft.com/office/word/2010/wordml" xmlns:w15="http://schemas.microsoft.com/office/word/2012/wordml" xmlns:w16cex="http://schemas.microsoft.com/office/word/2018/wordml/cex" xmlns:w16cid="http://schemas.microsoft.com/office/word/2016/wordml/cid" xmlns:w16="http://schemas.microsoft.com/office/word/2018/wordml" xmlns:w16du="http://schemas.microsoft.com/office/word/2023/wordml/word16du" xmlns:w16sdtdh="http://schemas.microsoft.com/office/word/2020/wordml/sdtdatahash" xmlns:w16sdtfl="http://schemas.microsoft.com/office/word/2024/wordml/sdtformatlock" xmlns:w16se="http://schemas.microsoft.com/office/word/2015/wordml/symex" xmlns:wpg="http://schemas.microsoft.com/office/word/2010/wordprocessingGroup" xmlns:wpi="http://schemas.microsoft.com/office/word/2010/wordprocessingInk" xmlns:wne="http://schemas.microsoft.com/office/word/2006/wordml" xmlns:wps="http://schemas.microsoft.com/office/word/2010/wordprocessingShape" mc:Ignorable="w14 w15 w16se w16cid w16 w16cex w16sdtdh w16sdtfl w16du wp14">
   <w:abstractNum w:abstractNumId="0" w15:restartNumberingAfterBreak="0">
-    <w:nsid w:val="0C1E0381"/>
+    <w:nsid w:val="0434725F"/>
     <w:multiLevelType w:val="multilevel"/>
-    <w:tmpl w:val="5756DB1E"/>
+    <w:tmpl w:val="ECAAD47E"/>
     <w:lvl w:ilvl="0">
       <w:start w:val="1"/>
       <w:numFmt w:val="bullet"/>
@@ -11573,9 +13629,9 @@
     </w:lvl>
   </w:abstractNum>
   <w:abstractNum w:abstractNumId="1" w15:restartNumberingAfterBreak="0">
-    <w:nsid w:val="0E5B7748"/>
+    <w:nsid w:val="0C1E0381"/>
     <w:multiLevelType w:val="multilevel"/>
-    <w:tmpl w:val="28965F00"/>
+    <w:tmpl w:val="5756DB1E"/>
     <w:lvl w:ilvl="0">
       <w:start w:val="1"/>
       <w:numFmt w:val="bullet"/>
@@ -11722,9 +13778,9 @@
     </w:lvl>
   </w:abstractNum>
   <w:abstractNum w:abstractNumId="2" w15:restartNumberingAfterBreak="0">
-    <w:nsid w:val="100B22EF"/>
+    <w:nsid w:val="0E5B7748"/>
     <w:multiLevelType w:val="multilevel"/>
-    <w:tmpl w:val="FFFFFFFF"/>
+    <w:tmpl w:val="28965F00"/>
     <w:lvl w:ilvl="0">
       <w:start w:val="1"/>
       <w:numFmt w:val="bullet"/>
@@ -11871,9 +13927,9 @@
     </w:lvl>
   </w:abstractNum>
   <w:abstractNum w:abstractNumId="3" w15:restartNumberingAfterBreak="0">
-    <w:nsid w:val="13B705ED"/>
+    <w:nsid w:val="100B22EF"/>
     <w:multiLevelType w:val="multilevel"/>
-    <w:tmpl w:val="28965F00"/>
+    <w:tmpl w:val="FFFFFFFF"/>
     <w:lvl w:ilvl="0">
       <w:start w:val="1"/>
       <w:numFmt w:val="bullet"/>
@@ -12020,389 +14076,9 @@
     </w:lvl>
   </w:abstractNum>
   <w:abstractNum w:abstractNumId="4" w15:restartNumberingAfterBreak="0">
-    <w:nsid w:val="23855272"/>
-    <w:multiLevelType w:val="hybridMultilevel"/>
-    <w:tmpl w:val="2EAAB886"/>
-    <w:lvl w:ilvl="0" w:tplc="0C0A0001">
-      <w:start w:val="1"/>
-      <w:numFmt w:val="bullet"/>
-      <w:lvlText w:val=""/>
-      <w:lvlJc w:val="left"/>
-      <w:pPr>
-        <w:ind w:left="720" w:hanging="360"/>
-      </w:pPr>
-      <w:rPr>
-        <w:rFonts w:ascii="Symbol" w:hAnsi="Symbol" w:hint="default"/>
-      </w:rPr>
-    </w:lvl>
-    <w:lvl w:ilvl="1" w:tplc="0C0A0003" w:tentative="1">
-      <w:start w:val="1"/>
-      <w:numFmt w:val="bullet"/>
-      <w:lvlText w:val="o"/>
-      <w:lvlJc w:val="left"/>
-      <w:pPr>
-        <w:ind w:left="1440" w:hanging="360"/>
-      </w:pPr>
-      <w:rPr>
-        <w:rFonts w:ascii="Courier New" w:hAnsi="Courier New" w:cs="Courier New" w:hint="default"/>
-      </w:rPr>
-    </w:lvl>
-    <w:lvl w:ilvl="2" w:tplc="0C0A0005" w:tentative="1">
-      <w:start w:val="1"/>
-      <w:numFmt w:val="bullet"/>
-      <w:lvlText w:val=""/>
-      <w:lvlJc w:val="left"/>
-      <w:pPr>
-        <w:ind w:left="2160" w:hanging="360"/>
-      </w:pPr>
-      <w:rPr>
-        <w:rFonts w:ascii="Wingdings" w:hAnsi="Wingdings" w:hint="default"/>
-      </w:rPr>
-    </w:lvl>
-    <w:lvl w:ilvl="3" w:tplc="0C0A0001" w:tentative="1">
-      <w:start w:val="1"/>
-      <w:numFmt w:val="bullet"/>
-      <w:lvlText w:val=""/>
-      <w:lvlJc w:val="left"/>
-      <w:pPr>
-        <w:ind w:left="2880" w:hanging="360"/>
-      </w:pPr>
-      <w:rPr>
-        <w:rFonts w:ascii="Symbol" w:hAnsi="Symbol" w:hint="default"/>
-      </w:rPr>
-    </w:lvl>
-    <w:lvl w:ilvl="4" w:tplc="0C0A0003" w:tentative="1">
-      <w:start w:val="1"/>
-      <w:numFmt w:val="bullet"/>
-      <w:lvlText w:val="o"/>
-      <w:lvlJc w:val="left"/>
-      <w:pPr>
-        <w:ind w:left="3600" w:hanging="360"/>
-      </w:pPr>
-      <w:rPr>
-        <w:rFonts w:ascii="Courier New" w:hAnsi="Courier New" w:cs="Courier New" w:hint="default"/>
-      </w:rPr>
-    </w:lvl>
-    <w:lvl w:ilvl="5" w:tplc="0C0A0005" w:tentative="1">
-      <w:start w:val="1"/>
-      <w:numFmt w:val="bullet"/>
-      <w:lvlText w:val=""/>
-      <w:lvlJc w:val="left"/>
-      <w:pPr>
-        <w:ind w:left="4320" w:hanging="360"/>
-      </w:pPr>
-      <w:rPr>
-        <w:rFonts w:ascii="Wingdings" w:hAnsi="Wingdings" w:hint="default"/>
-      </w:rPr>
-    </w:lvl>
-    <w:lvl w:ilvl="6" w:tplc="0C0A0001" w:tentative="1">
-      <w:start w:val="1"/>
-      <w:numFmt w:val="bullet"/>
-      <w:lvlText w:val=""/>
-      <w:lvlJc w:val="left"/>
-      <w:pPr>
-        <w:ind w:left="5040" w:hanging="360"/>
-      </w:pPr>
-      <w:rPr>
-        <w:rFonts w:ascii="Symbol" w:hAnsi="Symbol" w:hint="default"/>
-      </w:rPr>
-    </w:lvl>
-    <w:lvl w:ilvl="7" w:tplc="0C0A0003" w:tentative="1">
-      <w:start w:val="1"/>
-      <w:numFmt w:val="bullet"/>
-      <w:lvlText w:val="o"/>
-      <w:lvlJc w:val="left"/>
-      <w:pPr>
-        <w:ind w:left="5760" w:hanging="360"/>
-      </w:pPr>
-      <w:rPr>
-        <w:rFonts w:ascii="Courier New" w:hAnsi="Courier New" w:cs="Courier New" w:hint="default"/>
-      </w:rPr>
-    </w:lvl>
-    <w:lvl w:ilvl="8" w:tplc="0C0A0005" w:tentative="1">
-      <w:start w:val="1"/>
-      <w:numFmt w:val="bullet"/>
-      <w:lvlText w:val=""/>
-      <w:lvlJc w:val="left"/>
-      <w:pPr>
-        <w:ind w:left="6480" w:hanging="360"/>
-      </w:pPr>
-      <w:rPr>
-        <w:rFonts w:ascii="Wingdings" w:hAnsi="Wingdings" w:hint="default"/>
-      </w:rPr>
-    </w:lvl>
-  </w:abstractNum>
-  <w:abstractNum w:abstractNumId="5" w15:restartNumberingAfterBreak="0">
-    <w:nsid w:val="2EFB02CA"/>
-    <w:multiLevelType w:val="hybridMultilevel"/>
-    <w:tmpl w:val="942834CE"/>
-    <w:lvl w:ilvl="0" w:tplc="0C0A000F">
-      <w:start w:val="1"/>
-      <w:numFmt w:val="decimal"/>
-      <w:lvlText w:val="%1."/>
-      <w:lvlJc w:val="left"/>
-      <w:pPr>
-        <w:ind w:left="360" w:hanging="360"/>
-      </w:pPr>
-      <w:rPr>
-        <w:rFonts w:hint="default"/>
-      </w:rPr>
-    </w:lvl>
-    <w:lvl w:ilvl="1" w:tplc="0C0A0019" w:tentative="1">
-      <w:start w:val="1"/>
-      <w:numFmt w:val="lowerLetter"/>
-      <w:lvlText w:val="%2."/>
-      <w:lvlJc w:val="left"/>
-      <w:pPr>
-        <w:ind w:left="1080" w:hanging="360"/>
-      </w:pPr>
-    </w:lvl>
-    <w:lvl w:ilvl="2" w:tplc="0C0A001B" w:tentative="1">
-      <w:start w:val="1"/>
-      <w:numFmt w:val="lowerRoman"/>
-      <w:lvlText w:val="%3."/>
-      <w:lvlJc w:val="right"/>
-      <w:pPr>
-        <w:ind w:left="1800" w:hanging="180"/>
-      </w:pPr>
-    </w:lvl>
-    <w:lvl w:ilvl="3" w:tplc="0C0A000F" w:tentative="1">
-      <w:start w:val="1"/>
-      <w:numFmt w:val="decimal"/>
-      <w:lvlText w:val="%4."/>
-      <w:lvlJc w:val="left"/>
-      <w:pPr>
-        <w:ind w:left="2520" w:hanging="360"/>
-      </w:pPr>
-    </w:lvl>
-    <w:lvl w:ilvl="4" w:tplc="0C0A0019" w:tentative="1">
-      <w:start w:val="1"/>
-      <w:numFmt w:val="lowerLetter"/>
-      <w:lvlText w:val="%5."/>
-      <w:lvlJc w:val="left"/>
-      <w:pPr>
-        <w:ind w:left="3240" w:hanging="360"/>
-      </w:pPr>
-    </w:lvl>
-    <w:lvl w:ilvl="5" w:tplc="0C0A001B" w:tentative="1">
-      <w:start w:val="1"/>
-      <w:numFmt w:val="lowerRoman"/>
-      <w:lvlText w:val="%6."/>
-      <w:lvlJc w:val="right"/>
-      <w:pPr>
-        <w:ind w:left="3960" w:hanging="180"/>
-      </w:pPr>
-    </w:lvl>
-    <w:lvl w:ilvl="6" w:tplc="0C0A000F" w:tentative="1">
-      <w:start w:val="1"/>
-      <w:numFmt w:val="decimal"/>
-      <w:lvlText w:val="%7."/>
-      <w:lvlJc w:val="left"/>
-      <w:pPr>
-        <w:ind w:left="4680" w:hanging="360"/>
-      </w:pPr>
-    </w:lvl>
-    <w:lvl w:ilvl="7" w:tplc="0C0A0019" w:tentative="1">
-      <w:start w:val="1"/>
-      <w:numFmt w:val="lowerLetter"/>
-      <w:lvlText w:val="%8."/>
-      <w:lvlJc w:val="left"/>
-      <w:pPr>
-        <w:ind w:left="5400" w:hanging="360"/>
-      </w:pPr>
-    </w:lvl>
-    <w:lvl w:ilvl="8" w:tplc="0C0A001B" w:tentative="1">
-      <w:start w:val="1"/>
-      <w:numFmt w:val="lowerRoman"/>
-      <w:lvlText w:val="%9."/>
-      <w:lvlJc w:val="right"/>
-      <w:pPr>
-        <w:ind w:left="6120" w:hanging="180"/>
-      </w:pPr>
-    </w:lvl>
-  </w:abstractNum>
-  <w:abstractNum w:abstractNumId="6" w15:restartNumberingAfterBreak="0">
-    <w:nsid w:val="3F4D3A17"/>
-    <w:multiLevelType w:val="hybridMultilevel"/>
-    <w:tmpl w:val="52B8E63E"/>
-    <w:lvl w:ilvl="0" w:tplc="0C0A0015">
-      <w:start w:val="1"/>
-      <w:numFmt w:val="upperLetter"/>
-      <w:lvlText w:val="%1."/>
-      <w:lvlJc w:val="left"/>
-      <w:pPr>
-        <w:ind w:left="720" w:hanging="360"/>
-      </w:pPr>
-      <w:rPr>
-        <w:rFonts w:hint="default"/>
-      </w:rPr>
-    </w:lvl>
-    <w:lvl w:ilvl="1" w:tplc="0C0A0019" w:tentative="1">
-      <w:start w:val="1"/>
-      <w:numFmt w:val="lowerLetter"/>
-      <w:lvlText w:val="%2."/>
-      <w:lvlJc w:val="left"/>
-      <w:pPr>
-        <w:ind w:left="1440" w:hanging="360"/>
-      </w:pPr>
-    </w:lvl>
-    <w:lvl w:ilvl="2" w:tplc="0C0A001B" w:tentative="1">
-      <w:start w:val="1"/>
-      <w:numFmt w:val="lowerRoman"/>
-      <w:lvlText w:val="%3."/>
-      <w:lvlJc w:val="right"/>
-      <w:pPr>
-        <w:ind w:left="2160" w:hanging="180"/>
-      </w:pPr>
-    </w:lvl>
-    <w:lvl w:ilvl="3" w:tplc="0C0A000F" w:tentative="1">
-      <w:start w:val="1"/>
-      <w:numFmt w:val="decimal"/>
-      <w:lvlText w:val="%4."/>
-      <w:lvlJc w:val="left"/>
-      <w:pPr>
-        <w:ind w:left="2880" w:hanging="360"/>
-      </w:pPr>
-    </w:lvl>
-    <w:lvl w:ilvl="4" w:tplc="0C0A0019" w:tentative="1">
-      <w:start w:val="1"/>
-      <w:numFmt w:val="lowerLetter"/>
-      <w:lvlText w:val="%5."/>
-      <w:lvlJc w:val="left"/>
-      <w:pPr>
-        <w:ind w:left="3600" w:hanging="360"/>
-      </w:pPr>
-    </w:lvl>
-    <w:lvl w:ilvl="5" w:tplc="0C0A001B" w:tentative="1">
-      <w:start w:val="1"/>
-      <w:numFmt w:val="lowerRoman"/>
-      <w:lvlText w:val="%6."/>
-      <w:lvlJc w:val="right"/>
-      <w:pPr>
-        <w:ind w:left="4320" w:hanging="180"/>
-      </w:pPr>
-    </w:lvl>
-    <w:lvl w:ilvl="6" w:tplc="0C0A000F" w:tentative="1">
-      <w:start w:val="1"/>
-      <w:numFmt w:val="decimal"/>
-      <w:lvlText w:val="%7."/>
-      <w:lvlJc w:val="left"/>
-      <w:pPr>
-        <w:ind w:left="5040" w:hanging="360"/>
-      </w:pPr>
-    </w:lvl>
-    <w:lvl w:ilvl="7" w:tplc="0C0A0019" w:tentative="1">
-      <w:start w:val="1"/>
-      <w:numFmt w:val="lowerLetter"/>
-      <w:lvlText w:val="%8."/>
-      <w:lvlJc w:val="left"/>
-      <w:pPr>
-        <w:ind w:left="5760" w:hanging="360"/>
-      </w:pPr>
-    </w:lvl>
-    <w:lvl w:ilvl="8" w:tplc="0C0A001B" w:tentative="1">
-      <w:start w:val="1"/>
-      <w:numFmt w:val="lowerRoman"/>
-      <w:lvlText w:val="%9."/>
-      <w:lvlJc w:val="right"/>
-      <w:pPr>
-        <w:ind w:left="6480" w:hanging="180"/>
-      </w:pPr>
-    </w:lvl>
-  </w:abstractNum>
-  <w:abstractNum w:abstractNumId="7" w15:restartNumberingAfterBreak="0">
-    <w:nsid w:val="51090EF7"/>
-    <w:multiLevelType w:val="hybridMultilevel"/>
-    <w:tmpl w:val="FE689D6C"/>
-    <w:lvl w:ilvl="0" w:tplc="0C0A000F">
-      <w:start w:val="1"/>
-      <w:numFmt w:val="decimal"/>
-      <w:lvlText w:val="%1."/>
-      <w:lvlJc w:val="left"/>
-      <w:pPr>
-        <w:ind w:left="360" w:hanging="360"/>
-      </w:pPr>
-      <w:rPr>
-        <w:rFonts w:hint="default"/>
-      </w:rPr>
-    </w:lvl>
-    <w:lvl w:ilvl="1" w:tplc="FFFFFFFF" w:tentative="1">
-      <w:start w:val="1"/>
-      <w:numFmt w:val="lowerLetter"/>
-      <w:lvlText w:val="%2."/>
-      <w:lvlJc w:val="left"/>
-      <w:pPr>
-        <w:ind w:left="1080" w:hanging="360"/>
-      </w:pPr>
-    </w:lvl>
-    <w:lvl w:ilvl="2" w:tplc="FFFFFFFF" w:tentative="1">
-      <w:start w:val="1"/>
-      <w:numFmt w:val="lowerRoman"/>
-      <w:lvlText w:val="%3."/>
-      <w:lvlJc w:val="right"/>
-      <w:pPr>
-        <w:ind w:left="1800" w:hanging="180"/>
-      </w:pPr>
-    </w:lvl>
-    <w:lvl w:ilvl="3" w:tplc="FFFFFFFF" w:tentative="1">
-      <w:start w:val="1"/>
-      <w:numFmt w:val="decimal"/>
-      <w:lvlText w:val="%4."/>
-      <w:lvlJc w:val="left"/>
-      <w:pPr>
-        <w:ind w:left="2520" w:hanging="360"/>
-      </w:pPr>
-    </w:lvl>
-    <w:lvl w:ilvl="4" w:tplc="FFFFFFFF" w:tentative="1">
-      <w:start w:val="1"/>
-      <w:numFmt w:val="lowerLetter"/>
-      <w:lvlText w:val="%5."/>
-      <w:lvlJc w:val="left"/>
-      <w:pPr>
-        <w:ind w:left="3240" w:hanging="360"/>
-      </w:pPr>
-    </w:lvl>
-    <w:lvl w:ilvl="5" w:tplc="FFFFFFFF" w:tentative="1">
-      <w:start w:val="1"/>
-      <w:numFmt w:val="lowerRoman"/>
-      <w:lvlText w:val="%6."/>
-      <w:lvlJc w:val="right"/>
-      <w:pPr>
-        <w:ind w:left="3960" w:hanging="180"/>
-      </w:pPr>
-    </w:lvl>
-    <w:lvl w:ilvl="6" w:tplc="FFFFFFFF" w:tentative="1">
-      <w:start w:val="1"/>
-      <w:numFmt w:val="decimal"/>
-      <w:lvlText w:val="%7."/>
-      <w:lvlJc w:val="left"/>
-      <w:pPr>
-        <w:ind w:left="4680" w:hanging="360"/>
-      </w:pPr>
-    </w:lvl>
-    <w:lvl w:ilvl="7" w:tplc="FFFFFFFF" w:tentative="1">
-      <w:start w:val="1"/>
-      <w:numFmt w:val="lowerLetter"/>
-      <w:lvlText w:val="%8."/>
-      <w:lvlJc w:val="left"/>
-      <w:pPr>
-        <w:ind w:left="5400" w:hanging="360"/>
-      </w:pPr>
-    </w:lvl>
-    <w:lvl w:ilvl="8" w:tplc="FFFFFFFF" w:tentative="1">
-      <w:start w:val="1"/>
-      <w:numFmt w:val="lowerRoman"/>
-      <w:lvlText w:val="%9."/>
-      <w:lvlJc w:val="right"/>
-      <w:pPr>
-        <w:ind w:left="6120" w:hanging="180"/>
-      </w:pPr>
-    </w:lvl>
-  </w:abstractNum>
-  <w:abstractNum w:abstractNumId="8" w15:restartNumberingAfterBreak="0">
-    <w:nsid w:val="6DBD3631"/>
+    <w:nsid w:val="13B705ED"/>
     <w:multiLevelType w:val="multilevel"/>
-    <w:tmpl w:val="62ACF0FE"/>
+    <w:tmpl w:val="28965F00"/>
     <w:lvl w:ilvl="0">
       <w:start w:val="1"/>
       <w:numFmt w:val="bullet"/>
@@ -12548,10 +14224,329 @@
       </w:rPr>
     </w:lvl>
   </w:abstractNum>
-  <w:abstractNum w:abstractNumId="9" w15:restartNumberingAfterBreak="0">
-    <w:nsid w:val="6E1F78C9"/>
+  <w:abstractNum w:abstractNumId="5" w15:restartNumberingAfterBreak="0">
+    <w:nsid w:val="23855272"/>
+    <w:multiLevelType w:val="hybridMultilevel"/>
+    <w:tmpl w:val="2EAAB886"/>
+    <w:lvl w:ilvl="0" w:tplc="0C0A0001">
+      <w:start w:val="1"/>
+      <w:numFmt w:val="bullet"/>
+      <w:lvlText w:val=""/>
+      <w:lvlJc w:val="left"/>
+      <w:pPr>
+        <w:ind w:left="720" w:hanging="360"/>
+      </w:pPr>
+      <w:rPr>
+        <w:rFonts w:ascii="Symbol" w:hAnsi="Symbol" w:hint="default"/>
+      </w:rPr>
+    </w:lvl>
+    <w:lvl w:ilvl="1" w:tplc="0C0A0003" w:tentative="1">
+      <w:start w:val="1"/>
+      <w:numFmt w:val="bullet"/>
+      <w:lvlText w:val="o"/>
+      <w:lvlJc w:val="left"/>
+      <w:pPr>
+        <w:ind w:left="1440" w:hanging="360"/>
+      </w:pPr>
+      <w:rPr>
+        <w:rFonts w:ascii="Courier New" w:hAnsi="Courier New" w:cs="Courier New" w:hint="default"/>
+      </w:rPr>
+    </w:lvl>
+    <w:lvl w:ilvl="2" w:tplc="0C0A0005" w:tentative="1">
+      <w:start w:val="1"/>
+      <w:numFmt w:val="bullet"/>
+      <w:lvlText w:val=""/>
+      <w:lvlJc w:val="left"/>
+      <w:pPr>
+        <w:ind w:left="2160" w:hanging="360"/>
+      </w:pPr>
+      <w:rPr>
+        <w:rFonts w:ascii="Wingdings" w:hAnsi="Wingdings" w:hint="default"/>
+      </w:rPr>
+    </w:lvl>
+    <w:lvl w:ilvl="3" w:tplc="0C0A0001" w:tentative="1">
+      <w:start w:val="1"/>
+      <w:numFmt w:val="bullet"/>
+      <w:lvlText w:val=""/>
+      <w:lvlJc w:val="left"/>
+      <w:pPr>
+        <w:ind w:left="2880" w:hanging="360"/>
+      </w:pPr>
+      <w:rPr>
+        <w:rFonts w:ascii="Symbol" w:hAnsi="Symbol" w:hint="default"/>
+      </w:rPr>
+    </w:lvl>
+    <w:lvl w:ilvl="4" w:tplc="0C0A0003" w:tentative="1">
+      <w:start w:val="1"/>
+      <w:numFmt w:val="bullet"/>
+      <w:lvlText w:val="o"/>
+      <w:lvlJc w:val="left"/>
+      <w:pPr>
+        <w:ind w:left="3600" w:hanging="360"/>
+      </w:pPr>
+      <w:rPr>
+        <w:rFonts w:ascii="Courier New" w:hAnsi="Courier New" w:cs="Courier New" w:hint="default"/>
+      </w:rPr>
+    </w:lvl>
+    <w:lvl w:ilvl="5" w:tplc="0C0A0005" w:tentative="1">
+      <w:start w:val="1"/>
+      <w:numFmt w:val="bullet"/>
+      <w:lvlText w:val=""/>
+      <w:lvlJc w:val="left"/>
+      <w:pPr>
+        <w:ind w:left="4320" w:hanging="360"/>
+      </w:pPr>
+      <w:rPr>
+        <w:rFonts w:ascii="Wingdings" w:hAnsi="Wingdings" w:hint="default"/>
+      </w:rPr>
+    </w:lvl>
+    <w:lvl w:ilvl="6" w:tplc="0C0A0001" w:tentative="1">
+      <w:start w:val="1"/>
+      <w:numFmt w:val="bullet"/>
+      <w:lvlText w:val=""/>
+      <w:lvlJc w:val="left"/>
+      <w:pPr>
+        <w:ind w:left="5040" w:hanging="360"/>
+      </w:pPr>
+      <w:rPr>
+        <w:rFonts w:ascii="Symbol" w:hAnsi="Symbol" w:hint="default"/>
+      </w:rPr>
+    </w:lvl>
+    <w:lvl w:ilvl="7" w:tplc="0C0A0003" w:tentative="1">
+      <w:start w:val="1"/>
+      <w:numFmt w:val="bullet"/>
+      <w:lvlText w:val="o"/>
+      <w:lvlJc w:val="left"/>
+      <w:pPr>
+        <w:ind w:left="5760" w:hanging="360"/>
+      </w:pPr>
+      <w:rPr>
+        <w:rFonts w:ascii="Courier New" w:hAnsi="Courier New" w:cs="Courier New" w:hint="default"/>
+      </w:rPr>
+    </w:lvl>
+    <w:lvl w:ilvl="8" w:tplc="0C0A0005" w:tentative="1">
+      <w:start w:val="1"/>
+      <w:numFmt w:val="bullet"/>
+      <w:lvlText w:val=""/>
+      <w:lvlJc w:val="left"/>
+      <w:pPr>
+        <w:ind w:left="6480" w:hanging="360"/>
+      </w:pPr>
+      <w:rPr>
+        <w:rFonts w:ascii="Wingdings" w:hAnsi="Wingdings" w:hint="default"/>
+      </w:rPr>
+    </w:lvl>
+  </w:abstractNum>
+  <w:abstractNum w:abstractNumId="6" w15:restartNumberingAfterBreak="0">
+    <w:nsid w:val="2EFB02CA"/>
+    <w:multiLevelType w:val="hybridMultilevel"/>
+    <w:tmpl w:val="942834CE"/>
+    <w:lvl w:ilvl="0" w:tplc="0C0A000F">
+      <w:start w:val="1"/>
+      <w:numFmt w:val="decimal"/>
+      <w:lvlText w:val="%1."/>
+      <w:lvlJc w:val="left"/>
+      <w:pPr>
+        <w:ind w:left="360" w:hanging="360"/>
+      </w:pPr>
+      <w:rPr>
+        <w:rFonts w:hint="default"/>
+      </w:rPr>
+    </w:lvl>
+    <w:lvl w:ilvl="1" w:tplc="0C0A0019" w:tentative="1">
+      <w:start w:val="1"/>
+      <w:numFmt w:val="lowerLetter"/>
+      <w:lvlText w:val="%2."/>
+      <w:lvlJc w:val="left"/>
+      <w:pPr>
+        <w:ind w:left="1080" w:hanging="360"/>
+      </w:pPr>
+    </w:lvl>
+    <w:lvl w:ilvl="2" w:tplc="0C0A001B" w:tentative="1">
+      <w:start w:val="1"/>
+      <w:numFmt w:val="lowerRoman"/>
+      <w:lvlText w:val="%3."/>
+      <w:lvlJc w:val="right"/>
+      <w:pPr>
+        <w:ind w:left="1800" w:hanging="180"/>
+      </w:pPr>
+    </w:lvl>
+    <w:lvl w:ilvl="3" w:tplc="0C0A000F" w:tentative="1">
+      <w:start w:val="1"/>
+      <w:numFmt w:val="decimal"/>
+      <w:lvlText w:val="%4."/>
+      <w:lvlJc w:val="left"/>
+      <w:pPr>
+        <w:ind w:left="2520" w:hanging="360"/>
+      </w:pPr>
+    </w:lvl>
+    <w:lvl w:ilvl="4" w:tplc="0C0A0019" w:tentative="1">
+      <w:start w:val="1"/>
+      <w:numFmt w:val="lowerLetter"/>
+      <w:lvlText w:val="%5."/>
+      <w:lvlJc w:val="left"/>
+      <w:pPr>
+        <w:ind w:left="3240" w:hanging="360"/>
+      </w:pPr>
+    </w:lvl>
+    <w:lvl w:ilvl="5" w:tplc="0C0A001B" w:tentative="1">
+      <w:start w:val="1"/>
+      <w:numFmt w:val="lowerRoman"/>
+      <w:lvlText w:val="%6."/>
+      <w:lvlJc w:val="right"/>
+      <w:pPr>
+        <w:ind w:left="3960" w:hanging="180"/>
+      </w:pPr>
+    </w:lvl>
+    <w:lvl w:ilvl="6" w:tplc="0C0A000F" w:tentative="1">
+      <w:start w:val="1"/>
+      <w:numFmt w:val="decimal"/>
+      <w:lvlText w:val="%7."/>
+      <w:lvlJc w:val="left"/>
+      <w:pPr>
+        <w:ind w:left="4680" w:hanging="360"/>
+      </w:pPr>
+    </w:lvl>
+    <w:lvl w:ilvl="7" w:tplc="0C0A0019" w:tentative="1">
+      <w:start w:val="1"/>
+      <w:numFmt w:val="lowerLetter"/>
+      <w:lvlText w:val="%8."/>
+      <w:lvlJc w:val="left"/>
+      <w:pPr>
+        <w:ind w:left="5400" w:hanging="360"/>
+      </w:pPr>
+    </w:lvl>
+    <w:lvl w:ilvl="8" w:tplc="0C0A001B" w:tentative="1">
+      <w:start w:val="1"/>
+      <w:numFmt w:val="lowerRoman"/>
+      <w:lvlText w:val="%9."/>
+      <w:lvlJc w:val="right"/>
+      <w:pPr>
+        <w:ind w:left="6120" w:hanging="180"/>
+      </w:pPr>
+    </w:lvl>
+  </w:abstractNum>
+  <w:abstractNum w:abstractNumId="7" w15:restartNumberingAfterBreak="0">
+    <w:nsid w:val="2F8428A6"/>
     <w:multiLevelType w:val="multilevel"/>
-    <w:tmpl w:val="2B5609A0"/>
+    <w:tmpl w:val="384C0C08"/>
+    <w:lvl w:ilvl="0">
+      <w:start w:val="1"/>
+      <w:numFmt w:val="decimal"/>
+      <w:lvlText w:val="%1."/>
+      <w:lvlJc w:val="left"/>
+      <w:pPr>
+        <w:tabs>
+          <w:tab w:val="num" w:pos="720"/>
+        </w:tabs>
+        <w:ind w:left="720" w:hanging="360"/>
+      </w:pPr>
+    </w:lvl>
+    <w:lvl w:ilvl="1">
+      <w:start w:val="1"/>
+      <w:numFmt w:val="bullet"/>
+      <w:lvlText w:val="o"/>
+      <w:lvlJc w:val="left"/>
+      <w:pPr>
+        <w:tabs>
+          <w:tab w:val="num" w:pos="1440"/>
+        </w:tabs>
+        <w:ind w:left="1440" w:hanging="360"/>
+      </w:pPr>
+      <w:rPr>
+        <w:rFonts w:ascii="Courier New" w:hAnsi="Courier New" w:hint="default"/>
+        <w:sz w:val="20"/>
+      </w:rPr>
+    </w:lvl>
+    <w:lvl w:ilvl="2" w:tentative="1">
+      <w:start w:val="1"/>
+      <w:numFmt w:val="decimal"/>
+      <w:lvlText w:val="%3."/>
+      <w:lvlJc w:val="left"/>
+      <w:pPr>
+        <w:tabs>
+          <w:tab w:val="num" w:pos="2160"/>
+        </w:tabs>
+        <w:ind w:left="2160" w:hanging="360"/>
+      </w:pPr>
+    </w:lvl>
+    <w:lvl w:ilvl="3" w:tentative="1">
+      <w:start w:val="1"/>
+      <w:numFmt w:val="decimal"/>
+      <w:lvlText w:val="%4."/>
+      <w:lvlJc w:val="left"/>
+      <w:pPr>
+        <w:tabs>
+          <w:tab w:val="num" w:pos="2880"/>
+        </w:tabs>
+        <w:ind w:left="2880" w:hanging="360"/>
+      </w:pPr>
+    </w:lvl>
+    <w:lvl w:ilvl="4" w:tentative="1">
+      <w:start w:val="1"/>
+      <w:numFmt w:val="decimal"/>
+      <w:lvlText w:val="%5."/>
+      <w:lvlJc w:val="left"/>
+      <w:pPr>
+        <w:tabs>
+          <w:tab w:val="num" w:pos="3600"/>
+        </w:tabs>
+        <w:ind w:left="3600" w:hanging="360"/>
+      </w:pPr>
+    </w:lvl>
+    <w:lvl w:ilvl="5" w:tentative="1">
+      <w:start w:val="1"/>
+      <w:numFmt w:val="decimal"/>
+      <w:lvlText w:val="%6."/>
+      <w:lvlJc w:val="left"/>
+      <w:pPr>
+        <w:tabs>
+          <w:tab w:val="num" w:pos="4320"/>
+        </w:tabs>
+        <w:ind w:left="4320" w:hanging="360"/>
+      </w:pPr>
+    </w:lvl>
+    <w:lvl w:ilvl="6" w:tentative="1">
+      <w:start w:val="1"/>
+      <w:numFmt w:val="decimal"/>
+      <w:lvlText w:val="%7."/>
+      <w:lvlJc w:val="left"/>
+      <w:pPr>
+        <w:tabs>
+          <w:tab w:val="num" w:pos="5040"/>
+        </w:tabs>
+        <w:ind w:left="5040" w:hanging="360"/>
+      </w:pPr>
+    </w:lvl>
+    <w:lvl w:ilvl="7" w:tentative="1">
+      <w:start w:val="1"/>
+      <w:numFmt w:val="decimal"/>
+      <w:lvlText w:val="%8."/>
+      <w:lvlJc w:val="left"/>
+      <w:pPr>
+        <w:tabs>
+          <w:tab w:val="num" w:pos="5760"/>
+        </w:tabs>
+        <w:ind w:left="5760" w:hanging="360"/>
+      </w:pPr>
+    </w:lvl>
+    <w:lvl w:ilvl="8" w:tentative="1">
+      <w:start w:val="1"/>
+      <w:numFmt w:val="decimal"/>
+      <w:lvlText w:val="%9."/>
+      <w:lvlJc w:val="left"/>
+      <w:pPr>
+        <w:tabs>
+          <w:tab w:val="num" w:pos="6480"/>
+        </w:tabs>
+        <w:ind w:left="6480" w:hanging="360"/>
+      </w:pPr>
+    </w:lvl>
+  </w:abstractNum>
+  <w:abstractNum w:abstractNumId="8" w15:restartNumberingAfterBreak="0">
+    <w:nsid w:val="34473A81"/>
+    <w:multiLevelType w:val="multilevel"/>
+    <w:tmpl w:val="72D0062A"/>
     <w:lvl w:ilvl="0">
       <w:start w:val="1"/>
       <w:numFmt w:val="bullet"/>
@@ -12697,10 +14692,188 @@
       </w:rPr>
     </w:lvl>
   </w:abstractNum>
+  <w:abstractNum w:abstractNumId="9" w15:restartNumberingAfterBreak="0">
+    <w:nsid w:val="3F4D3A17"/>
+    <w:multiLevelType w:val="hybridMultilevel"/>
+    <w:tmpl w:val="52B8E63E"/>
+    <w:lvl w:ilvl="0" w:tplc="0C0A0015">
+      <w:start w:val="1"/>
+      <w:numFmt w:val="upperLetter"/>
+      <w:lvlText w:val="%1."/>
+      <w:lvlJc w:val="left"/>
+      <w:pPr>
+        <w:ind w:left="720" w:hanging="360"/>
+      </w:pPr>
+      <w:rPr>
+        <w:rFonts w:hint="default"/>
+      </w:rPr>
+    </w:lvl>
+    <w:lvl w:ilvl="1" w:tplc="0C0A0019" w:tentative="1">
+      <w:start w:val="1"/>
+      <w:numFmt w:val="lowerLetter"/>
+      <w:lvlText w:val="%2."/>
+      <w:lvlJc w:val="left"/>
+      <w:pPr>
+        <w:ind w:left="1440" w:hanging="360"/>
+      </w:pPr>
+    </w:lvl>
+    <w:lvl w:ilvl="2" w:tplc="0C0A001B" w:tentative="1">
+      <w:start w:val="1"/>
+      <w:numFmt w:val="lowerRoman"/>
+      <w:lvlText w:val="%3."/>
+      <w:lvlJc w:val="right"/>
+      <w:pPr>
+        <w:ind w:left="2160" w:hanging="180"/>
+      </w:pPr>
+    </w:lvl>
+    <w:lvl w:ilvl="3" w:tplc="0C0A000F" w:tentative="1">
+      <w:start w:val="1"/>
+      <w:numFmt w:val="decimal"/>
+      <w:lvlText w:val="%4."/>
+      <w:lvlJc w:val="left"/>
+      <w:pPr>
+        <w:ind w:left="2880" w:hanging="360"/>
+      </w:pPr>
+    </w:lvl>
+    <w:lvl w:ilvl="4" w:tplc="0C0A0019" w:tentative="1">
+      <w:start w:val="1"/>
+      <w:numFmt w:val="lowerLetter"/>
+      <w:lvlText w:val="%5."/>
+      <w:lvlJc w:val="left"/>
+      <w:pPr>
+        <w:ind w:left="3600" w:hanging="360"/>
+      </w:pPr>
+    </w:lvl>
+    <w:lvl w:ilvl="5" w:tplc="0C0A001B" w:tentative="1">
+      <w:start w:val="1"/>
+      <w:numFmt w:val="lowerRoman"/>
+      <w:lvlText w:val="%6."/>
+      <w:lvlJc w:val="right"/>
+      <w:pPr>
+        <w:ind w:left="4320" w:hanging="180"/>
+      </w:pPr>
+    </w:lvl>
+    <w:lvl w:ilvl="6" w:tplc="0C0A000F" w:tentative="1">
+      <w:start w:val="1"/>
+      <w:numFmt w:val="decimal"/>
+      <w:lvlText w:val="%7."/>
+      <w:lvlJc w:val="left"/>
+      <w:pPr>
+        <w:ind w:left="5040" w:hanging="360"/>
+      </w:pPr>
+    </w:lvl>
+    <w:lvl w:ilvl="7" w:tplc="0C0A0019" w:tentative="1">
+      <w:start w:val="1"/>
+      <w:numFmt w:val="lowerLetter"/>
+      <w:lvlText w:val="%8."/>
+      <w:lvlJc w:val="left"/>
+      <w:pPr>
+        <w:ind w:left="5760" w:hanging="360"/>
+      </w:pPr>
+    </w:lvl>
+    <w:lvl w:ilvl="8" w:tplc="0C0A001B" w:tentative="1">
+      <w:start w:val="1"/>
+      <w:numFmt w:val="lowerRoman"/>
+      <w:lvlText w:val="%9."/>
+      <w:lvlJc w:val="right"/>
+      <w:pPr>
+        <w:ind w:left="6480" w:hanging="180"/>
+      </w:pPr>
+    </w:lvl>
+  </w:abstractNum>
   <w:abstractNum w:abstractNumId="10" w15:restartNumberingAfterBreak="0">
-    <w:nsid w:val="74762AC3"/>
+    <w:nsid w:val="51090EF7"/>
+    <w:multiLevelType w:val="hybridMultilevel"/>
+    <w:tmpl w:val="FE689D6C"/>
+    <w:lvl w:ilvl="0" w:tplc="0C0A000F">
+      <w:start w:val="1"/>
+      <w:numFmt w:val="decimal"/>
+      <w:lvlText w:val="%1."/>
+      <w:lvlJc w:val="left"/>
+      <w:pPr>
+        <w:ind w:left="360" w:hanging="360"/>
+      </w:pPr>
+      <w:rPr>
+        <w:rFonts w:hint="default"/>
+      </w:rPr>
+    </w:lvl>
+    <w:lvl w:ilvl="1" w:tplc="FFFFFFFF" w:tentative="1">
+      <w:start w:val="1"/>
+      <w:numFmt w:val="lowerLetter"/>
+      <w:lvlText w:val="%2."/>
+      <w:lvlJc w:val="left"/>
+      <w:pPr>
+        <w:ind w:left="1080" w:hanging="360"/>
+      </w:pPr>
+    </w:lvl>
+    <w:lvl w:ilvl="2" w:tplc="FFFFFFFF" w:tentative="1">
+      <w:start w:val="1"/>
+      <w:numFmt w:val="lowerRoman"/>
+      <w:lvlText w:val="%3."/>
+      <w:lvlJc w:val="right"/>
+      <w:pPr>
+        <w:ind w:left="1800" w:hanging="180"/>
+      </w:pPr>
+    </w:lvl>
+    <w:lvl w:ilvl="3" w:tplc="FFFFFFFF" w:tentative="1">
+      <w:start w:val="1"/>
+      <w:numFmt w:val="decimal"/>
+      <w:lvlText w:val="%4."/>
+      <w:lvlJc w:val="left"/>
+      <w:pPr>
+        <w:ind w:left="2520" w:hanging="360"/>
+      </w:pPr>
+    </w:lvl>
+    <w:lvl w:ilvl="4" w:tplc="FFFFFFFF" w:tentative="1">
+      <w:start w:val="1"/>
+      <w:numFmt w:val="lowerLetter"/>
+      <w:lvlText w:val="%5."/>
+      <w:lvlJc w:val="left"/>
+      <w:pPr>
+        <w:ind w:left="3240" w:hanging="360"/>
+      </w:pPr>
+    </w:lvl>
+    <w:lvl w:ilvl="5" w:tplc="FFFFFFFF" w:tentative="1">
+      <w:start w:val="1"/>
+      <w:numFmt w:val="lowerRoman"/>
+      <w:lvlText w:val="%6."/>
+      <w:lvlJc w:val="right"/>
+      <w:pPr>
+        <w:ind w:left="3960" w:hanging="180"/>
+      </w:pPr>
+    </w:lvl>
+    <w:lvl w:ilvl="6" w:tplc="FFFFFFFF" w:tentative="1">
+      <w:start w:val="1"/>
+      <w:numFmt w:val="decimal"/>
+      <w:lvlText w:val="%7."/>
+      <w:lvlJc w:val="left"/>
+      <w:pPr>
+        <w:ind w:left="4680" w:hanging="360"/>
+      </w:pPr>
+    </w:lvl>
+    <w:lvl w:ilvl="7" w:tplc="FFFFFFFF" w:tentative="1">
+      <w:start w:val="1"/>
+      <w:numFmt w:val="lowerLetter"/>
+      <w:lvlText w:val="%8."/>
+      <w:lvlJc w:val="left"/>
+      <w:pPr>
+        <w:ind w:left="5400" w:hanging="360"/>
+      </w:pPr>
+    </w:lvl>
+    <w:lvl w:ilvl="8" w:tplc="FFFFFFFF" w:tentative="1">
+      <w:start w:val="1"/>
+      <w:numFmt w:val="lowerRoman"/>
+      <w:lvlText w:val="%9."/>
+      <w:lvlJc w:val="right"/>
+      <w:pPr>
+        <w:ind w:left="6120" w:hanging="180"/>
+      </w:pPr>
+    </w:lvl>
+  </w:abstractNum>
+  <w:abstractNum w:abstractNumId="11" w15:restartNumberingAfterBreak="0">
+    <w:nsid w:val="6DBD3631"/>
     <w:multiLevelType w:val="multilevel"/>
-    <w:tmpl w:val="28965F00"/>
+    <w:tmpl w:val="62ACF0FE"/>
     <w:lvl w:ilvl="0">
       <w:start w:val="1"/>
       <w:numFmt w:val="bullet"/>
@@ -12846,38 +15019,497 @@
       </w:rPr>
     </w:lvl>
   </w:abstractNum>
+  <w:abstractNum w:abstractNumId="12" w15:restartNumberingAfterBreak="0">
+    <w:nsid w:val="6E1F78C9"/>
+    <w:multiLevelType w:val="multilevel"/>
+    <w:tmpl w:val="2B5609A0"/>
+    <w:lvl w:ilvl="0">
+      <w:start w:val="1"/>
+      <w:numFmt w:val="bullet"/>
+      <w:lvlText w:val=""/>
+      <w:lvlJc w:val="left"/>
+      <w:pPr>
+        <w:tabs>
+          <w:tab w:val="num" w:pos="720"/>
+        </w:tabs>
+        <w:ind w:left="720" w:hanging="360"/>
+      </w:pPr>
+      <w:rPr>
+        <w:rFonts w:ascii="Symbol" w:hAnsi="Symbol" w:hint="default"/>
+        <w:sz w:val="20"/>
+      </w:rPr>
+    </w:lvl>
+    <w:lvl w:ilvl="1" w:tentative="1">
+      <w:start w:val="1"/>
+      <w:numFmt w:val="bullet"/>
+      <w:lvlText w:val="o"/>
+      <w:lvlJc w:val="left"/>
+      <w:pPr>
+        <w:tabs>
+          <w:tab w:val="num" w:pos="1440"/>
+        </w:tabs>
+        <w:ind w:left="1440" w:hanging="360"/>
+      </w:pPr>
+      <w:rPr>
+        <w:rFonts w:ascii="Courier New" w:hAnsi="Courier New" w:hint="default"/>
+        <w:sz w:val="20"/>
+      </w:rPr>
+    </w:lvl>
+    <w:lvl w:ilvl="2" w:tentative="1">
+      <w:start w:val="1"/>
+      <w:numFmt w:val="bullet"/>
+      <w:lvlText w:val=""/>
+      <w:lvlJc w:val="left"/>
+      <w:pPr>
+        <w:tabs>
+          <w:tab w:val="num" w:pos="2160"/>
+        </w:tabs>
+        <w:ind w:left="2160" w:hanging="360"/>
+      </w:pPr>
+      <w:rPr>
+        <w:rFonts w:ascii="Wingdings" w:hAnsi="Wingdings" w:hint="default"/>
+        <w:sz w:val="20"/>
+      </w:rPr>
+    </w:lvl>
+    <w:lvl w:ilvl="3" w:tentative="1">
+      <w:start w:val="1"/>
+      <w:numFmt w:val="bullet"/>
+      <w:lvlText w:val=""/>
+      <w:lvlJc w:val="left"/>
+      <w:pPr>
+        <w:tabs>
+          <w:tab w:val="num" w:pos="2880"/>
+        </w:tabs>
+        <w:ind w:left="2880" w:hanging="360"/>
+      </w:pPr>
+      <w:rPr>
+        <w:rFonts w:ascii="Wingdings" w:hAnsi="Wingdings" w:hint="default"/>
+        <w:sz w:val="20"/>
+      </w:rPr>
+    </w:lvl>
+    <w:lvl w:ilvl="4" w:tentative="1">
+      <w:start w:val="1"/>
+      <w:numFmt w:val="bullet"/>
+      <w:lvlText w:val=""/>
+      <w:lvlJc w:val="left"/>
+      <w:pPr>
+        <w:tabs>
+          <w:tab w:val="num" w:pos="3600"/>
+        </w:tabs>
+        <w:ind w:left="3600" w:hanging="360"/>
+      </w:pPr>
+      <w:rPr>
+        <w:rFonts w:ascii="Wingdings" w:hAnsi="Wingdings" w:hint="default"/>
+        <w:sz w:val="20"/>
+      </w:rPr>
+    </w:lvl>
+    <w:lvl w:ilvl="5" w:tentative="1">
+      <w:start w:val="1"/>
+      <w:numFmt w:val="bullet"/>
+      <w:lvlText w:val=""/>
+      <w:lvlJc w:val="left"/>
+      <w:pPr>
+        <w:tabs>
+          <w:tab w:val="num" w:pos="4320"/>
+        </w:tabs>
+        <w:ind w:left="4320" w:hanging="360"/>
+      </w:pPr>
+      <w:rPr>
+        <w:rFonts w:ascii="Wingdings" w:hAnsi="Wingdings" w:hint="default"/>
+        <w:sz w:val="20"/>
+      </w:rPr>
+    </w:lvl>
+    <w:lvl w:ilvl="6" w:tentative="1">
+      <w:start w:val="1"/>
+      <w:numFmt w:val="bullet"/>
+      <w:lvlText w:val=""/>
+      <w:lvlJc w:val="left"/>
+      <w:pPr>
+        <w:tabs>
+          <w:tab w:val="num" w:pos="5040"/>
+        </w:tabs>
+        <w:ind w:left="5040" w:hanging="360"/>
+      </w:pPr>
+      <w:rPr>
+        <w:rFonts w:ascii="Wingdings" w:hAnsi="Wingdings" w:hint="default"/>
+        <w:sz w:val="20"/>
+      </w:rPr>
+    </w:lvl>
+    <w:lvl w:ilvl="7" w:tentative="1">
+      <w:start w:val="1"/>
+      <w:numFmt w:val="bullet"/>
+      <w:lvlText w:val=""/>
+      <w:lvlJc w:val="left"/>
+      <w:pPr>
+        <w:tabs>
+          <w:tab w:val="num" w:pos="5760"/>
+        </w:tabs>
+        <w:ind w:left="5760" w:hanging="360"/>
+      </w:pPr>
+      <w:rPr>
+        <w:rFonts w:ascii="Wingdings" w:hAnsi="Wingdings" w:hint="default"/>
+        <w:sz w:val="20"/>
+      </w:rPr>
+    </w:lvl>
+    <w:lvl w:ilvl="8" w:tentative="1">
+      <w:start w:val="1"/>
+      <w:numFmt w:val="bullet"/>
+      <w:lvlText w:val=""/>
+      <w:lvlJc w:val="left"/>
+      <w:pPr>
+        <w:tabs>
+          <w:tab w:val="num" w:pos="6480"/>
+        </w:tabs>
+        <w:ind w:left="6480" w:hanging="360"/>
+      </w:pPr>
+      <w:rPr>
+        <w:rFonts w:ascii="Wingdings" w:hAnsi="Wingdings" w:hint="default"/>
+        <w:sz w:val="20"/>
+      </w:rPr>
+    </w:lvl>
+  </w:abstractNum>
+  <w:abstractNum w:abstractNumId="13" w15:restartNumberingAfterBreak="0">
+    <w:nsid w:val="74762AC3"/>
+    <w:multiLevelType w:val="multilevel"/>
+    <w:tmpl w:val="28965F00"/>
+    <w:lvl w:ilvl="0">
+      <w:start w:val="1"/>
+      <w:numFmt w:val="bullet"/>
+      <w:lvlText w:val=""/>
+      <w:lvlJc w:val="left"/>
+      <w:pPr>
+        <w:tabs>
+          <w:tab w:val="num" w:pos="720"/>
+        </w:tabs>
+        <w:ind w:left="720" w:hanging="360"/>
+      </w:pPr>
+      <w:rPr>
+        <w:rFonts w:ascii="Symbol" w:hAnsi="Symbol" w:hint="default"/>
+        <w:sz w:val="20"/>
+      </w:rPr>
+    </w:lvl>
+    <w:lvl w:ilvl="1" w:tentative="1">
+      <w:start w:val="1"/>
+      <w:numFmt w:val="bullet"/>
+      <w:lvlText w:val="o"/>
+      <w:lvlJc w:val="left"/>
+      <w:pPr>
+        <w:tabs>
+          <w:tab w:val="num" w:pos="1440"/>
+        </w:tabs>
+        <w:ind w:left="1440" w:hanging="360"/>
+      </w:pPr>
+      <w:rPr>
+        <w:rFonts w:ascii="Courier New" w:hAnsi="Courier New" w:hint="default"/>
+        <w:sz w:val="20"/>
+      </w:rPr>
+    </w:lvl>
+    <w:lvl w:ilvl="2" w:tentative="1">
+      <w:start w:val="1"/>
+      <w:numFmt w:val="bullet"/>
+      <w:lvlText w:val=""/>
+      <w:lvlJc w:val="left"/>
+      <w:pPr>
+        <w:tabs>
+          <w:tab w:val="num" w:pos="2160"/>
+        </w:tabs>
+        <w:ind w:left="2160" w:hanging="360"/>
+      </w:pPr>
+      <w:rPr>
+        <w:rFonts w:ascii="Wingdings" w:hAnsi="Wingdings" w:hint="default"/>
+        <w:sz w:val="20"/>
+      </w:rPr>
+    </w:lvl>
+    <w:lvl w:ilvl="3" w:tentative="1">
+      <w:start w:val="1"/>
+      <w:numFmt w:val="bullet"/>
+      <w:lvlText w:val=""/>
+      <w:lvlJc w:val="left"/>
+      <w:pPr>
+        <w:tabs>
+          <w:tab w:val="num" w:pos="2880"/>
+        </w:tabs>
+        <w:ind w:left="2880" w:hanging="360"/>
+      </w:pPr>
+      <w:rPr>
+        <w:rFonts w:ascii="Wingdings" w:hAnsi="Wingdings" w:hint="default"/>
+        <w:sz w:val="20"/>
+      </w:rPr>
+    </w:lvl>
+    <w:lvl w:ilvl="4" w:tentative="1">
+      <w:start w:val="1"/>
+      <w:numFmt w:val="bullet"/>
+      <w:lvlText w:val=""/>
+      <w:lvlJc w:val="left"/>
+      <w:pPr>
+        <w:tabs>
+          <w:tab w:val="num" w:pos="3600"/>
+        </w:tabs>
+        <w:ind w:left="3600" w:hanging="360"/>
+      </w:pPr>
+      <w:rPr>
+        <w:rFonts w:ascii="Wingdings" w:hAnsi="Wingdings" w:hint="default"/>
+        <w:sz w:val="20"/>
+      </w:rPr>
+    </w:lvl>
+    <w:lvl w:ilvl="5" w:tentative="1">
+      <w:start w:val="1"/>
+      <w:numFmt w:val="bullet"/>
+      <w:lvlText w:val=""/>
+      <w:lvlJc w:val="left"/>
+      <w:pPr>
+        <w:tabs>
+          <w:tab w:val="num" w:pos="4320"/>
+        </w:tabs>
+        <w:ind w:left="4320" w:hanging="360"/>
+      </w:pPr>
+      <w:rPr>
+        <w:rFonts w:ascii="Wingdings" w:hAnsi="Wingdings" w:hint="default"/>
+        <w:sz w:val="20"/>
+      </w:rPr>
+    </w:lvl>
+    <w:lvl w:ilvl="6" w:tentative="1">
+      <w:start w:val="1"/>
+      <w:numFmt w:val="bullet"/>
+      <w:lvlText w:val=""/>
+      <w:lvlJc w:val="left"/>
+      <w:pPr>
+        <w:tabs>
+          <w:tab w:val="num" w:pos="5040"/>
+        </w:tabs>
+        <w:ind w:left="5040" w:hanging="360"/>
+      </w:pPr>
+      <w:rPr>
+        <w:rFonts w:ascii="Wingdings" w:hAnsi="Wingdings" w:hint="default"/>
+        <w:sz w:val="20"/>
+      </w:rPr>
+    </w:lvl>
+    <w:lvl w:ilvl="7" w:tentative="1">
+      <w:start w:val="1"/>
+      <w:numFmt w:val="bullet"/>
+      <w:lvlText w:val=""/>
+      <w:lvlJc w:val="left"/>
+      <w:pPr>
+        <w:tabs>
+          <w:tab w:val="num" w:pos="5760"/>
+        </w:tabs>
+        <w:ind w:left="5760" w:hanging="360"/>
+      </w:pPr>
+      <w:rPr>
+        <w:rFonts w:ascii="Wingdings" w:hAnsi="Wingdings" w:hint="default"/>
+        <w:sz w:val="20"/>
+      </w:rPr>
+    </w:lvl>
+    <w:lvl w:ilvl="8" w:tentative="1">
+      <w:start w:val="1"/>
+      <w:numFmt w:val="bullet"/>
+      <w:lvlText w:val=""/>
+      <w:lvlJc w:val="left"/>
+      <w:pPr>
+        <w:tabs>
+          <w:tab w:val="num" w:pos="6480"/>
+        </w:tabs>
+        <w:ind w:left="6480" w:hanging="360"/>
+      </w:pPr>
+      <w:rPr>
+        <w:rFonts w:ascii="Wingdings" w:hAnsi="Wingdings" w:hint="default"/>
+        <w:sz w:val="20"/>
+      </w:rPr>
+    </w:lvl>
+  </w:abstractNum>
+  <w:abstractNum w:abstractNumId="14" w15:restartNumberingAfterBreak="0">
+    <w:nsid w:val="7BA12907"/>
+    <w:multiLevelType w:val="multilevel"/>
+    <w:tmpl w:val="404C2EFC"/>
+    <w:lvl w:ilvl="0">
+      <w:start w:val="1"/>
+      <w:numFmt w:val="bullet"/>
+      <w:lvlText w:val=""/>
+      <w:lvlJc w:val="left"/>
+      <w:pPr>
+        <w:tabs>
+          <w:tab w:val="num" w:pos="720"/>
+        </w:tabs>
+        <w:ind w:left="720" w:hanging="360"/>
+      </w:pPr>
+      <w:rPr>
+        <w:rFonts w:ascii="Symbol" w:hAnsi="Symbol" w:hint="default"/>
+        <w:sz w:val="20"/>
+      </w:rPr>
+    </w:lvl>
+    <w:lvl w:ilvl="1" w:tentative="1">
+      <w:start w:val="1"/>
+      <w:numFmt w:val="bullet"/>
+      <w:lvlText w:val="o"/>
+      <w:lvlJc w:val="left"/>
+      <w:pPr>
+        <w:tabs>
+          <w:tab w:val="num" w:pos="1440"/>
+        </w:tabs>
+        <w:ind w:left="1440" w:hanging="360"/>
+      </w:pPr>
+      <w:rPr>
+        <w:rFonts w:ascii="Courier New" w:hAnsi="Courier New" w:hint="default"/>
+        <w:sz w:val="20"/>
+      </w:rPr>
+    </w:lvl>
+    <w:lvl w:ilvl="2" w:tentative="1">
+      <w:start w:val="1"/>
+      <w:numFmt w:val="bullet"/>
+      <w:lvlText w:val=""/>
+      <w:lvlJc w:val="left"/>
+      <w:pPr>
+        <w:tabs>
+          <w:tab w:val="num" w:pos="2160"/>
+        </w:tabs>
+        <w:ind w:left="2160" w:hanging="360"/>
+      </w:pPr>
+      <w:rPr>
+        <w:rFonts w:ascii="Wingdings" w:hAnsi="Wingdings" w:hint="default"/>
+        <w:sz w:val="20"/>
+      </w:rPr>
+    </w:lvl>
+    <w:lvl w:ilvl="3" w:tentative="1">
+      <w:start w:val="1"/>
+      <w:numFmt w:val="bullet"/>
+      <w:lvlText w:val=""/>
+      <w:lvlJc w:val="left"/>
+      <w:pPr>
+        <w:tabs>
+          <w:tab w:val="num" w:pos="2880"/>
+        </w:tabs>
+        <w:ind w:left="2880" w:hanging="360"/>
+      </w:pPr>
+      <w:rPr>
+        <w:rFonts w:ascii="Wingdings" w:hAnsi="Wingdings" w:hint="default"/>
+        <w:sz w:val="20"/>
+      </w:rPr>
+    </w:lvl>
+    <w:lvl w:ilvl="4" w:tentative="1">
+      <w:start w:val="1"/>
+      <w:numFmt w:val="bullet"/>
+      <w:lvlText w:val=""/>
+      <w:lvlJc w:val="left"/>
+      <w:pPr>
+        <w:tabs>
+          <w:tab w:val="num" w:pos="3600"/>
+        </w:tabs>
+        <w:ind w:left="3600" w:hanging="360"/>
+      </w:pPr>
+      <w:rPr>
+        <w:rFonts w:ascii="Wingdings" w:hAnsi="Wingdings" w:hint="default"/>
+        <w:sz w:val="20"/>
+      </w:rPr>
+    </w:lvl>
+    <w:lvl w:ilvl="5" w:tentative="1">
+      <w:start w:val="1"/>
+      <w:numFmt w:val="bullet"/>
+      <w:lvlText w:val=""/>
+      <w:lvlJc w:val="left"/>
+      <w:pPr>
+        <w:tabs>
+          <w:tab w:val="num" w:pos="4320"/>
+        </w:tabs>
+        <w:ind w:left="4320" w:hanging="360"/>
+      </w:pPr>
+      <w:rPr>
+        <w:rFonts w:ascii="Wingdings" w:hAnsi="Wingdings" w:hint="default"/>
+        <w:sz w:val="20"/>
+      </w:rPr>
+    </w:lvl>
+    <w:lvl w:ilvl="6" w:tentative="1">
+      <w:start w:val="1"/>
+      <w:numFmt w:val="bullet"/>
+      <w:lvlText w:val=""/>
+      <w:lvlJc w:val="left"/>
+      <w:pPr>
+        <w:tabs>
+          <w:tab w:val="num" w:pos="5040"/>
+        </w:tabs>
+        <w:ind w:left="5040" w:hanging="360"/>
+      </w:pPr>
+      <w:rPr>
+        <w:rFonts w:ascii="Wingdings" w:hAnsi="Wingdings" w:hint="default"/>
+        <w:sz w:val="20"/>
+      </w:rPr>
+    </w:lvl>
+    <w:lvl w:ilvl="7" w:tentative="1">
+      <w:start w:val="1"/>
+      <w:numFmt w:val="bullet"/>
+      <w:lvlText w:val=""/>
+      <w:lvlJc w:val="left"/>
+      <w:pPr>
+        <w:tabs>
+          <w:tab w:val="num" w:pos="5760"/>
+        </w:tabs>
+        <w:ind w:left="5760" w:hanging="360"/>
+      </w:pPr>
+      <w:rPr>
+        <w:rFonts w:ascii="Wingdings" w:hAnsi="Wingdings" w:hint="default"/>
+        <w:sz w:val="20"/>
+      </w:rPr>
+    </w:lvl>
+    <w:lvl w:ilvl="8" w:tentative="1">
+      <w:start w:val="1"/>
+      <w:numFmt w:val="bullet"/>
+      <w:lvlText w:val=""/>
+      <w:lvlJc w:val="left"/>
+      <w:pPr>
+        <w:tabs>
+          <w:tab w:val="num" w:pos="6480"/>
+        </w:tabs>
+        <w:ind w:left="6480" w:hanging="360"/>
+      </w:pPr>
+      <w:rPr>
+        <w:rFonts w:ascii="Wingdings" w:hAnsi="Wingdings" w:hint="default"/>
+        <w:sz w:val="20"/>
+      </w:rPr>
+    </w:lvl>
+  </w:abstractNum>
   <w:num w:numId="1" w16cid:durableId="1766531474">
+    <w:abstractNumId w:val="11"/>
+  </w:num>
+  <w:num w:numId="2" w16cid:durableId="1585794975">
+    <w:abstractNumId w:val="3"/>
+  </w:num>
+  <w:num w:numId="3" w16cid:durableId="1424642946">
+    <w:abstractNumId w:val="12"/>
+  </w:num>
+  <w:num w:numId="4" w16cid:durableId="202717371">
+    <w:abstractNumId w:val="4"/>
+  </w:num>
+  <w:num w:numId="5" w16cid:durableId="2012414202">
+    <w:abstractNumId w:val="5"/>
+  </w:num>
+  <w:num w:numId="6" w16cid:durableId="753549070">
+    <w:abstractNumId w:val="13"/>
+  </w:num>
+  <w:num w:numId="7" w16cid:durableId="1339042036">
+    <w:abstractNumId w:val="2"/>
+  </w:num>
+  <w:num w:numId="8" w16cid:durableId="1433822892">
+    <w:abstractNumId w:val="9"/>
+  </w:num>
+  <w:num w:numId="9" w16cid:durableId="1094284610">
+    <w:abstractNumId w:val="6"/>
+  </w:num>
+  <w:num w:numId="10" w16cid:durableId="1359158530">
+    <w:abstractNumId w:val="1"/>
+  </w:num>
+  <w:num w:numId="11" w16cid:durableId="1412117743">
+    <w:abstractNumId w:val="10"/>
+  </w:num>
+  <w:num w:numId="12" w16cid:durableId="1749230004">
     <w:abstractNumId w:val="8"/>
   </w:num>
-  <w:num w:numId="2" w16cid:durableId="1585794975">
-    <w:abstractNumId w:val="2"/>
+  <w:num w:numId="13" w16cid:durableId="2057005939">
+    <w:abstractNumId w:val="7"/>
   </w:num>
-  <w:num w:numId="3" w16cid:durableId="1424642946">
-    <w:abstractNumId w:val="9"/>
-  </w:num>
-  <w:num w:numId="4" w16cid:durableId="202717371">
-    <w:abstractNumId w:val="3"/>
-  </w:num>
-  <w:num w:numId="5" w16cid:durableId="2012414202">
-    <w:abstractNumId w:val="4"/>
-  </w:num>
-  <w:num w:numId="6" w16cid:durableId="753549070">
-    <w:abstractNumId w:val="10"/>
-  </w:num>
-  <w:num w:numId="7" w16cid:durableId="1339042036">
-    <w:abstractNumId w:val="1"/>
-  </w:num>
-  <w:num w:numId="8" w16cid:durableId="1433822892">
-    <w:abstractNumId w:val="6"/>
-  </w:num>
-  <w:num w:numId="9" w16cid:durableId="1094284610">
-    <w:abstractNumId w:val="5"/>
-  </w:num>
-  <w:num w:numId="10" w16cid:durableId="1359158530">
+  <w:num w:numId="14" w16cid:durableId="821967173">
     <w:abstractNumId w:val="0"/>
   </w:num>
-  <w:num w:numId="11" w16cid:durableId="1412117743">
-    <w:abstractNumId w:val="7"/>
+  <w:num w:numId="15" w16cid:durableId="1706369157">
+    <w:abstractNumId w:val="14"/>
   </w:num>
 </w:numbering>
 </file>
@@ -13489,7 +16121,6 @@
   <w:style w:type="character" w:default="1" w:styleId="Fuentedeprrafopredeter">
     <w:name w:val="Default Paragraph Font"/>
     <w:uiPriority w:val="1"/>
-    <w:semiHidden/>
     <w:unhideWhenUsed/>
   </w:style>
   <w:style w:type="table" w:default="1" w:styleId="Tablanormal">
@@ -13920,6 +16551,17 @@
       <w:szCs w:val="20"/>
     </w:rPr>
   </w:style>
+  <w:style w:type="character" w:styleId="Textoennegrita">
+    <w:name w:val="Strong"/>
+    <w:basedOn w:val="Fuentedeprrafopredeter"/>
+    <w:uiPriority w:val="22"/>
+    <w:qFormat/>
+    <w:rsid w:val="0038093F"/>
+    <w:rPr>
+      <w:b/>
+      <w:bCs/>
+    </w:rPr>
+  </w:style>
 </w:styles>
 </file>
 

</xml_diff>

<commit_message>
añadiendo gastos, cobros y ampliaciones a alquiler
</commit_message>
<xml_diff>
--- a/BASE DATOS EMPRESA/EMPRESA/FUNCIONAMIENTO DE TODO.docx
+++ b/BASE DATOS EMPRESA/EMPRESA/FUNCIONAMIENTO DE TODO.docx
@@ -11328,7 +11328,13 @@
     </w:p>
     <w:p>
       <w:r>
-        <w:t>El nombre de un campo que es clave ajena se llamara como se tenga que llamar, nombre indicativo de su tabla, no tiene que tener nombre indecativo de la clave con la que sta relacionada. (campo propietario en vehiculos no se tiene que llamar idEntidad, se llama propietario) porque el nombre del campo en la tabla principal tiene un sentido pero en la tabla relacionada tiene otro sentido.</w:t>
+        <w:t>El nombre de un campo que es clave ajena se llamara como se tenga que llamar, nombre indicativo de su tabla, no tiene que tener nombre ind</w:t>
+      </w:r>
+      <w:r>
+        <w:t>i</w:t>
+      </w:r>
+      <w:r>
+        <w:t>cativo de la clave con la que sta relacionada. (campo propietario en vehiculos no se tiene que llamar idEntidad, se llama propietario) porque el nombre del campo en la tabla principal tiene un sentido pero en la tabla relacionada tiene otro sentido.</w:t>
       </w:r>
     </w:p>
     <w:p>
@@ -12641,6 +12647,7 @@
         </w:rPr>
         <w:t xml:space="preserve">Con </w:t>
       </w:r>
+      <w:proofErr w:type="gramStart"/>
       <w:r>
         <w:rPr>
           <w:rFonts w:ascii="Courier New" w:eastAsia="Times New Roman" w:hAnsi="Courier New" w:cs="Courier New"/>
@@ -12651,7 +12658,20 @@
           <w:lang w:eastAsia="es-ES"/>
           <w14:ligatures w14:val="none"/>
         </w:rPr>
-        <w:t>COALESCE(...,0)</w:t>
+        <w:t>COALESCE(</w:t>
+      </w:r>
+      <w:proofErr w:type="gramEnd"/>
+      <w:r>
+        <w:rPr>
+          <w:rFonts w:ascii="Courier New" w:eastAsia="Times New Roman" w:hAnsi="Courier New" w:cs="Courier New"/>
+          <w:noProof w:val="0"/>
+          <w:kern w:val="0"/>
+          <w:sz w:val="20"/>
+          <w:szCs w:val="20"/>
+          <w:lang w:eastAsia="es-ES"/>
+          <w14:ligatures w14:val="none"/>
+        </w:rPr>
+        <w:t>...,0)</w:t>
       </w:r>
       <w:r>
         <w:rPr>

</xml_diff>

<commit_message>
analisis de vehiculos con seleccion multiple
</commit_message>
<xml_diff>
--- a/BASE DATOS EMPRESA/EMPRESA/FUNCIONAMIENTO DE TODO.docx
+++ b/BASE DATOS EMPRESA/EMPRESA/FUNCIONAMIENTO DE TODO.docx
@@ -25029,21 +25029,1066 @@
       <w:pPr>
         <w:pStyle w:val="Sinespaciado"/>
         <w:ind w:left="360"/>
-        <w:rPr>
-          <w:b/>
-          <w:bCs/>
-        </w:rPr>
-      </w:pPr>
-    </w:p>
-    <w:p>
-      <w:pPr>
-        <w:pStyle w:val="Sinespaciado"/>
-        <w:ind w:left="360"/>
-        <w:rPr>
-          <w:b/>
-          <w:bCs/>
-        </w:rPr>
-      </w:pPr>
+        <w:jc w:val="center"/>
+        <w:rPr>
+          <w:b/>
+          <w:bCs/>
+        </w:rPr>
+      </w:pPr>
+      <w:r>
+        <w:rPr>
+          <w:b/>
+          <w:bCs/>
+        </w:rPr>
+        <w:t>FORMAS DE ENVIAR DATOS CON EL FETCH</w:t>
+      </w:r>
+    </w:p>
+    <w:p>
+      <w:pPr>
+        <w:pStyle w:val="Sinespaciado"/>
+        <w:ind w:left="360"/>
+        <w:rPr>
+          <w:b/>
+          <w:bCs/>
+        </w:rPr>
+      </w:pPr>
+    </w:p>
+    <w:p>
+      <w:pPr>
+        <w:pStyle w:val="Sinespaciado"/>
+        <w:ind w:left="360"/>
+        <w:rPr>
+          <w:b/>
+          <w:bCs/>
+          <w:color w:val="EE0000"/>
+        </w:rPr>
+      </w:pPr>
+      <w:r>
+        <w:rPr>
+          <w:b/>
+          <w:bCs/>
+          <w:color w:val="EE0000"/>
+        </w:rPr>
+        <w:t xml:space="preserve">    fetch("detalles_alquiler.php?id=123")</w:t>
+      </w:r>
+    </w:p>
+    <w:p>
+      <w:pPr>
+        <w:pStyle w:val="Sinespaciado"/>
+        <w:ind w:left="360"/>
+        <w:rPr>
+          <w:b/>
+          <w:bCs/>
+        </w:rPr>
+      </w:pPr>
+      <w:r>
+        <w:rPr>
+          <w:b/>
+          <w:bCs/>
+        </w:rPr>
+        <w:t>De esta forma se envia en la URL con el metodo GET, si quiero enviar muchos  datos se hace una URL muy larga pero si se puede:</w:t>
+      </w:r>
+    </w:p>
+    <w:p>
+      <w:pPr>
+        <w:pStyle w:val="Sinespaciado"/>
+        <w:ind w:left="360"/>
+        <w:rPr>
+          <w:b/>
+          <w:bCs/>
+        </w:rPr>
+      </w:pPr>
+      <w:r>
+        <w:rPr>
+          <w:b/>
+          <w:bCs/>
+        </w:rPr>
+        <w:t>Preparo los parametros de la URL en un solo string</w:t>
+      </w:r>
+    </w:p>
+    <w:p>
+      <w:pPr>
+        <w:pStyle w:val="Sinespaciado"/>
+        <w:ind w:left="360"/>
+        <w:rPr>
+          <w:b/>
+          <w:bCs/>
+          <w:color w:val="FF0000"/>
+        </w:rPr>
+      </w:pPr>
+      <w:r>
+        <w:rPr>
+          <w:b/>
+          <w:bCs/>
+          <w:color w:val="FF0000"/>
+        </w:rPr>
+        <w:t>const params = new URLSearchParams({</w:t>
+      </w:r>
+    </w:p>
+    <w:p>
+      <w:pPr>
+        <w:pStyle w:val="Sinespaciado"/>
+        <w:ind w:left="360"/>
+        <w:rPr>
+          <w:b/>
+          <w:bCs/>
+          <w:color w:val="FF0000"/>
+        </w:rPr>
+      </w:pPr>
+      <w:r>
+        <w:rPr>
+          <w:b/>
+          <w:bCs/>
+          <w:color w:val="FF0000"/>
+        </w:rPr>
+        <w:t xml:space="preserve">    desde: desde,</w:t>
+      </w:r>
+    </w:p>
+    <w:p>
+      <w:pPr>
+        <w:pStyle w:val="Sinespaciado"/>
+        <w:ind w:left="360"/>
+        <w:rPr>
+          <w:b/>
+          <w:bCs/>
+          <w:color w:val="FF0000"/>
+        </w:rPr>
+      </w:pPr>
+      <w:r>
+        <w:rPr>
+          <w:b/>
+          <w:bCs/>
+          <w:color w:val="FF0000"/>
+        </w:rPr>
+        <w:t xml:space="preserve">    hasta: hasta,</w:t>
+      </w:r>
+    </w:p>
+    <w:p>
+      <w:pPr>
+        <w:pStyle w:val="Sinespaciado"/>
+        <w:ind w:left="360"/>
+        <w:rPr>
+          <w:b/>
+          <w:bCs/>
+          <w:color w:val="FF0000"/>
+        </w:rPr>
+      </w:pPr>
+      <w:r>
+        <w:rPr>
+          <w:b/>
+          <w:bCs/>
+          <w:color w:val="FF0000"/>
+        </w:rPr>
+        <w:t xml:space="preserve">cocheIds: cocheIds.join(',') </w:t>
+      </w:r>
+      <w:r>
+        <w:rPr>
+          <w:b/>
+          <w:bCs/>
+        </w:rPr>
+        <w:t>// "1,2,3,4"</w:t>
+      </w:r>
+      <w:r>
+        <w:rPr>
+          <w:b/>
+          <w:bCs/>
+          <w:color w:val="FF0000"/>
+        </w:rPr>
+        <w:t xml:space="preserve"> </w:t>
+      </w:r>
+      <w:r>
+        <w:rPr>
+          <w:b/>
+          <w:bCs/>
+        </w:rPr>
+        <w:t>esto serian</w:t>
+      </w:r>
+      <w:r>
+        <w:rPr>
+          <w:b/>
+          <w:bCs/>
+          <w:color w:val="FF0000"/>
+        </w:rPr>
+        <w:t xml:space="preserve"> </w:t>
+      </w:r>
+      <w:r>
+        <w:rPr>
+          <w:b/>
+          <w:bCs/>
+        </w:rPr>
+        <w:t xml:space="preserve">los ids de coches para leer. Primero se han leido los ids de la lista desplegable y se han metido en una tabla cocheids. </w:t>
+      </w:r>
+      <w:r>
+        <w:rPr>
+          <w:b/>
+          <w:bCs/>
+        </w:rPr>
+        <w:t>: cocheIds.join(',')</w:t>
+      </w:r>
+      <w:r>
+        <w:rPr>
+          <w:b/>
+          <w:bCs/>
+        </w:rPr>
+        <w:t xml:space="preserve"> con esto la tabla cocheids se convierte en un string separado por comas</w:t>
+      </w:r>
+    </w:p>
+    <w:p>
+      <w:pPr>
+        <w:pStyle w:val="Sinespaciado"/>
+        <w:ind w:left="360"/>
+        <w:rPr>
+          <w:b/>
+          <w:bCs/>
+          <w:color w:val="FF0000"/>
+        </w:rPr>
+      </w:pPr>
+      <w:r>
+        <w:rPr>
+          <w:b/>
+          <w:bCs/>
+          <w:color w:val="FF0000"/>
+        </w:rPr>
+        <w:t>});</w:t>
+      </w:r>
+    </w:p>
+    <w:p>
+      <w:pPr>
+        <w:pStyle w:val="Sinespaciado"/>
+        <w:ind w:left="360"/>
+        <w:rPr>
+          <w:b/>
+          <w:bCs/>
+        </w:rPr>
+      </w:pPr>
+      <w:r>
+        <w:rPr>
+          <w:b/>
+          <w:bCs/>
+          <w:color w:val="FF0000"/>
+        </w:rPr>
+        <w:t>fetch('/mis_pruebas/total_alquileres_vehiculo?' + params.toString())</w:t>
+      </w:r>
+      <w:r>
+        <w:rPr>
+          <w:b/>
+          <w:bCs/>
+          <w:color w:val="FF0000"/>
+        </w:rPr>
+        <w:t xml:space="preserve"> </w:t>
+      </w:r>
+      <w:r>
+        <w:rPr>
+          <w:b/>
+          <w:bCs/>
+        </w:rPr>
+        <w:t>//el string creado se añade a la ruta</w:t>
+      </w:r>
+    </w:p>
+    <w:p>
+      <w:pPr>
+        <w:pStyle w:val="Sinespaciado"/>
+        <w:ind w:left="360"/>
+        <w:rPr>
+          <w:b/>
+          <w:bCs/>
+        </w:rPr>
+      </w:pPr>
+      <w:r>
+        <w:rPr>
+          <w:b/>
+          <w:bCs/>
+        </w:rPr>
+        <w:t xml:space="preserve">luego en el script PHP hay que sacar la informacion asi: </w:t>
+      </w:r>
+    </w:p>
+    <w:p>
+      <w:pPr>
+        <w:pStyle w:val="Sinespaciado"/>
+        <w:ind w:left="360"/>
+        <w:rPr>
+          <w:b/>
+          <w:bCs/>
+        </w:rPr>
+      </w:pPr>
+    </w:p>
+    <w:p>
+      <w:pPr>
+        <w:pStyle w:val="Sinespaciado"/>
+        <w:ind w:left="360"/>
+        <w:rPr>
+          <w:b/>
+          <w:bCs/>
+        </w:rPr>
+      </w:pPr>
+      <w:r>
+        <w:rPr>
+          <w:b/>
+          <w:bCs/>
+        </w:rPr>
+        <w:t>$cocheIds = explode(',', $_GET['cocheIds'] ?? '');</w:t>
+      </w:r>
+      <w:r>
+        <w:rPr>
+          <w:b/>
+          <w:bCs/>
+        </w:rPr>
+        <w:t xml:space="preserve"> y las fechas salen con $_GET[‘desde’] y hasta</w:t>
+      </w:r>
+      <w:r>
+        <w:rPr>
+          <w:b/>
+          <w:bCs/>
+        </w:rPr>
+        <w:t>.</w:t>
+      </w:r>
+    </w:p>
+    <w:p>
+      <w:pPr>
+        <w:pStyle w:val="Sinespaciado"/>
+        <w:ind w:left="360"/>
+        <w:rPr>
+          <w:b/>
+          <w:bCs/>
+        </w:rPr>
+      </w:pPr>
+      <w:r>
+        <w:rPr>
+          <w:b/>
+          <w:bCs/>
+        </w:rPr>
+        <w:t>En el select de la pagina no hace falta poner name = “cochesids[]” porque eso solo funciona para formularios con POST, al usar GET en la URL pone cochesids=id y solo pone un id, los otros no los pone, y en $_GET solo hay un id. En definitava con GET solo se puede si se usa el fetch y porque construimos una URL con cocheids=id,id,id… pero eso no es una tabla, es una cadena, cuando llega con $_GET[‘cocheids’] tengo una cadena.</w:t>
+      </w:r>
+    </w:p>
+    <w:p>
+      <w:pPr>
+        <w:pStyle w:val="Sinespaciado"/>
+        <w:ind w:left="360"/>
+        <w:rPr>
+          <w:b/>
+          <w:bCs/>
+        </w:rPr>
+      </w:pPr>
+      <w:r>
+        <w:rPr>
+          <w:b/>
+          <w:bCs/>
+        </w:rPr>
+        <w:t>Si uso POST si que hay que poner name = cocheids[] y en $POST[‘cocheids’] tengo una tabla con todos los ids</w:t>
+      </w:r>
+    </w:p>
+    <w:p>
+      <w:pPr>
+        <w:pStyle w:val="Sinespaciado"/>
+        <w:ind w:left="360"/>
+        <w:rPr>
+          <w:b/>
+          <w:bCs/>
+        </w:rPr>
+      </w:pPr>
+      <w:r>
+        <w:rPr>
+          <w:b/>
+          <w:bCs/>
+        </w:rPr>
+        <w:t>Para pasar datos con fetch y usando POST es asi:</w:t>
+      </w:r>
+    </w:p>
+    <w:p>
+      <w:pPr>
+        <w:pStyle w:val="Sinespaciado"/>
+        <w:ind w:left="360"/>
+        <w:rPr>
+          <w:b/>
+          <w:bCs/>
+          <w:color w:val="EE0000"/>
+        </w:rPr>
+      </w:pPr>
+      <w:r>
+        <w:rPr>
+          <w:b/>
+          <w:bCs/>
+          <w:color w:val="EE0000"/>
+        </w:rPr>
+        <w:t>fetch('/mis_pruebas/total_alquileres_vehiculo', {</w:t>
+      </w:r>
+    </w:p>
+    <w:p>
+      <w:pPr>
+        <w:pStyle w:val="Sinespaciado"/>
+        <w:ind w:left="360"/>
+        <w:rPr>
+          <w:b/>
+          <w:bCs/>
+          <w:color w:val="00B050"/>
+        </w:rPr>
+      </w:pPr>
+      <w:r>
+        <w:rPr>
+          <w:b/>
+          <w:bCs/>
+          <w:color w:val="00B050"/>
+        </w:rPr>
+        <w:t xml:space="preserve">                method: 'POST',</w:t>
+      </w:r>
+    </w:p>
+    <w:p>
+      <w:pPr>
+        <w:pStyle w:val="Sinespaciado"/>
+        <w:ind w:left="360"/>
+        <w:rPr>
+          <w:b/>
+          <w:bCs/>
+          <w:color w:val="00B050"/>
+        </w:rPr>
+      </w:pPr>
+      <w:r>
+        <w:rPr>
+          <w:b/>
+          <w:bCs/>
+          <w:color w:val="00B050"/>
+        </w:rPr>
+        <w:t xml:space="preserve">                headers: {</w:t>
+      </w:r>
+    </w:p>
+    <w:p>
+      <w:pPr>
+        <w:pStyle w:val="Sinespaciado"/>
+        <w:ind w:left="360"/>
+        <w:rPr>
+          <w:b/>
+          <w:bCs/>
+          <w:color w:val="00B050"/>
+        </w:rPr>
+      </w:pPr>
+      <w:r>
+        <w:rPr>
+          <w:b/>
+          <w:bCs/>
+          <w:color w:val="00B050"/>
+        </w:rPr>
+        <w:t xml:space="preserve">                    'Content-Type': 'application/json'</w:t>
+      </w:r>
+    </w:p>
+    <w:p>
+      <w:pPr>
+        <w:pStyle w:val="Sinespaciado"/>
+        <w:ind w:left="360"/>
+        <w:rPr>
+          <w:b/>
+          <w:bCs/>
+          <w:color w:val="00B050"/>
+        </w:rPr>
+      </w:pPr>
+      <w:r>
+        <w:rPr>
+          <w:b/>
+          <w:bCs/>
+          <w:color w:val="00B050"/>
+        </w:rPr>
+        <w:t xml:space="preserve">                },</w:t>
+      </w:r>
+    </w:p>
+    <w:p>
+      <w:pPr>
+        <w:pStyle w:val="Sinespaciado"/>
+        <w:ind w:left="360"/>
+        <w:rPr>
+          <w:b/>
+          <w:bCs/>
+          <w:color w:val="00B050"/>
+        </w:rPr>
+      </w:pPr>
+      <w:r>
+        <w:rPr>
+          <w:b/>
+          <w:bCs/>
+          <w:color w:val="00B050"/>
+        </w:rPr>
+        <w:t xml:space="preserve">                body: JSON.stringify({</w:t>
+      </w:r>
+    </w:p>
+    <w:p>
+      <w:pPr>
+        <w:pStyle w:val="Sinespaciado"/>
+        <w:ind w:left="360"/>
+        <w:rPr>
+          <w:b/>
+          <w:bCs/>
+          <w:color w:val="00B050"/>
+        </w:rPr>
+      </w:pPr>
+      <w:r>
+        <w:rPr>
+          <w:b/>
+          <w:bCs/>
+          <w:color w:val="00B050"/>
+        </w:rPr>
+        <w:t xml:space="preserve">                    desde: desde,</w:t>
+      </w:r>
+    </w:p>
+    <w:p>
+      <w:pPr>
+        <w:pStyle w:val="Sinespaciado"/>
+        <w:ind w:left="360"/>
+        <w:rPr>
+          <w:b/>
+          <w:bCs/>
+          <w:color w:val="00B050"/>
+        </w:rPr>
+      </w:pPr>
+      <w:r>
+        <w:rPr>
+          <w:b/>
+          <w:bCs/>
+          <w:color w:val="00B050"/>
+        </w:rPr>
+        <w:t xml:space="preserve">                    hasta: hasta,</w:t>
+      </w:r>
+    </w:p>
+    <w:p>
+      <w:pPr>
+        <w:pStyle w:val="Sinespaciado"/>
+        <w:ind w:left="360"/>
+        <w:rPr>
+          <w:b/>
+          <w:bCs/>
+          <w:color w:val="00B050"/>
+        </w:rPr>
+      </w:pPr>
+      <w:r>
+        <w:rPr>
+          <w:b/>
+          <w:bCs/>
+          <w:color w:val="00B050"/>
+        </w:rPr>
+        <w:t xml:space="preserve">                    cocheIds: cocheIds</w:t>
+      </w:r>
+    </w:p>
+    <w:p>
+      <w:pPr>
+        <w:pStyle w:val="Sinespaciado"/>
+        <w:ind w:left="360"/>
+        <w:rPr>
+          <w:b/>
+          <w:bCs/>
+        </w:rPr>
+      </w:pPr>
+      <w:r>
+        <w:rPr>
+          <w:b/>
+          <w:bCs/>
+          <w:color w:val="00B050"/>
+        </w:rPr>
+        <w:t xml:space="preserve">                </w:t>
+      </w:r>
+      <w:r>
+        <w:rPr>
+          <w:b/>
+          <w:bCs/>
+        </w:rPr>
+        <w:t>})</w:t>
+      </w:r>
+      <w:r>
+        <w:rPr>
+          <w:b/>
+          <w:bCs/>
+        </w:rPr>
+        <w:t>//se pasan en formato JSON</w:t>
+      </w:r>
+    </w:p>
+    <w:p>
+      <w:pPr>
+        <w:pStyle w:val="Sinespaciado"/>
+        <w:ind w:left="360"/>
+        <w:rPr>
+          <w:b/>
+          <w:bCs/>
+          <w:color w:val="EE0000"/>
+        </w:rPr>
+      </w:pPr>
+      <w:r>
+        <w:rPr>
+          <w:b/>
+          <w:bCs/>
+          <w:color w:val="EE0000"/>
+        </w:rPr>
+        <w:lastRenderedPageBreak/>
+        <w:t xml:space="preserve">            })</w:t>
+      </w:r>
+    </w:p>
+    <w:p>
+      <w:pPr>
+        <w:pStyle w:val="Sinespaciado"/>
+        <w:ind w:left="360"/>
+        <w:rPr>
+          <w:b/>
+          <w:bCs/>
+          <w:color w:val="EE0000"/>
+        </w:rPr>
+      </w:pPr>
+      <w:r>
+        <w:rPr>
+          <w:b/>
+          <w:bCs/>
+          <w:color w:val="EE0000"/>
+        </w:rPr>
+        <w:t xml:space="preserve">            .then(response =&gt; {</w:t>
+      </w:r>
+    </w:p>
+    <w:p>
+      <w:pPr>
+        <w:pStyle w:val="Sinespaciado"/>
+        <w:ind w:left="360"/>
+        <w:rPr>
+          <w:b/>
+          <w:bCs/>
+          <w:color w:val="EE0000"/>
+        </w:rPr>
+      </w:pPr>
+      <w:r>
+        <w:rPr>
+          <w:b/>
+          <w:bCs/>
+          <w:color w:val="EE0000"/>
+        </w:rPr>
+        <w:t xml:space="preserve">                console.log("Respuesta HTTP:", response.status);</w:t>
+      </w:r>
+    </w:p>
+    <w:p>
+      <w:pPr>
+        <w:pStyle w:val="Sinespaciado"/>
+        <w:ind w:left="360"/>
+        <w:rPr>
+          <w:b/>
+          <w:bCs/>
+          <w:color w:val="EE0000"/>
+        </w:rPr>
+      </w:pPr>
+      <w:r>
+        <w:rPr>
+          <w:b/>
+          <w:bCs/>
+          <w:color w:val="EE0000"/>
+        </w:rPr>
+        <w:t xml:space="preserve">                return response.text();</w:t>
+      </w:r>
+    </w:p>
+    <w:p>
+      <w:pPr>
+        <w:pStyle w:val="Sinespaciado"/>
+        <w:ind w:left="360"/>
+        <w:rPr>
+          <w:b/>
+          <w:bCs/>
+          <w:color w:val="EE0000"/>
+        </w:rPr>
+      </w:pPr>
+      <w:r>
+        <w:rPr>
+          <w:b/>
+          <w:bCs/>
+          <w:color w:val="EE0000"/>
+        </w:rPr>
+        <w:t xml:space="preserve">            })</w:t>
+      </w:r>
+    </w:p>
+    <w:p>
+      <w:pPr>
+        <w:pStyle w:val="Sinespaciado"/>
+        <w:ind w:left="360"/>
+        <w:rPr>
+          <w:b/>
+          <w:bCs/>
+          <w:color w:val="EE0000"/>
+        </w:rPr>
+      </w:pPr>
+      <w:r>
+        <w:rPr>
+          <w:b/>
+          <w:bCs/>
+          <w:color w:val="EE0000"/>
+        </w:rPr>
+        <w:t xml:space="preserve">            .then(data =&gt; {</w:t>
+      </w:r>
+    </w:p>
+    <w:p>
+      <w:pPr>
+        <w:pStyle w:val="Sinespaciado"/>
+        <w:ind w:left="360"/>
+        <w:rPr>
+          <w:b/>
+          <w:bCs/>
+          <w:color w:val="EE0000"/>
+        </w:rPr>
+      </w:pPr>
+      <w:r>
+        <w:rPr>
+          <w:b/>
+          <w:bCs/>
+          <w:color w:val="EE0000"/>
+        </w:rPr>
+        <w:t xml:space="preserve">                console.log("Contenido recibido:", data);</w:t>
+      </w:r>
+    </w:p>
+    <w:p>
+      <w:pPr>
+        <w:pStyle w:val="Sinespaciado"/>
+        <w:ind w:left="360"/>
+        <w:rPr>
+          <w:b/>
+          <w:bCs/>
+          <w:color w:val="EE0000"/>
+        </w:rPr>
+      </w:pPr>
+      <w:r>
+        <w:rPr>
+          <w:b/>
+          <w:bCs/>
+          <w:color w:val="EE0000"/>
+        </w:rPr>
+        <w:t xml:space="preserve">                cont.innerHTML = data;</w:t>
+      </w:r>
+    </w:p>
+    <w:p>
+      <w:pPr>
+        <w:pStyle w:val="Sinespaciado"/>
+        <w:ind w:left="360"/>
+        <w:rPr>
+          <w:b/>
+          <w:bCs/>
+          <w:color w:val="EE0000"/>
+        </w:rPr>
+      </w:pPr>
+      <w:r>
+        <w:rPr>
+          <w:b/>
+          <w:bCs/>
+          <w:color w:val="EE0000"/>
+        </w:rPr>
+        <w:t xml:space="preserve">                cont.style.display = "block";</w:t>
+      </w:r>
+    </w:p>
+    <w:p>
+      <w:pPr>
+        <w:pStyle w:val="Sinespaciado"/>
+        <w:ind w:left="360"/>
+        <w:rPr>
+          <w:b/>
+          <w:bCs/>
+          <w:color w:val="EE0000"/>
+        </w:rPr>
+      </w:pPr>
+      <w:r>
+        <w:rPr>
+          <w:b/>
+          <w:bCs/>
+          <w:color w:val="EE0000"/>
+        </w:rPr>
+        <w:t xml:space="preserve">                document.getElementById("botonMeses").innerText = "Ocultar datos";</w:t>
+      </w:r>
+    </w:p>
+    <w:p>
+      <w:pPr>
+        <w:pStyle w:val="Sinespaciado"/>
+        <w:ind w:left="360"/>
+        <w:rPr>
+          <w:b/>
+          <w:bCs/>
+          <w:color w:val="EE0000"/>
+        </w:rPr>
+      </w:pPr>
+      <w:r>
+        <w:rPr>
+          <w:b/>
+          <w:bCs/>
+          <w:color w:val="EE0000"/>
+        </w:rPr>
+        <w:t xml:space="preserve">            })</w:t>
+      </w:r>
+    </w:p>
+    <w:p>
+      <w:pPr>
+        <w:pStyle w:val="Sinespaciado"/>
+        <w:ind w:left="360"/>
+        <w:rPr>
+          <w:b/>
+          <w:bCs/>
+          <w:color w:val="EE0000"/>
+        </w:rPr>
+      </w:pPr>
+      <w:r>
+        <w:rPr>
+          <w:b/>
+          <w:bCs/>
+          <w:color w:val="EE0000"/>
+        </w:rPr>
+        <w:t xml:space="preserve">            .catch(error =&gt; {</w:t>
+      </w:r>
+    </w:p>
+    <w:p>
+      <w:pPr>
+        <w:pStyle w:val="Sinespaciado"/>
+        <w:ind w:left="360"/>
+        <w:rPr>
+          <w:b/>
+          <w:bCs/>
+          <w:color w:val="EE0000"/>
+        </w:rPr>
+      </w:pPr>
+      <w:r>
+        <w:rPr>
+          <w:b/>
+          <w:bCs/>
+          <w:color w:val="EE0000"/>
+        </w:rPr>
+        <w:t xml:space="preserve">                console.error("Error en fetch:", error);</w:t>
+      </w:r>
+    </w:p>
+    <w:p>
+      <w:pPr>
+        <w:pStyle w:val="Sinespaciado"/>
+        <w:ind w:left="360"/>
+        <w:rPr>
+          <w:b/>
+          <w:bCs/>
+          <w:color w:val="EE0000"/>
+        </w:rPr>
+      </w:pPr>
+      <w:r>
+        <w:rPr>
+          <w:b/>
+          <w:bCs/>
+          <w:color w:val="EE0000"/>
+        </w:rPr>
+        <w:t xml:space="preserve">                cont.innerHTML = "Error: " + error;</w:t>
+      </w:r>
+    </w:p>
+    <w:p>
+      <w:pPr>
+        <w:pStyle w:val="Sinespaciado"/>
+        <w:ind w:left="360"/>
+        <w:rPr>
+          <w:b/>
+          <w:bCs/>
+          <w:color w:val="EE0000"/>
+        </w:rPr>
+      </w:pPr>
+      <w:r>
+        <w:rPr>
+          <w:b/>
+          <w:bCs/>
+          <w:color w:val="EE0000"/>
+        </w:rPr>
+        <w:t xml:space="preserve">            });</w:t>
+      </w:r>
+    </w:p>
+    <w:p>
+      <w:pPr>
+        <w:pStyle w:val="Sinespaciado"/>
+        <w:ind w:left="360"/>
+        <w:rPr>
+          <w:b/>
+          <w:bCs/>
+          <w:color w:val="EE0000"/>
+        </w:rPr>
+      </w:pPr>
+      <w:r>
+        <w:rPr>
+          <w:b/>
+          <w:bCs/>
+          <w:color w:val="EE0000"/>
+        </w:rPr>
+        <w:t xml:space="preserve">        }</w:t>
+      </w:r>
+    </w:p>
+    <w:p>
+      <w:pPr>
+        <w:pStyle w:val="Sinespaciado"/>
+        <w:ind w:left="360"/>
+        <w:rPr>
+          <w:b/>
+          <w:bCs/>
+          <w:color w:val="EE0000"/>
+        </w:rPr>
+      </w:pPr>
+      <w:r>
+        <w:rPr>
+          <w:b/>
+          <w:bCs/>
+          <w:color w:val="EE0000"/>
+        </w:rPr>
+        <w:t xml:space="preserve">    }</w:t>
+      </w:r>
+    </w:p>
+    <w:p>
+      <w:pPr>
+        <w:pStyle w:val="Sinespaciado"/>
+        <w:ind w:left="360"/>
+        <w:rPr>
+          <w:b/>
+          <w:bCs/>
+        </w:rPr>
+      </w:pPr>
+      <w:r>
+        <w:rPr>
+          <w:b/>
+          <w:bCs/>
+        </w:rPr>
+        <w:t>Y en PHP se recuperan asi:</w:t>
+      </w:r>
+    </w:p>
+    <w:p>
+      <w:pPr>
+        <w:pStyle w:val="Sinespaciado"/>
+        <w:ind w:left="360"/>
+        <w:rPr>
+          <w:b/>
+          <w:bCs/>
+          <w:color w:val="EE0000"/>
+        </w:rPr>
+      </w:pPr>
+      <w:r>
+        <w:rPr>
+          <w:b/>
+          <w:bCs/>
+          <w:color w:val="EE0000"/>
+        </w:rPr>
+        <w:t>public function totalAlquileresVehiculo() {</w:t>
+      </w:r>
+    </w:p>
+    <w:p>
+      <w:pPr>
+        <w:pStyle w:val="Sinespaciado"/>
+        <w:ind w:left="360"/>
+        <w:rPr>
+          <w:b/>
+          <w:bCs/>
+          <w:color w:val="EE0000"/>
+        </w:rPr>
+      </w:pPr>
+      <w:r>
+        <w:rPr>
+          <w:b/>
+          <w:bCs/>
+          <w:color w:val="EE0000"/>
+        </w:rPr>
+        <w:t xml:space="preserve">    // Leer datos del body JSON</w:t>
+      </w:r>
+    </w:p>
+    <w:p>
+      <w:pPr>
+        <w:pStyle w:val="Sinespaciado"/>
+        <w:ind w:left="360"/>
+        <w:rPr>
+          <w:b/>
+          <w:bCs/>
+          <w:color w:val="00B050"/>
+        </w:rPr>
+      </w:pPr>
+      <w:r>
+        <w:rPr>
+          <w:b/>
+          <w:bCs/>
+          <w:color w:val="EE0000"/>
+        </w:rPr>
+        <w:t xml:space="preserve">    </w:t>
+      </w:r>
+      <w:r>
+        <w:rPr>
+          <w:b/>
+          <w:bCs/>
+          <w:color w:val="00B050"/>
+        </w:rPr>
+        <w:t>$input = json_decode(file_get_contents('php://input'), true);</w:t>
+      </w:r>
+    </w:p>
+    <w:p>
+      <w:pPr>
+        <w:pStyle w:val="Sinespaciado"/>
+        <w:ind w:left="360"/>
+        <w:rPr>
+          <w:b/>
+          <w:bCs/>
+          <w:color w:val="00B050"/>
+        </w:rPr>
+      </w:pPr>
+    </w:p>
+    <w:p>
+      <w:pPr>
+        <w:pStyle w:val="Sinespaciado"/>
+        <w:ind w:left="360"/>
+        <w:rPr>
+          <w:b/>
+          <w:bCs/>
+          <w:color w:val="00B050"/>
+        </w:rPr>
+      </w:pPr>
+      <w:r>
+        <w:rPr>
+          <w:b/>
+          <w:bCs/>
+          <w:color w:val="00B050"/>
+        </w:rPr>
+        <w:t xml:space="preserve">    $desde = $input['desde'] ?? null;</w:t>
+      </w:r>
+    </w:p>
+    <w:p>
+      <w:pPr>
+        <w:pStyle w:val="Sinespaciado"/>
+        <w:ind w:left="360"/>
+        <w:rPr>
+          <w:b/>
+          <w:bCs/>
+          <w:color w:val="00B050"/>
+        </w:rPr>
+      </w:pPr>
+      <w:r>
+        <w:rPr>
+          <w:b/>
+          <w:bCs/>
+          <w:color w:val="00B050"/>
+        </w:rPr>
+        <w:t xml:space="preserve">    $hasta = $input['hasta'] ?? null;</w:t>
+      </w:r>
+    </w:p>
+    <w:p>
+      <w:pPr>
+        <w:pStyle w:val="Sinespaciado"/>
+        <w:ind w:left="360"/>
+        <w:rPr>
+          <w:b/>
+          <w:bCs/>
+          <w:color w:val="00B050"/>
+        </w:rPr>
+      </w:pPr>
+      <w:r>
+        <w:rPr>
+          <w:b/>
+          <w:bCs/>
+          <w:color w:val="00B050"/>
+        </w:rPr>
+        <w:t xml:space="preserve">    $cocheIds = $input['cocheIds'] ?? [];</w:t>
+      </w:r>
+    </w:p>
+    <w:p>
+      <w:pPr>
+        <w:pStyle w:val="Sinespaciado"/>
+        <w:ind w:left="360"/>
+        <w:rPr>
+          <w:b/>
+          <w:bCs/>
+          <w:color w:val="EE0000"/>
+        </w:rPr>
+      </w:pPr>
+      <w:r>
+        <w:rPr>
+          <w:b/>
+          <w:bCs/>
+          <w:color w:val="EE0000"/>
+        </w:rPr>
+        <w:t>}</w:t>
+      </w:r>
     </w:p>
     <w:sectPr>
       <w:footerReference w:type="default" r:id="rId8"/>
@@ -29112,7 +30157,6 @@
   <w:style w:type="character" w:default="1" w:styleId="Fuentedeprrafopredeter">
     <w:name w:val="Default Paragraph Font"/>
     <w:uiPriority w:val="1"/>
-    <w:semiHidden/>
     <w:unhideWhenUsed/>
   </w:style>
   <w:style w:type="table" w:default="1" w:styleId="Tablanormal">

</xml_diff>